<commit_message>
Plan native runtime semantics for the Wasm bootstrap
</commit_message>
<xml_diff>
--- a/doc/WASM/CCL_WebAssembly_Stage0_Desk_Decisions_v1_8.docx
+++ b/doc/WASM/CCL_WebAssembly_Stage0_Desk_Decisions_v1_8.docx
@@ -1211,6 +1211,25 @@
       </w:tr>
     </w:tbl>
     <w:p>
+      <w:r>
+        <w:rPr/>
+        <w:t xml:space="preserve">14 September 2026 clarification following the native-internals review: retain D1, B, D4 and D5. The hand-built copying collector establishes its recorded mechanisms; it does not select the production collector algorithm or qualify all native object semantics. The initial non-generational collector still owes moved-key/hash-cache correctness and separate dispositions for weak objects and GCTWA. The non-generational choice justifies omitting classified generational bookkeeping, not other store semantics. B does not eliminate roots outside the argument stack, and cooperative suspension requires complete publication at every collecting transition. The </w:t>
+      </w:r>
+      <w:hyperlink r:id="rId6">
+        <w:r>
+          <w:rPr>
+            <w:color w:val="175C91"/>
+            <w:u w:val="single"/>
+          </w:rPr>
+          <w:t xml:space="preserve">work plan</w:t>
+        </w:r>
+      </w:hyperlink>
+      <w:r>
+        <w:rPr/>
+        <w:t xml:space="preserve"> schedules these existing census and generated-bootstrap obligations; no earlier evidence scope or acceptance disposition changes.</w:t>
+      </w:r>
+    </w:p>
+    <w:p>
       <w:pPr>
         <w:pStyle w:val="Heading3"/>
       </w:pPr>
@@ -1464,7 +1483,7 @@
         <w:rPr/>
         <w:t xml:space="preserve">The integrated fixture exposed two lifetime defects (original failures r3 and r6). Claude’s external audit then exposed an exceptional return that left an idle Worker RUNNING (original failure r9). These findings amend protocol v1; the </w:t>
       </w:r>
-      <w:hyperlink r:id="rId6">
+      <w:hyperlink r:id="rId7">
         <w:r>
           <w:rPr>
             <w:color w:val="175C91"/>
@@ -1477,7 +1496,7 @@
         <w:rPr/>
         <w:t xml:space="preserve"> retains the originals and the </w:t>
       </w:r>
-      <w:hyperlink r:id="rId7">
+      <w:hyperlink r:id="rId8">
         <w:r>
           <w:rPr>
             <w:color w:val="175C91"/>
@@ -2042,7 +2061,7 @@
         <w:rPr/>
         <w:t xml:space="preserve">This record supplies an edit-site plan, not a prepared executable patch. The actual patch must identify its path, revision and digest, attach the baseline comparison recipe, and produce native FASL/behavior and evaluated acode-ID/flag comparisons after application. Preserve Gate 0 and ARM64 same-host results at their original evidence scope; the user retired the separate second-host test on 2026-09-13 (see </w:t>
       </w:r>
-      <w:hyperlink r:id="rId8">
+      <w:hyperlink r:id="rId9">
         <w:r>
           <w:rPr>
             <w:color w:val="175C91"/>
@@ -2100,7 +2119,7 @@
         <w:rPr/>
         <w:t xml:space="preserve">Use S&lt;stage&gt;-LL&lt;nn&gt;-&lt;letter&gt; with an evidence kind and pinned test revision. The JSON inventory lists mandatory IDs, profile/candidate variants, assertions and prerequisites for each experiment phase. The </w:t>
       </w:r>
-      <w:hyperlink r:id="rId9">
+      <w:hyperlink r:id="rId10">
         <w:r>
           <w:rPr>
             <w:color w:val="175C91"/>
@@ -2683,7 +2702,7 @@
         <w:rPr/>
         <w:t xml:space="preserve">[1] x8632 architecture data and execution layouts Tag constants, widths, canonical NIL/T, cons ordering and native execution-layout exceptions. </w:t>
       </w:r>
-      <w:hyperlink r:id="rId10">
+      <w:hyperlink r:id="rId11">
         <w:r>
           <w:rPr>
             <w:color w:val="175C91"/>
@@ -2698,7 +2717,7 @@
         <w:rPr/>
         <w:t xml:space="preserve">[2] C cons layout and accessors CDR then CAR in struct cons; untagged field access. Constructor order is a separate Lisp contract. </w:t>
       </w:r>
-      <w:hyperlink r:id="rId11">
+      <w:hyperlink r:id="rId12">
         <w:r>
           <w:rPr>
             <w:color w:val="175C91"/>
@@ -2711,7 +2730,7 @@
         <w:rPr/>
         <w:t xml:space="preserve"> · </w:t>
       </w:r>
-      <w:hyperlink r:id="rId12">
+      <w:hyperlink r:id="rId13">
         <w:r>
           <w:rPr>
             <w:color w:val="175C91"/>
@@ -2726,7 +2745,7 @@
         <w:rPr/>
         <w:t xml:space="preserve">[3] 32-bit cross-loader and ARM comparison Cross-loading precedent and alternative fulltags; no adoption of native architecture conditionals by implication. </w:t>
       </w:r>
-      <w:hyperlink r:id="rId13">
+      <w:hyperlink r:id="rId14">
         <w:r>
           <w:rPr>
             <w:color w:val="175C91"/>
@@ -2739,7 +2758,7 @@
         <w:rPr/>
         <w:t xml:space="preserve"> · </w:t>
       </w:r>
-      <w:hyperlink r:id="rId14">
+      <w:hyperlink r:id="rId15">
         <w:r>
           <w:rPr>
             <w:color w:val="175C91"/>
@@ -2754,7 +2773,7 @@
         <w:rPr/>
         <w:t xml:space="preserve">[4] WebAssembly core: memory instructions Address arithmetic and nonnegative memarg offsets. Engine optimization costs are not specified. </w:t>
       </w:r>
-      <w:hyperlink r:id="rId15">
+      <w:hyperlink r:id="rId16">
         <w:r>
           <w:rPr>
             <w:color w:val="175C91"/>
@@ -2769,305 +2788,305 @@
         <w:rPr/>
         <w:t xml:space="preserve">[5] WebAssembly memory limits encoding The admitted wasm32 explicit-maximum unshared/shared encodings; exact transforms require validation. </w:t>
       </w:r>
+      <w:hyperlink r:id="rId17">
+        <w:r>
+          <w:rPr>
+            <w:color w:val="175C91"/>
+            <w:u w:val="single"/>
+          </w:rPr>
+          <w:t xml:space="preserve">Threads: limits and memory types</w:t>
+        </w:r>
+      </w:hyperlink>
+    </w:p>
+    <w:p>
+      <w:r>
+        <w:rPr/>
+        <w:t xml:space="preserve">[6] WebAssembly threads Atomic access, wait/notify distinctions, shared-memory initialization and the host-facing synchronization basis. </w:t>
+      </w:r>
+      <w:hyperlink r:id="rId18">
+        <w:r>
+          <w:rPr>
+            <w:color w:val="175C91"/>
+            <w:u w:val="single"/>
+          </w:rPr>
+          <w:t xml:space="preserve">Threads overview</w:t>
+        </w:r>
+      </w:hyperlink>
+    </w:p>
+    <w:p>
+      <w:r>
+        <w:rPr/>
+        <w:t xml:space="preserve">[7] WebAssembly tail calls and multiple results Tail transfers use the callee signature and compatible result types; linear-memory Lisp-stack ownership remains an implementation contract. </w:t>
+      </w:r>
+      <w:hyperlink r:id="rId19">
+        <w:r>
+          <w:rPr>
+            <w:color w:val="175C91"/>
+            <w:u w:val="single"/>
+          </w:rPr>
+          <w:t xml:space="preserve">Tail-call overview</w:t>
+        </w:r>
+      </w:hyperlink>
+      <w:r>
+        <w:rPr/>
+        <w:t xml:space="preserve"> · </w:t>
+      </w:r>
       <w:hyperlink r:id="rId16">
         <w:r>
           <w:rPr>
             <w:color w:val="175C91"/>
             <w:u w:val="single"/>
           </w:rPr>
-          <w:t xml:space="preserve">Threads: limits and memory types</w:t>
-        </w:r>
-      </w:hyperlink>
-    </w:p>
-    <w:p>
-      <w:r>
-        <w:rPr/>
-        <w:t xml:space="preserve">[6] WebAssembly threads Atomic access, wait/notify distinctions, shared-memory initialization and the host-facing synchronization basis. </w:t>
-      </w:r>
-      <w:hyperlink r:id="rId17">
-        <w:r>
-          <w:rPr>
-            <w:color w:val="175C91"/>
-            <w:u w:val="single"/>
-          </w:rPr>
-          <w:t xml:space="preserve">Threads overview</w:t>
-        </w:r>
-      </w:hyperlink>
-    </w:p>
-    <w:p>
-      <w:r>
-        <w:rPr/>
-        <w:t xml:space="preserve">[7] WebAssembly tail calls and multiple results Tail transfers use the callee signature and compatible result types; linear-memory Lisp-stack ownership remains an implementation contract. </w:t>
-      </w:r>
-      <w:hyperlink r:id="rId18">
-        <w:r>
-          <w:rPr>
-            <w:color w:val="175C91"/>
-            <w:u w:val="single"/>
-          </w:rPr>
-          <w:t xml:space="preserve">Tail-call overview</w:t>
+          <w:t xml:space="preserve">Core validation</w:t>
+        </w:r>
+      </w:hyperlink>
+    </w:p>
+    <w:p>
+      <w:r>
+        <w:rPr/>
+        <w:t xml:space="preserve">[8] CCL backend and native pass 2 Native argument-register conventions are comparison evidence, not a Wasm parameter limit. </w:t>
+      </w:r>
+      <w:hyperlink r:id="rId20">
+        <w:r>
+          <w:rPr>
+            <w:color w:val="175C91"/>
+            <w:u w:val="single"/>
+          </w:rPr>
+          <w:t xml:space="preserve">backend.lisp</w:t>
         </w:r>
       </w:hyperlink>
       <w:r>
         <w:rPr/>
         <w:t xml:space="preserve"> · </w:t>
       </w:r>
-      <w:hyperlink r:id="rId15">
-        <w:r>
-          <w:rPr>
-            <w:color w:val="175C91"/>
-            <w:u w:val="single"/>
-          </w:rPr>
-          <w:t xml:space="preserve">Core validation</w:t>
-        </w:r>
-      </w:hyperlink>
-    </w:p>
-    <w:p>
-      <w:r>
-        <w:rPr/>
-        <w:t xml:space="preserve">[8] CCL backend and native pass 2 Native argument-register conventions are comparison evidence, not a Wasm parameter limit. </w:t>
-      </w:r>
-      <w:hyperlink r:id="rId19">
-        <w:r>
-          <w:rPr>
-            <w:color w:val="175C91"/>
-            <w:u w:val="single"/>
-          </w:rPr>
-          <w:t xml:space="preserve">backend.lisp</w:t>
+      <w:hyperlink r:id="rId21">
+        <w:r>
+          <w:rPr>
+            <w:color w:val="175C91"/>
+            <w:u w:val="single"/>
+          </w:rPr>
+          <w:t xml:space="preserve">x862.lisp</w:t>
+        </w:r>
+      </w:hyperlink>
+    </w:p>
+    <w:p>
+      <w:r>
+        <w:rPr/>
+        <w:t xml:space="preserve">[9] LLVM WebAssembly linker Import/export and memory/table options; signature-mismatch warnings and trapping stubs; strict link policy. </w:t>
+      </w:r>
+      <w:hyperlink r:id="rId22">
+        <w:r>
+          <w:rPr>
+            <w:color w:val="175C91"/>
+            <w:u w:val="single"/>
+          </w:rPr>
+          <w:t xml:space="preserve">LLD WebAssembly documentation</w:t>
+        </w:r>
+      </w:hyperlink>
+    </w:p>
+    <w:p>
+      <w:pPr>
+        <w:pStyle w:val="Heading1"/>
+      </w:pPr>
+      <w:r>
+        <w:rPr/>
+        <w:t xml:space="preserve">REFERENCES  /  CONTINUED</w:t>
+      </w:r>
+    </w:p>
+    <w:p>
+      <w:pPr>
+        <w:pStyle w:val="Heading2"/>
+      </w:pPr>
+      <w:r>
+        <w:rPr/>
+        <w:t xml:space="preserve">Kernel, ABI and project-document sources</w:t>
+      </w:r>
+    </w:p>
+    <w:p>
+      <w:r>
+        <w:rPr/>
+        <w:t xml:space="preserve">[10] Kernel adaptation and exact imports Portable and architecture-specific collector work must be audited together; imports.s is the exact census source. </w:t>
+      </w:r>
+      <w:hyperlink r:id="rId23">
+        <w:r>
+          <w:rPr>
+            <w:color w:val="175C91"/>
+            <w:u w:val="single"/>
+          </w:rPr>
+          <w:t xml:space="preserve">gc-common.c</w:t>
         </w:r>
       </w:hyperlink>
       <w:r>
         <w:rPr/>
         <w:t xml:space="preserve"> · </w:t>
       </w:r>
-      <w:hyperlink r:id="rId20">
-        <w:r>
-          <w:rPr>
-            <w:color w:val="175C91"/>
-            <w:u w:val="single"/>
-          </w:rPr>
-          <w:t xml:space="preserve">x862.lisp</w:t>
-        </w:r>
-      </w:hyperlink>
-    </w:p>
-    <w:p>
-      <w:r>
-        <w:rPr/>
-        <w:t xml:space="preserve">[9] LLVM WebAssembly linker Import/export and memory/table options; signature-mismatch warnings and trapping stubs; strict link policy. </w:t>
-      </w:r>
-      <w:hyperlink r:id="rId21">
-        <w:r>
-          <w:rPr>
-            <w:color w:val="175C91"/>
-            <w:u w:val="single"/>
-          </w:rPr>
-          <w:t xml:space="preserve">LLD WebAssembly documentation</w:t>
-        </w:r>
-      </w:hyperlink>
-    </w:p>
-    <w:p>
-      <w:pPr>
-        <w:pStyle w:val="Heading1"/>
-      </w:pPr>
-      <w:r>
-        <w:rPr/>
-        <w:t xml:space="preserve">REFERENCES  /  CONTINUED</w:t>
-      </w:r>
-    </w:p>
-    <w:p>
-      <w:pPr>
-        <w:pStyle w:val="Heading2"/>
-      </w:pPr>
-      <w:r>
-        <w:rPr/>
-        <w:t xml:space="preserve">Kernel, ABI and project-document sources</w:t>
-      </w:r>
-    </w:p>
-    <w:p>
-      <w:r>
-        <w:rPr/>
-        <w:t xml:space="preserve">[10] Kernel adaptation and exact imports Portable and architecture-specific collector work must be audited together; imports.s is the exact census source. </w:t>
-      </w:r>
-      <w:hyperlink r:id="rId22">
-        <w:r>
-          <w:rPr>
-            <w:color w:val="175C91"/>
-            <w:u w:val="single"/>
-          </w:rPr>
-          <w:t xml:space="preserve">gc-common.c</w:t>
+      <w:hyperlink r:id="rId24">
+        <w:r>
+          <w:rPr>
+            <w:color w:val="175C91"/>
+            <w:u w:val="single"/>
+          </w:rPr>
+          <w:t xml:space="preserve">x86-gc.c</w:t>
         </w:r>
       </w:hyperlink>
       <w:r>
         <w:rPr/>
         <w:t xml:space="preserve"> · </w:t>
       </w:r>
-      <w:hyperlink r:id="rId23">
-        <w:r>
-          <w:rPr>
-            <w:color w:val="175C91"/>
-            <w:u w:val="single"/>
-          </w:rPr>
-          <w:t xml:space="preserve">x86-gc.c</w:t>
+      <w:hyperlink r:id="rId25">
+        <w:r>
+          <w:rPr>
+            <w:color w:val="175C91"/>
+            <w:u w:val="single"/>
+          </w:rPr>
+          <w:t xml:space="preserve">image.c</w:t>
         </w:r>
       </w:hyperlink>
       <w:r>
         <w:rPr/>
         <w:t xml:space="preserve"> · </w:t>
       </w:r>
-      <w:hyperlink r:id="rId24">
-        <w:r>
-          <w:rPr>
-            <w:color w:val="175C91"/>
-            <w:u w:val="single"/>
-          </w:rPr>
-          <w:t xml:space="preserve">image.c</w:t>
+      <w:hyperlink r:id="rId26">
+        <w:r>
+          <w:rPr>
+            <w:color w:val="175C91"/>
+            <w:u w:val="single"/>
+          </w:rPr>
+          <w:t xml:space="preserve">memory.c</w:t>
         </w:r>
       </w:hyperlink>
       <w:r>
         <w:rPr/>
         <w:t xml:space="preserve"> · </w:t>
       </w:r>
-      <w:hyperlink r:id="rId25">
-        <w:r>
-          <w:rPr>
-            <w:color w:val="175C91"/>
-            <w:u w:val="single"/>
-          </w:rPr>
-          <w:t xml:space="preserve">memory.c</w:t>
+      <w:hyperlink r:id="rId27">
+        <w:r>
+          <w:rPr>
+            <w:color w:val="175C91"/>
+            <w:u w:val="single"/>
+          </w:rPr>
+          <w:t xml:space="preserve">thread_manager.c</w:t>
         </w:r>
       </w:hyperlink>
       <w:r>
         <w:rPr/>
         <w:t xml:space="preserve"> · </w:t>
       </w:r>
-      <w:hyperlink r:id="rId26">
-        <w:r>
-          <w:rPr>
-            <w:color w:val="175C91"/>
-            <w:u w:val="single"/>
-          </w:rPr>
-          <w:t xml:space="preserve">thread_manager.c</w:t>
+      <w:hyperlink r:id="rId28">
+        <w:r>
+          <w:rPr>
+            <w:color w:val="175C91"/>
+            <w:u w:val="single"/>
+          </w:rPr>
+          <w:t xml:space="preserve">imports.s</w:t>
+        </w:r>
+      </w:hyperlink>
+    </w:p>
+    <w:p>
+      <w:r>
+        <w:rPr/>
+        <w:t xml:space="preserve">[11] Native trap/check lowering inventory Previously recorded x86-64 UUO/check occurrences remain a worklist to reconcile with evaluated census records. </w:t>
+      </w:r>
+      <w:hyperlink r:id="rId29">
+        <w:r>
+          <w:rPr>
+            <w:color w:val="175C91"/>
+            <w:u w:val="single"/>
+          </w:rPr>
+          <w:t xml:space="preserve">x8664-vinsns.lisp</w:t>
+        </w:r>
+      </w:hyperlink>
+    </w:p>
+    <w:p>
+      <w:r>
+        <w:rPr/>
+        <w:t xml:space="preserve">[12] WebAssembly heterogeneous function tables and call-site types Core control instructions and call_indirect / return_call_indirect validation. A static expected type belongs to the call site; incompatible table entries trap before entry. </w:t>
+      </w:r>
+      <w:hyperlink r:id="rId30">
+        <w:r>
+          <w:rPr>
+            <w:color w:val="175C91"/>
+            <w:u w:val="single"/>
+          </w:rPr>
+          <w:t xml:space="preserve">Core: control instructions</w:t>
         </w:r>
       </w:hyperlink>
       <w:r>
         <w:rPr/>
         <w:t xml:space="preserve"> · </w:t>
       </w:r>
-      <w:hyperlink r:id="rId27">
-        <w:r>
-          <w:rPr>
-            <w:color w:val="175C91"/>
-            <w:u w:val="single"/>
-          </w:rPr>
-          <w:t xml:space="preserve">imports.s</w:t>
-        </w:r>
-      </w:hyperlink>
-    </w:p>
-    <w:p>
-      <w:r>
-        <w:rPr/>
-        <w:t xml:space="preserve">[11] Native trap/check lowering inventory Previously recorded x86-64 UUO/check occurrences remain a worklist to reconcile with evaluated census records. </w:t>
-      </w:r>
-      <w:hyperlink r:id="rId28">
-        <w:r>
-          <w:rPr>
-            <w:color w:val="175C91"/>
-            <w:u w:val="single"/>
-          </w:rPr>
-          <w:t xml:space="preserve">x8664-vinsns.lisp</w:t>
-        </w:r>
-      </w:hyperlink>
-    </w:p>
-    <w:p>
-      <w:r>
-        <w:rPr/>
-        <w:t xml:space="preserve">[12] WebAssembly heterogeneous function tables and call-site types Core control instructions and call_indirect / return_call_indirect validation. A static expected type belongs to the call site; incompatible table entries trap before entry. </w:t>
-      </w:r>
-      <w:hyperlink r:id="rId29">
-        <w:r>
-          <w:rPr>
-            <w:color w:val="175C91"/>
-            <w:u w:val="single"/>
-          </w:rPr>
-          <w:t xml:space="preserve">Core: control instructions</w:t>
+      <w:hyperlink r:id="rId16">
+        <w:r>
+          <w:rPr>
+            <w:color w:val="175C91"/>
+            <w:u w:val="single"/>
+          </w:rPr>
+          <w:t xml:space="preserve">Core: validation and execution</w:t>
+        </w:r>
+      </w:hyperlink>
+    </w:p>
+    <w:p>
+      <w:r>
+        <w:rPr/>
+        <w:t xml:space="preserve">[13] WebAssembly Basic C ABI Scalar versus aggregate parameter/result passing; address-taken locals and the linear C stack. </w:t>
+      </w:r>
+      <w:hyperlink r:id="rId31">
+        <w:r>
+          <w:rPr>
+            <w:color w:val="175C91"/>
+            <w:u w:val="single"/>
+          </w:rPr>
+          <w:t xml:space="preserve">BasicCABI.md</w:t>
+        </w:r>
+      </w:hyperlink>
+    </w:p>
+    <w:p>
+      <w:r>
+        <w:rPr/>
+        <w:t xml:space="preserve">[14] WebAssembly linking conventions Process-once initialization with passive segments and per-thread storage conventions; verify the actual linked output. </w:t>
+      </w:r>
+      <w:hyperlink r:id="rId32">
+        <w:r>
+          <w:rPr>
+            <w:color w:val="175C91"/>
+            <w:u w:val="single"/>
+          </w:rPr>
+          <w:t xml:space="preserve">Linking.md</w:t>
+        </w:r>
+      </w:hyperlink>
+    </w:p>
+    <w:p>
+      <w:r>
+        <w:rPr/>
+        <w:t xml:space="preserve">[15] Common Lisp ordinary lambda lists and calls Required, optional, rest and keyword arguments; FUNCALL/APPLY semantics. A supplied count does not determine callee convention. </w:t>
+      </w:r>
+      <w:hyperlink r:id="rId33">
+        <w:r>
+          <w:rPr>
+            <w:color w:val="175C91"/>
+            <w:u w:val="single"/>
+          </w:rPr>
+          <w:t xml:space="preserve">Lambda lists</w:t>
         </w:r>
       </w:hyperlink>
       <w:r>
         <w:rPr/>
         <w:t xml:space="preserve"> · </w:t>
       </w:r>
-      <w:hyperlink r:id="rId15">
-        <w:r>
-          <w:rPr>
-            <w:color w:val="175C91"/>
-            <w:u w:val="single"/>
-          </w:rPr>
-          <w:t xml:space="preserve">Core: validation and execution</w:t>
-        </w:r>
-      </w:hyperlink>
-    </w:p>
-    <w:p>
-      <w:r>
-        <w:rPr/>
-        <w:t xml:space="preserve">[13] WebAssembly Basic C ABI Scalar versus aggregate parameter/result passing; address-taken locals and the linear C stack. </w:t>
-      </w:r>
-      <w:hyperlink r:id="rId30">
-        <w:r>
-          <w:rPr>
-            <w:color w:val="175C91"/>
-            <w:u w:val="single"/>
-          </w:rPr>
-          <w:t xml:space="preserve">BasicCABI.md</w:t>
-        </w:r>
-      </w:hyperlink>
-    </w:p>
-    <w:p>
-      <w:r>
-        <w:rPr/>
-        <w:t xml:space="preserve">[14] WebAssembly linking conventions Process-once initialization with passive segments and per-thread storage conventions; verify the actual linked output. </w:t>
-      </w:r>
-      <w:hyperlink r:id="rId31">
-        <w:r>
-          <w:rPr>
-            <w:color w:val="175C91"/>
-            <w:u w:val="single"/>
-          </w:rPr>
-          <w:t xml:space="preserve">Linking.md</w:t>
-        </w:r>
-      </w:hyperlink>
-    </w:p>
-    <w:p>
-      <w:r>
-        <w:rPr/>
-        <w:t xml:space="preserve">[15] Common Lisp ordinary lambda lists and calls Required, optional, rest and keyword arguments; FUNCALL/APPLY semantics. A supplied count does not determine callee convention. </w:t>
-      </w:r>
-      <w:hyperlink r:id="rId32">
-        <w:r>
-          <w:rPr>
-            <w:color w:val="175C91"/>
-            <w:u w:val="single"/>
-          </w:rPr>
-          <w:t xml:space="preserve">Lambda lists</w:t>
+      <w:hyperlink r:id="rId34">
+        <w:r>
+          <w:rPr>
+            <w:color w:val="175C91"/>
+            <w:u w:val="single"/>
+          </w:rPr>
+          <w:t xml:space="preserve">FUNCALL</w:t>
         </w:r>
       </w:hyperlink>
       <w:r>
         <w:rPr/>
         <w:t xml:space="preserve"> · </w:t>
       </w:r>
-      <w:hyperlink r:id="rId33">
-        <w:r>
-          <w:rPr>
-            <w:color w:val="175C91"/>
-            <w:u w:val="single"/>
-          </w:rPr>
-          <w:t xml:space="preserve">FUNCALL</w:t>
-        </w:r>
-      </w:hyperlink>
-      <w:r>
-        <w:rPr/>
-        <w:t xml:space="preserve"> · </w:t>
-      </w:r>
-      <w:hyperlink r:id="rId34">
+      <w:hyperlink r:id="rId35">
         <w:r>
           <w:rPr>
             <w:color w:val="175C91"/>
@@ -3082,7 +3101,7 @@
         <w:rPr/>
         <w:t xml:space="preserve">[16] WebAssembly numeric semantics Floating-point operation and operand cases; result classification alone is not a CCL condition policy. </w:t>
       </w:r>
-      <w:hyperlink r:id="rId35">
+      <w:hyperlink r:id="rId36">
         <w:r>
           <w:rPr>
             <w:color w:val="175C91"/>

</xml_diff>

<commit_message>
Deliver on-demand census queries and native call-site witnesses
Apply the user-authorized LL15 instrument policy, retain the correlated build and final startup worklist, and preserve explicit unknowns without claiming exhaustive bounds or acceptance.
</commit_message>
<xml_diff>
--- a/doc/WASM/CCL_WebAssembly_Stage0_Desk_Decisions_v1_8.docx
+++ b/doc/WASM/CCL_WebAssembly_Stage0_Desk_Decisions_v1_8.docx
@@ -33,6 +33,96 @@
       <w:r>
         <w:rPr/>
         <w:t xml:space="preserve">R7 in the Acceptance Policy and Regression Register v1.7 governs all delivery and verification claims; recording a decision does not claim that its artifacts have been implemented or its tests run. [17]</w:t>
+      </w:r>
+    </w:p>
+    <w:p>
+      <w:pPr>
+        <w:pStyle w:val="Heading1"/>
+      </w:pPr>
+      <w:r>
+        <w:rPr/>
+        <w:t xml:space="preserve">15 September 2026 — LL15 instrument qualification</w:t>
+      </w:r>
+    </w:p>
+    <w:p>
+      <w:r>
+        <w:rPr/>
+        <w:t xml:space="preserve">The user authorized the on-demand census policy: “I will approve the change, so</w:t>
+      </w:r>
+    </w:p>
+    <w:p>
+      <w:r>
+        <w:rPr/>
+        <w:t xml:space="preserve">treat it as approved”. Stage 0 LL15-b/c qualify retained native observations,</w:t>
+      </w:r>
+    </w:p>
+    <w:p>
+      <w:r>
+        <w:rPr/>
+        <w:t xml:space="preserve">a reviewed seed recipe and explicit transitive worklist, identity-bound queries,</w:t>
+      </w:r>
+    </w:p>
+    <w:p>
+      <w:r>
+        <w:rPr/>
+        <w:t xml:space="preserve">and scenario-specific native call-site witnesses with independent controls.</w:t>
+      </w:r>
+    </w:p>
+    <w:p>
+      <w:r>
+        <w:rPr/>
+        <w:t xml:space="preserve">Exhaustively bounding every dynamic native callee is no longer a Stage 0</w:t>
+      </w:r>
+    </w:p>
+    <w:p>
+      <w:r>
+        <w:rPr/>
+        <w:t xml:space="preserve">prerequisite. The rationale is to answer concrete Stage 1 questions from mature</w:t>
+      </w:r>
+    </w:p>
+    <w:p>
+      <w:r>
+        <w:rPr/>
+        <w:t xml:space="preserve">captures without an unbounded static-resolution effort. Witnesses remain</w:t>
+      </w:r>
+    </w:p>
+    <w:p>
+      <w:r>
+        <w:rPr/>
+        <w:t xml:space="preserve">observations; unknowns remain work. The conservative closure checker and generated</w:t>
+      </w:r>
+    </w:p>
+    <w:p>
+      <w:r>
+        <w:rPr/>
+        <w:t xml:space="preserve">bootstrap dependency/initializer obligations are unchanged. This decision grants</w:t>
+      </w:r>
+    </w:p>
+    <w:p>
+      <w:r>
+        <w:rPr/>
+        <w:t xml:space="preserve">no result acceptance or functional shared-compiler editing permission. The</w:t>
+      </w:r>
+    </w:p>
+    <w:p>
+      <w:hyperlink r:id="rId2">
+        <w:r>
+          <w:rPr>
+            <w:color w:val="175C91"/>
+            <w:u w:val="single"/>
+          </w:rPr>
+          <w:t xml:space="preserve">delivery and next qualification step</w:t>
+        </w:r>
+      </w:hyperlink>
+      <w:r>
+        <w:rPr/>
+        <w:t xml:space="preserve"> name the</w:t>
+      </w:r>
+    </w:p>
+    <w:p>
+      <w:r>
+        <w:rPr/>
+        <w:t xml:space="preserve">remaining work; the criterion snapshots are retained in the evidence repository.</w:t>
       </w:r>
     </w:p>
     <w:tbl>
@@ -605,7 +695,7 @@
         <w:rPr/>
         <w:t xml:space="preserve">The </w:t>
       </w:r>
-      <w:hyperlink r:id="rId2">
+      <w:hyperlink r:id="rId3">
         <w:r>
           <w:rPr>
             <w:color w:val="175C91"/>
@@ -947,7 +1037,7 @@
         <w:rPr/>
         <w:t xml:space="preserve">Use B under the </w:t>
       </w:r>
-      <w:hyperlink r:id="rId2">
+      <w:hyperlink r:id="rId3">
         <w:r>
           <w:rPr>
             <w:color w:val="175C91"/>
@@ -966,7 +1056,7 @@
         <w:rPr/>
         <w:t xml:space="preserve">The </w:t>
       </w:r>
-      <w:hyperlink r:id="rId3">
+      <w:hyperlink r:id="rId4">
         <w:r>
           <w:rPr>
             <w:color w:val="175C91"/>
@@ -979,7 +1069,7 @@
         <w:rPr/>
         <w:t xml:space="preserve"> and </w:t>
       </w:r>
-      <w:hyperlink r:id="rId4">
+      <w:hyperlink r:id="rId5">
         <w:r>
           <w:rPr>
             <w:color w:val="175C91"/>
@@ -992,7 +1082,7 @@
         <w:rPr/>
         <w:t xml:space="preserve"> supply the bounded correctness basis. The </w:t>
       </w:r>
-      <w:hyperlink r:id="rId5">
+      <w:hyperlink r:id="rId6">
         <w:r>
           <w:rPr>
             <w:color w:val="175C91"/>
@@ -1215,7 +1305,7 @@
         <w:rPr/>
         <w:t xml:space="preserve">14 September 2026 clarification following the native-internals review: retain D1, B, D4 and D5. The hand-built copying collector establishes its recorded mechanisms; it does not select the production collector algorithm or qualify all native object semantics. The initial non-generational collector still owes moved-key/hash-cache correctness and separate dispositions for weak objects and GCTWA. The non-generational choice justifies omitting classified generational bookkeeping, not other store semantics. B does not eliminate roots outside the argument stack, and cooperative suspension requires complete publication at every collecting transition. The </w:t>
       </w:r>
-      <w:hyperlink r:id="rId6">
+      <w:hyperlink r:id="rId7">
         <w:r>
           <w:rPr>
             <w:color w:val="175C91"/>
@@ -1483,7 +1573,7 @@
         <w:rPr/>
         <w:t xml:space="preserve">The integrated fixture exposed two lifetime defects (original failures r3 and r6). Claude’s external audit then exposed an exceptional return that left an idle Worker RUNNING (original failure r9). These findings amend protocol v1; the </w:t>
       </w:r>
-      <w:hyperlink r:id="rId7">
+      <w:hyperlink r:id="rId8">
         <w:r>
           <w:rPr>
             <w:color w:val="175C91"/>
@@ -1496,7 +1586,7 @@
         <w:rPr/>
         <w:t xml:space="preserve"> retains the originals and the </w:t>
       </w:r>
-      <w:hyperlink r:id="rId8">
+      <w:hyperlink r:id="rId9">
         <w:r>
           <w:rPr>
             <w:color w:val="175C91"/>
@@ -2061,7 +2151,7 @@
         <w:rPr/>
         <w:t xml:space="preserve">This record supplies an edit-site plan, not a prepared executable patch. The actual patch must identify its path, revision and digest, attach the baseline comparison recipe, and produce native FASL/behavior and evaluated acode-ID/flag comparisons after application. Preserve Gate 0 and ARM64 same-host results at their original evidence scope; the user retired the separate second-host test on 2026-09-13 (see </w:t>
       </w:r>
-      <w:hyperlink r:id="rId9">
+      <w:hyperlink r:id="rId10">
         <w:r>
           <w:rPr>
             <w:color w:val="175C91"/>
@@ -2119,7 +2209,7 @@
         <w:rPr/>
         <w:t xml:space="preserve">Use S&lt;stage&gt;-LL&lt;nn&gt;-&lt;letter&gt; with an evidence kind and pinned test revision. The JSON inventory lists mandatory IDs, profile/candidate variants, assertions and prerequisites for each experiment phase. The </w:t>
       </w:r>
-      <w:hyperlink r:id="rId10">
+      <w:hyperlink r:id="rId11">
         <w:r>
           <w:rPr>
             <w:color w:val="175C91"/>
@@ -2445,7 +2535,7 @@
           <w:p>
             <w:r>
               <w:rPr/>
-              <w:t xml:space="preserve">Validate the actual qualified-compiler joined census and conservative closure under contracts/census.md; include all phases, reviewed seeds, unknown edges, required initializers and external trace reconciliation.</w:t>
+              <w:t xml:space="preserve">Qualify the retained native census instrument, reviewed seeds, transitive startup worklist with explicit unknowns, identity-bound queries and scenario-specific native call-site witnesses under contracts/census.md v0.2. No exhaustive native callee-bound claim.</w:t>
             </w:r>
           </w:p>
         </w:tc>
@@ -2463,7 +2553,7 @@
           <w:p>
             <w:r>
               <w:rPr/>
-              <w:t xml:space="preserve">Independently specified missing-node/edge/seed, concealed unknown-call and cyclic initializer mutants must be rejected by the instrumentation and gate path.</w:t>
+              <w:t xml:space="preserve">Independently reject missing required inputs/dependencies/seeds, concealed unknowns, wrong identities, witness-to-bound promotion, invalid initializer prerequisites and broken native witness semantics through the instrument publication path.</w:t>
             </w:r>
           </w:p>
         </w:tc>
@@ -2702,7 +2792,7 @@
         <w:rPr/>
         <w:t xml:space="preserve">[1] x8632 architecture data and execution layouts Tag constants, widths, canonical NIL/T, cons ordering and native execution-layout exceptions. </w:t>
       </w:r>
-      <w:hyperlink r:id="rId11">
+      <w:hyperlink r:id="rId12">
         <w:r>
           <w:rPr>
             <w:color w:val="175C91"/>
@@ -2717,7 +2807,7 @@
         <w:rPr/>
         <w:t xml:space="preserve">[2] C cons layout and accessors CDR then CAR in struct cons; untagged field access. Constructor order is a separate Lisp contract. </w:t>
       </w:r>
-      <w:hyperlink r:id="rId12">
+      <w:hyperlink r:id="rId13">
         <w:r>
           <w:rPr>
             <w:color w:val="175C91"/>
@@ -2730,7 +2820,7 @@
         <w:rPr/>
         <w:t xml:space="preserve"> · </w:t>
       </w:r>
-      <w:hyperlink r:id="rId13">
+      <w:hyperlink r:id="rId14">
         <w:r>
           <w:rPr>
             <w:color w:val="175C91"/>
@@ -2745,7 +2835,7 @@
         <w:rPr/>
         <w:t xml:space="preserve">[3] 32-bit cross-loader and ARM comparison Cross-loading precedent and alternative fulltags; no adoption of native architecture conditionals by implication. </w:t>
       </w:r>
-      <w:hyperlink r:id="rId14">
+      <w:hyperlink r:id="rId15">
         <w:r>
           <w:rPr>
             <w:color w:val="175C91"/>
@@ -2758,7 +2848,7 @@
         <w:rPr/>
         <w:t xml:space="preserve"> · </w:t>
       </w:r>
-      <w:hyperlink r:id="rId15">
+      <w:hyperlink r:id="rId16">
         <w:r>
           <w:rPr>
             <w:color w:val="175C91"/>
@@ -2773,7 +2863,7 @@
         <w:rPr/>
         <w:t xml:space="preserve">[4] WebAssembly core: memory instructions Address arithmetic and nonnegative memarg offsets. Engine optimization costs are not specified. </w:t>
       </w:r>
-      <w:hyperlink r:id="rId16">
+      <w:hyperlink r:id="rId17">
         <w:r>
           <w:rPr>
             <w:color w:val="175C91"/>
@@ -2788,305 +2878,305 @@
         <w:rPr/>
         <w:t xml:space="preserve">[5] WebAssembly memory limits encoding The admitted wasm32 explicit-maximum unshared/shared encodings; exact transforms require validation. </w:t>
       </w:r>
+      <w:hyperlink r:id="rId18">
+        <w:r>
+          <w:rPr>
+            <w:color w:val="175C91"/>
+            <w:u w:val="single"/>
+          </w:rPr>
+          <w:t xml:space="preserve">Threads: limits and memory types</w:t>
+        </w:r>
+      </w:hyperlink>
+    </w:p>
+    <w:p>
+      <w:r>
+        <w:rPr/>
+        <w:t xml:space="preserve">[6] WebAssembly threads Atomic access, wait/notify distinctions, shared-memory initialization and the host-facing synchronization basis. </w:t>
+      </w:r>
+      <w:hyperlink r:id="rId19">
+        <w:r>
+          <w:rPr>
+            <w:color w:val="175C91"/>
+            <w:u w:val="single"/>
+          </w:rPr>
+          <w:t xml:space="preserve">Threads overview</w:t>
+        </w:r>
+      </w:hyperlink>
+    </w:p>
+    <w:p>
+      <w:r>
+        <w:rPr/>
+        <w:t xml:space="preserve">[7] WebAssembly tail calls and multiple results Tail transfers use the callee signature and compatible result types; linear-memory Lisp-stack ownership remains an implementation contract. </w:t>
+      </w:r>
+      <w:hyperlink r:id="rId20">
+        <w:r>
+          <w:rPr>
+            <w:color w:val="175C91"/>
+            <w:u w:val="single"/>
+          </w:rPr>
+          <w:t xml:space="preserve">Tail-call overview</w:t>
+        </w:r>
+      </w:hyperlink>
+      <w:r>
+        <w:rPr/>
+        <w:t xml:space="preserve"> · </w:t>
+      </w:r>
       <w:hyperlink r:id="rId17">
         <w:r>
           <w:rPr>
             <w:color w:val="175C91"/>
             <w:u w:val="single"/>
           </w:rPr>
-          <w:t xml:space="preserve">Threads: limits and memory types</w:t>
-        </w:r>
-      </w:hyperlink>
-    </w:p>
-    <w:p>
-      <w:r>
-        <w:rPr/>
-        <w:t xml:space="preserve">[6] WebAssembly threads Atomic access, wait/notify distinctions, shared-memory initialization and the host-facing synchronization basis. </w:t>
-      </w:r>
-      <w:hyperlink r:id="rId18">
-        <w:r>
-          <w:rPr>
-            <w:color w:val="175C91"/>
-            <w:u w:val="single"/>
-          </w:rPr>
-          <w:t xml:space="preserve">Threads overview</w:t>
-        </w:r>
-      </w:hyperlink>
-    </w:p>
-    <w:p>
-      <w:r>
-        <w:rPr/>
-        <w:t xml:space="preserve">[7] WebAssembly tail calls and multiple results Tail transfers use the callee signature and compatible result types; linear-memory Lisp-stack ownership remains an implementation contract. </w:t>
-      </w:r>
-      <w:hyperlink r:id="rId19">
-        <w:r>
-          <w:rPr>
-            <w:color w:val="175C91"/>
-            <w:u w:val="single"/>
-          </w:rPr>
-          <w:t xml:space="preserve">Tail-call overview</w:t>
+          <w:t xml:space="preserve">Core validation</w:t>
+        </w:r>
+      </w:hyperlink>
+    </w:p>
+    <w:p>
+      <w:r>
+        <w:rPr/>
+        <w:t xml:space="preserve">[8] CCL backend and native pass 2 Native argument-register conventions are comparison evidence, not a Wasm parameter limit. </w:t>
+      </w:r>
+      <w:hyperlink r:id="rId21">
+        <w:r>
+          <w:rPr>
+            <w:color w:val="175C91"/>
+            <w:u w:val="single"/>
+          </w:rPr>
+          <w:t xml:space="preserve">backend.lisp</w:t>
         </w:r>
       </w:hyperlink>
       <w:r>
         <w:rPr/>
         <w:t xml:space="preserve"> · </w:t>
       </w:r>
-      <w:hyperlink r:id="rId16">
-        <w:r>
-          <w:rPr>
-            <w:color w:val="175C91"/>
-            <w:u w:val="single"/>
-          </w:rPr>
-          <w:t xml:space="preserve">Core validation</w:t>
-        </w:r>
-      </w:hyperlink>
-    </w:p>
-    <w:p>
-      <w:r>
-        <w:rPr/>
-        <w:t xml:space="preserve">[8] CCL backend and native pass 2 Native argument-register conventions are comparison evidence, not a Wasm parameter limit. </w:t>
-      </w:r>
-      <w:hyperlink r:id="rId20">
-        <w:r>
-          <w:rPr>
-            <w:color w:val="175C91"/>
-            <w:u w:val="single"/>
-          </w:rPr>
-          <w:t xml:space="preserve">backend.lisp</w:t>
+      <w:hyperlink r:id="rId22">
+        <w:r>
+          <w:rPr>
+            <w:color w:val="175C91"/>
+            <w:u w:val="single"/>
+          </w:rPr>
+          <w:t xml:space="preserve">x862.lisp</w:t>
+        </w:r>
+      </w:hyperlink>
+    </w:p>
+    <w:p>
+      <w:r>
+        <w:rPr/>
+        <w:t xml:space="preserve">[9] LLVM WebAssembly linker Import/export and memory/table options; signature-mismatch warnings and trapping stubs; strict link policy. </w:t>
+      </w:r>
+      <w:hyperlink r:id="rId23">
+        <w:r>
+          <w:rPr>
+            <w:color w:val="175C91"/>
+            <w:u w:val="single"/>
+          </w:rPr>
+          <w:t xml:space="preserve">LLD WebAssembly documentation</w:t>
+        </w:r>
+      </w:hyperlink>
+    </w:p>
+    <w:p>
+      <w:pPr>
+        <w:pStyle w:val="Heading1"/>
+      </w:pPr>
+      <w:r>
+        <w:rPr/>
+        <w:t xml:space="preserve">REFERENCES  /  CONTINUED</w:t>
+      </w:r>
+    </w:p>
+    <w:p>
+      <w:pPr>
+        <w:pStyle w:val="Heading2"/>
+      </w:pPr>
+      <w:r>
+        <w:rPr/>
+        <w:t xml:space="preserve">Kernel, ABI and project-document sources</w:t>
+      </w:r>
+    </w:p>
+    <w:p>
+      <w:r>
+        <w:rPr/>
+        <w:t xml:space="preserve">[10] Kernel adaptation and exact imports Portable and architecture-specific collector work must be audited together; imports.s is the exact census source. </w:t>
+      </w:r>
+      <w:hyperlink r:id="rId24">
+        <w:r>
+          <w:rPr>
+            <w:color w:val="175C91"/>
+            <w:u w:val="single"/>
+          </w:rPr>
+          <w:t xml:space="preserve">gc-common.c</w:t>
         </w:r>
       </w:hyperlink>
       <w:r>
         <w:rPr/>
         <w:t xml:space="preserve"> · </w:t>
       </w:r>
-      <w:hyperlink r:id="rId21">
-        <w:r>
-          <w:rPr>
-            <w:color w:val="175C91"/>
-            <w:u w:val="single"/>
-          </w:rPr>
-          <w:t xml:space="preserve">x862.lisp</w:t>
-        </w:r>
-      </w:hyperlink>
-    </w:p>
-    <w:p>
-      <w:r>
-        <w:rPr/>
-        <w:t xml:space="preserve">[9] LLVM WebAssembly linker Import/export and memory/table options; signature-mismatch warnings and trapping stubs; strict link policy. </w:t>
-      </w:r>
-      <w:hyperlink r:id="rId22">
-        <w:r>
-          <w:rPr>
-            <w:color w:val="175C91"/>
-            <w:u w:val="single"/>
-          </w:rPr>
-          <w:t xml:space="preserve">LLD WebAssembly documentation</w:t>
-        </w:r>
-      </w:hyperlink>
-    </w:p>
-    <w:p>
-      <w:pPr>
-        <w:pStyle w:val="Heading1"/>
-      </w:pPr>
-      <w:r>
-        <w:rPr/>
-        <w:t xml:space="preserve">REFERENCES  /  CONTINUED</w:t>
-      </w:r>
-    </w:p>
-    <w:p>
-      <w:pPr>
-        <w:pStyle w:val="Heading2"/>
-      </w:pPr>
-      <w:r>
-        <w:rPr/>
-        <w:t xml:space="preserve">Kernel, ABI and project-document sources</w:t>
-      </w:r>
-    </w:p>
-    <w:p>
-      <w:r>
-        <w:rPr/>
-        <w:t xml:space="preserve">[10] Kernel adaptation and exact imports Portable and architecture-specific collector work must be audited together; imports.s is the exact census source. </w:t>
-      </w:r>
-      <w:hyperlink r:id="rId23">
-        <w:r>
-          <w:rPr>
-            <w:color w:val="175C91"/>
-            <w:u w:val="single"/>
-          </w:rPr>
-          <w:t xml:space="preserve">gc-common.c</w:t>
+      <w:hyperlink r:id="rId25">
+        <w:r>
+          <w:rPr>
+            <w:color w:val="175C91"/>
+            <w:u w:val="single"/>
+          </w:rPr>
+          <w:t xml:space="preserve">x86-gc.c</w:t>
         </w:r>
       </w:hyperlink>
       <w:r>
         <w:rPr/>
         <w:t xml:space="preserve"> · </w:t>
       </w:r>
-      <w:hyperlink r:id="rId24">
-        <w:r>
-          <w:rPr>
-            <w:color w:val="175C91"/>
-            <w:u w:val="single"/>
-          </w:rPr>
-          <w:t xml:space="preserve">x86-gc.c</w:t>
+      <w:hyperlink r:id="rId26">
+        <w:r>
+          <w:rPr>
+            <w:color w:val="175C91"/>
+            <w:u w:val="single"/>
+          </w:rPr>
+          <w:t xml:space="preserve">image.c</w:t>
         </w:r>
       </w:hyperlink>
       <w:r>
         <w:rPr/>
         <w:t xml:space="preserve"> · </w:t>
       </w:r>
-      <w:hyperlink r:id="rId25">
-        <w:r>
-          <w:rPr>
-            <w:color w:val="175C91"/>
-            <w:u w:val="single"/>
-          </w:rPr>
-          <w:t xml:space="preserve">image.c</w:t>
+      <w:hyperlink r:id="rId27">
+        <w:r>
+          <w:rPr>
+            <w:color w:val="175C91"/>
+            <w:u w:val="single"/>
+          </w:rPr>
+          <w:t xml:space="preserve">memory.c</w:t>
         </w:r>
       </w:hyperlink>
       <w:r>
         <w:rPr/>
         <w:t xml:space="preserve"> · </w:t>
       </w:r>
-      <w:hyperlink r:id="rId26">
-        <w:r>
-          <w:rPr>
-            <w:color w:val="175C91"/>
-            <w:u w:val="single"/>
-          </w:rPr>
-          <w:t xml:space="preserve">memory.c</w:t>
+      <w:hyperlink r:id="rId28">
+        <w:r>
+          <w:rPr>
+            <w:color w:val="175C91"/>
+            <w:u w:val="single"/>
+          </w:rPr>
+          <w:t xml:space="preserve">thread_manager.c</w:t>
         </w:r>
       </w:hyperlink>
       <w:r>
         <w:rPr/>
         <w:t xml:space="preserve"> · </w:t>
       </w:r>
-      <w:hyperlink r:id="rId27">
-        <w:r>
-          <w:rPr>
-            <w:color w:val="175C91"/>
-            <w:u w:val="single"/>
-          </w:rPr>
-          <w:t xml:space="preserve">thread_manager.c</w:t>
+      <w:hyperlink r:id="rId29">
+        <w:r>
+          <w:rPr>
+            <w:color w:val="175C91"/>
+            <w:u w:val="single"/>
+          </w:rPr>
+          <w:t xml:space="preserve">imports.s</w:t>
+        </w:r>
+      </w:hyperlink>
+    </w:p>
+    <w:p>
+      <w:r>
+        <w:rPr/>
+        <w:t xml:space="preserve">[11] Native trap/check lowering inventory Previously recorded x86-64 UUO/check occurrences remain a worklist to reconcile with evaluated census records. </w:t>
+      </w:r>
+      <w:hyperlink r:id="rId30">
+        <w:r>
+          <w:rPr>
+            <w:color w:val="175C91"/>
+            <w:u w:val="single"/>
+          </w:rPr>
+          <w:t xml:space="preserve">x8664-vinsns.lisp</w:t>
+        </w:r>
+      </w:hyperlink>
+    </w:p>
+    <w:p>
+      <w:r>
+        <w:rPr/>
+        <w:t xml:space="preserve">[12] WebAssembly heterogeneous function tables and call-site types Core control instructions and call_indirect / return_call_indirect validation. A static expected type belongs to the call site; incompatible table entries trap before entry. </w:t>
+      </w:r>
+      <w:hyperlink r:id="rId31">
+        <w:r>
+          <w:rPr>
+            <w:color w:val="175C91"/>
+            <w:u w:val="single"/>
+          </w:rPr>
+          <w:t xml:space="preserve">Core: control instructions</w:t>
         </w:r>
       </w:hyperlink>
       <w:r>
         <w:rPr/>
         <w:t xml:space="preserve"> · </w:t>
       </w:r>
-      <w:hyperlink r:id="rId28">
-        <w:r>
-          <w:rPr>
-            <w:color w:val="175C91"/>
-            <w:u w:val="single"/>
-          </w:rPr>
-          <w:t xml:space="preserve">imports.s</w:t>
-        </w:r>
-      </w:hyperlink>
-    </w:p>
-    <w:p>
-      <w:r>
-        <w:rPr/>
-        <w:t xml:space="preserve">[11] Native trap/check lowering inventory Previously recorded x86-64 UUO/check occurrences remain a worklist to reconcile with evaluated census records. </w:t>
-      </w:r>
-      <w:hyperlink r:id="rId29">
-        <w:r>
-          <w:rPr>
-            <w:color w:val="175C91"/>
-            <w:u w:val="single"/>
-          </w:rPr>
-          <w:t xml:space="preserve">x8664-vinsns.lisp</w:t>
-        </w:r>
-      </w:hyperlink>
-    </w:p>
-    <w:p>
-      <w:r>
-        <w:rPr/>
-        <w:t xml:space="preserve">[12] WebAssembly heterogeneous function tables and call-site types Core control instructions and call_indirect / return_call_indirect validation. A static expected type belongs to the call site; incompatible table entries trap before entry. </w:t>
-      </w:r>
-      <w:hyperlink r:id="rId30">
-        <w:r>
-          <w:rPr>
-            <w:color w:val="175C91"/>
-            <w:u w:val="single"/>
-          </w:rPr>
-          <w:t xml:space="preserve">Core: control instructions</w:t>
+      <w:hyperlink r:id="rId17">
+        <w:r>
+          <w:rPr>
+            <w:color w:val="175C91"/>
+            <w:u w:val="single"/>
+          </w:rPr>
+          <w:t xml:space="preserve">Core: validation and execution</w:t>
+        </w:r>
+      </w:hyperlink>
+    </w:p>
+    <w:p>
+      <w:r>
+        <w:rPr/>
+        <w:t xml:space="preserve">[13] WebAssembly Basic C ABI Scalar versus aggregate parameter/result passing; address-taken locals and the linear C stack. </w:t>
+      </w:r>
+      <w:hyperlink r:id="rId32">
+        <w:r>
+          <w:rPr>
+            <w:color w:val="175C91"/>
+            <w:u w:val="single"/>
+          </w:rPr>
+          <w:t xml:space="preserve">BasicCABI.md</w:t>
+        </w:r>
+      </w:hyperlink>
+    </w:p>
+    <w:p>
+      <w:r>
+        <w:rPr/>
+        <w:t xml:space="preserve">[14] WebAssembly linking conventions Process-once initialization with passive segments and per-thread storage conventions; verify the actual linked output. </w:t>
+      </w:r>
+      <w:hyperlink r:id="rId33">
+        <w:r>
+          <w:rPr>
+            <w:color w:val="175C91"/>
+            <w:u w:val="single"/>
+          </w:rPr>
+          <w:t xml:space="preserve">Linking.md</w:t>
+        </w:r>
+      </w:hyperlink>
+    </w:p>
+    <w:p>
+      <w:r>
+        <w:rPr/>
+        <w:t xml:space="preserve">[15] Common Lisp ordinary lambda lists and calls Required, optional, rest and keyword arguments; FUNCALL/APPLY semantics. A supplied count does not determine callee convention. </w:t>
+      </w:r>
+      <w:hyperlink r:id="rId34">
+        <w:r>
+          <w:rPr>
+            <w:color w:val="175C91"/>
+            <w:u w:val="single"/>
+          </w:rPr>
+          <w:t xml:space="preserve">Lambda lists</w:t>
         </w:r>
       </w:hyperlink>
       <w:r>
         <w:rPr/>
         <w:t xml:space="preserve"> · </w:t>
       </w:r>
-      <w:hyperlink r:id="rId16">
-        <w:r>
-          <w:rPr>
-            <w:color w:val="175C91"/>
-            <w:u w:val="single"/>
-          </w:rPr>
-          <w:t xml:space="preserve">Core: validation and execution</w:t>
-        </w:r>
-      </w:hyperlink>
-    </w:p>
-    <w:p>
-      <w:r>
-        <w:rPr/>
-        <w:t xml:space="preserve">[13] WebAssembly Basic C ABI Scalar versus aggregate parameter/result passing; address-taken locals and the linear C stack. </w:t>
-      </w:r>
-      <w:hyperlink r:id="rId31">
-        <w:r>
-          <w:rPr>
-            <w:color w:val="175C91"/>
-            <w:u w:val="single"/>
-          </w:rPr>
-          <w:t xml:space="preserve">BasicCABI.md</w:t>
-        </w:r>
-      </w:hyperlink>
-    </w:p>
-    <w:p>
-      <w:r>
-        <w:rPr/>
-        <w:t xml:space="preserve">[14] WebAssembly linking conventions Process-once initialization with passive segments and per-thread storage conventions; verify the actual linked output. </w:t>
-      </w:r>
-      <w:hyperlink r:id="rId32">
-        <w:r>
-          <w:rPr>
-            <w:color w:val="175C91"/>
-            <w:u w:val="single"/>
-          </w:rPr>
-          <w:t xml:space="preserve">Linking.md</w:t>
-        </w:r>
-      </w:hyperlink>
-    </w:p>
-    <w:p>
-      <w:r>
-        <w:rPr/>
-        <w:t xml:space="preserve">[15] Common Lisp ordinary lambda lists and calls Required, optional, rest and keyword arguments; FUNCALL/APPLY semantics. A supplied count does not determine callee convention. </w:t>
-      </w:r>
-      <w:hyperlink r:id="rId33">
-        <w:r>
-          <w:rPr>
-            <w:color w:val="175C91"/>
-            <w:u w:val="single"/>
-          </w:rPr>
-          <w:t xml:space="preserve">Lambda lists</w:t>
+      <w:hyperlink r:id="rId35">
+        <w:r>
+          <w:rPr>
+            <w:color w:val="175C91"/>
+            <w:u w:val="single"/>
+          </w:rPr>
+          <w:t xml:space="preserve">FUNCALL</w:t>
         </w:r>
       </w:hyperlink>
       <w:r>
         <w:rPr/>
         <w:t xml:space="preserve"> · </w:t>
       </w:r>
-      <w:hyperlink r:id="rId34">
-        <w:r>
-          <w:rPr>
-            <w:color w:val="175C91"/>
-            <w:u w:val="single"/>
-          </w:rPr>
-          <w:t xml:space="preserve">FUNCALL</w:t>
-        </w:r>
-      </w:hyperlink>
-      <w:r>
-        <w:rPr/>
-        <w:t xml:space="preserve"> · </w:t>
-      </w:r>
-      <w:hyperlink r:id="rId35">
+      <w:hyperlink r:id="rId36">
         <w:r>
           <w:rPr>
             <w:color w:val="175C91"/>
@@ -3101,7 +3191,7 @@
         <w:rPr/>
         <w:t xml:space="preserve">[16] WebAssembly numeric semantics Floating-point operation and operand cases; result classification alone is not a CCL condition policy. </w:t>
       </w:r>
-      <w:hyperlink r:id="rId36">
+      <w:hyperlink r:id="rId37">
         <w:r>
           <w:rPr>
             <w:color w:val="175C91"/>

</xml_diff>

<commit_message>
Regenerate the decisions projection after the D6 policy record
Co-Authored-By: Claude Fable 5.1 <noreply@anthropic.com>
</commit_message>
<xml_diff>
--- a/doc/WASM/CCL_WebAssembly_Stage0_Desk_Decisions_v1_8.docx
+++ b/doc/WASM/CCL_WebAssembly_Stage0_Desk_Decisions_v1_8.docx
@@ -123,6 +123,140 @@
       <w:r>
         <w:rPr/>
         <w:t xml:space="preserve">remaining work; the criterion snapshots are retained in the evidence repository.</w:t>
+      </w:r>
+    </w:p>
+    <w:p>
+      <w:pPr>
+        <w:pStyle w:val="Heading1"/>
+      </w:pPr>
+      <w:r>
+        <w:rPr/>
+        <w:t xml:space="preserve">16 September 2026 — D6 floating-point policy: the ARM model</w:t>
+      </w:r>
+    </w:p>
+    <w:p>
+      <w:r>
+        <w:rPr/>
+        <w:t xml:space="preserve">The user decided the floating-point compatibility choice D6 had left open:</w:t>
+      </w:r>
+    </w:p>
+    <w:p>
+      <w:r>
+        <w:rPr/>
+        <w:t xml:space="preserve">"Okay, then do what CCL did on ARM, plus whatever else is needed for WASM."</w:t>
+      </w:r>
+    </w:p>
+    <w:p>
+      <w:r>
+        <w:rPr/>
+        <w:t xml:space="preserve">Native CCL on ARM cannot trap on floating-point exceptions, so it keeps the</w:t>
+      </w:r>
+    </w:p>
+    <w:p>
+      <w:r>
+        <w:rPr/>
+        <w:t xml:space="preserve">logical enable mask in the TCR (</w:t>
+      </w:r>
+      <w:r>
+        <w:rPr>
+          <w:rFonts w:ascii="Consolas" w:hAnsi="Consolas"/>
+        </w:rPr>
+        <w:t xml:space="preserve">tcr.lisp_fpscr</w:t>
+      </w:r>
+      <w:r>
+        <w:rPr/>
+        <w:t xml:space="preserve">), stores only the rounding</w:t>
+      </w:r>
+    </w:p>
+    <w:p>
+      <w:r>
+        <w:rPr/>
+        <w:t xml:space="preserve">mode in hardware, and under float safety emits a check after each operation</w:t>
+      </w:r>
+    </w:p>
+    <w:p>
+      <w:r>
+        <w:rPr/>
+        <w:t xml:space="preserve">that ANDs the hardware's cumulative flags against the enabled mask and traps</w:t>
+      </w:r>
+    </w:p>
+    <w:p>
+      <w:r>
+        <w:rPr/>
+        <w:t xml:space="preserve">into the same condition classes x86 uses, in the order invalid, division by</w:t>
+      </w:r>
+    </w:p>
+    <w:p>
+      <w:r>
+        <w:rPr/>
+        <w:t xml:space="preserve">zero, overflow, underflow, inexact. The Wasm port adopts that model with the</w:t>
+      </w:r>
+    </w:p>
+    <w:p>
+      <w:r>
+        <w:rPr/>
+        <w:t xml:space="preserve">one difference Wasm forces: there are no hardware flags, so the status is</w:t>
+      </w:r>
+    </w:p>
+    <w:p>
+      <w:r>
+        <w:rPr/>
+        <w:t xml:space="preserve">computed by the detection rules in </w:t>
+      </w:r>
+      <w:hyperlink r:id="rId3">
+        <w:r>
+          <w:rPr>
+            <w:color w:val="175C91"/>
+            <w:u w:val="single"/>
+          </w:rPr>
+          <w:t xml:space="preserve">the specification</w:t>
+        </w:r>
+      </w:hyperlink>
+      <w:r>
+        <w:rPr/>
+        <w:t xml:space="preserve">,</w:t>
+      </w:r>
+    </w:p>
+    <w:p>
+      <w:r>
+        <w:rPr/>
+        <w:t xml:space="preserve">which now records the policy, the emission rule, the condition mapping,</w:t>
+      </w:r>
+    </w:p>
+    <w:p>
+      <w:r>
+        <w:rPr/>
+        <w:t xml:space="preserve">signalling comparisons, the host-math limitation and the two deviations</w:t>
+      </w:r>
+    </w:p>
+    <w:p>
+      <w:r>
+        <w:rPr/>
+        <w:t xml:space="preserve">(nearest rounding only; underflow and inexact undetectable for host</w:t>
+      </w:r>
+    </w:p>
+    <w:p>
+      <w:r>
+        <w:rPr/>
+        <w:t xml:space="preserve">transcendental functions). The production TCR schema carries the mask as</w:t>
+      </w:r>
+    </w:p>
+    <w:p>
+      <w:r>
+        <w:rPr>
+          <w:rFonts w:ascii="Consolas" w:hAnsi="Consolas"/>
+        </w:rPr>
+        <w:t xml:space="preserve">fp_control</w:t>
+      </w:r>
+      <w:r>
+        <w:rPr/>
+        <w:t xml:space="preserve">. This decision does not measure the cost of the checks, which</w:t>
+      </w:r>
+    </w:p>
+    <w:p>
+      <w:r>
+        <w:rPr/>
+        <w:t xml:space="preserve">Stage 1 owes under D6, and does not accept any execution.</w:t>
       </w:r>
     </w:p>
     <w:tbl>
@@ -319,7 +453,7 @@
           <w:p>
             <w:r>
               <w:rPr/>
-              <w:t xml:space="preserve">Decided: vocabulary and lowering.</w:t>
+              <w:t xml:space="preserve">Decided: vocabulary, lowering and, on 16 September, the floating-point policy (the ARM model); census under contract v0.2.</w:t>
             </w:r>
           </w:p>
         </w:tc>
@@ -695,7 +829,7 @@
         <w:rPr/>
         <w:t xml:space="preserve">The </w:t>
       </w:r>
-      <w:hyperlink r:id="rId3">
+      <w:hyperlink r:id="rId4">
         <w:r>
           <w:rPr>
             <w:color w:val="175C91"/>
@@ -1037,7 +1171,7 @@
         <w:rPr/>
         <w:t xml:space="preserve">Use B under the </w:t>
       </w:r>
-      <w:hyperlink r:id="rId3">
+      <w:hyperlink r:id="rId4">
         <w:r>
           <w:rPr>
             <w:color w:val="175C91"/>
@@ -1056,7 +1190,7 @@
         <w:rPr/>
         <w:t xml:space="preserve">The </w:t>
       </w:r>
-      <w:hyperlink r:id="rId4">
+      <w:hyperlink r:id="rId5">
         <w:r>
           <w:rPr>
             <w:color w:val="175C91"/>
@@ -1069,7 +1203,7 @@
         <w:rPr/>
         <w:t xml:space="preserve"> and </w:t>
       </w:r>
-      <w:hyperlink r:id="rId5">
+      <w:hyperlink r:id="rId6">
         <w:r>
           <w:rPr>
             <w:color w:val="175C91"/>
@@ -1082,7 +1216,7 @@
         <w:rPr/>
         <w:t xml:space="preserve"> supply the bounded correctness basis. The </w:t>
       </w:r>
-      <w:hyperlink r:id="rId6">
+      <w:hyperlink r:id="rId7">
         <w:r>
           <w:rPr>
             <w:color w:val="175C91"/>
@@ -1305,7 +1439,7 @@
         <w:rPr/>
         <w:t xml:space="preserve">14 September 2026 clarification following the native-internals review: retain D1, B, D4 and D5. The hand-built copying collector establishes its recorded mechanisms; it does not select the production collector algorithm or qualify all native object semantics. The initial non-generational collector still owes moved-key/hash-cache correctness and separate dispositions for weak objects and GCTWA. The non-generational choice justifies omitting classified generational bookkeeping, not other store semantics. B does not eliminate roots outside the argument stack, and cooperative suspension requires complete publication at every collecting transition. The </w:t>
       </w:r>
-      <w:hyperlink r:id="rId7">
+      <w:hyperlink r:id="rId8">
         <w:r>
           <w:rPr>
             <w:color w:val="175C91"/>
@@ -1573,7 +1707,7 @@
         <w:rPr/>
         <w:t xml:space="preserve">The integrated fixture exposed two lifetime defects (original failures r3 and r6). Claude’s external audit then exposed an exceptional return that left an idle Worker RUNNING (original failure r9). These findings amend protocol v1; the </w:t>
       </w:r>
-      <w:hyperlink r:id="rId8">
+      <w:hyperlink r:id="rId9">
         <w:r>
           <w:rPr>
             <w:color w:val="175C91"/>
@@ -1586,7 +1720,7 @@
         <w:rPr/>
         <w:t xml:space="preserve"> retains the originals and the </w:t>
       </w:r>
-      <w:hyperlink r:id="rId9">
+      <w:hyperlink r:id="rId10">
         <w:r>
           <w:rPr>
             <w:color w:val="175C91"/>
@@ -2132,6 +2266,12 @@
       </w:r>
     </w:p>
     <w:p>
+      <w:r>
+        <w:rPr/>
+        <w:t xml:space="preserve">Decided 16 September 2026: the policy is the ARM model, recorded in the dated section above and in the specification's policy section. Checks are emitted under the same float-safety rule as ARM, so the unchecked path exists exactly where native CCL has it, not as a new compatibility choice. Cost measurement remains owed.</w:t>
+      </w:r>
+    </w:p>
+    <w:p>
       <w:pPr>
         <w:pStyle w:val="Heading3"/>
       </w:pPr>
@@ -2151,7 +2291,7 @@
         <w:rPr/>
         <w:t xml:space="preserve">This record supplies an edit-site plan, not a prepared executable patch. The actual patch must identify its path, revision and digest, attach the baseline comparison recipe, and produce native FASL/behavior and evaluated acode-ID/flag comparisons after application. Preserve Gate 0 and ARM64 same-host results at their original evidence scope; the user retired the separate second-host test on 2026-09-13 (see </w:t>
       </w:r>
-      <w:hyperlink r:id="rId10">
+      <w:hyperlink r:id="rId11">
         <w:r>
           <w:rPr>
             <w:color w:val="175C91"/>
@@ -2209,7 +2349,7 @@
         <w:rPr/>
         <w:t xml:space="preserve">Use S&lt;stage&gt;-LL&lt;nn&gt;-&lt;letter&gt; with an evidence kind and pinned test revision. The JSON inventory lists mandatory IDs, profile/candidate variants, assertions and prerequisites for each experiment phase. The </w:t>
       </w:r>
-      <w:hyperlink r:id="rId11">
+      <w:hyperlink r:id="rId12">
         <w:r>
           <w:rPr>
             <w:color w:val="175C91"/>
@@ -2792,7 +2932,7 @@
         <w:rPr/>
         <w:t xml:space="preserve">[1] x8632 architecture data and execution layouts Tag constants, widths, canonical NIL/T, cons ordering and native execution-layout exceptions. </w:t>
       </w:r>
-      <w:hyperlink r:id="rId12">
+      <w:hyperlink r:id="rId13">
         <w:r>
           <w:rPr>
             <w:color w:val="175C91"/>
@@ -2807,7 +2947,7 @@
         <w:rPr/>
         <w:t xml:space="preserve">[2] C cons layout and accessors CDR then CAR in struct cons; untagged field access. Constructor order is a separate Lisp contract. </w:t>
       </w:r>
-      <w:hyperlink r:id="rId13">
+      <w:hyperlink r:id="rId14">
         <w:r>
           <w:rPr>
             <w:color w:val="175C91"/>
@@ -2820,7 +2960,7 @@
         <w:rPr/>
         <w:t xml:space="preserve"> · </w:t>
       </w:r>
-      <w:hyperlink r:id="rId14">
+      <w:hyperlink r:id="rId15">
         <w:r>
           <w:rPr>
             <w:color w:val="175C91"/>
@@ -2835,7 +2975,7 @@
         <w:rPr/>
         <w:t xml:space="preserve">[3] 32-bit cross-loader and ARM comparison Cross-loading precedent and alternative fulltags; no adoption of native architecture conditionals by implication. </w:t>
       </w:r>
-      <w:hyperlink r:id="rId15">
+      <w:hyperlink r:id="rId16">
         <w:r>
           <w:rPr>
             <w:color w:val="175C91"/>
@@ -2848,7 +2988,7 @@
         <w:rPr/>
         <w:t xml:space="preserve"> · </w:t>
       </w:r>
-      <w:hyperlink r:id="rId16">
+      <w:hyperlink r:id="rId17">
         <w:r>
           <w:rPr>
             <w:color w:val="175C91"/>
@@ -2863,7 +3003,7 @@
         <w:rPr/>
         <w:t xml:space="preserve">[4] WebAssembly core: memory instructions Address arithmetic and nonnegative memarg offsets. Engine optimization costs are not specified. </w:t>
       </w:r>
-      <w:hyperlink r:id="rId17">
+      <w:hyperlink r:id="rId18">
         <w:r>
           <w:rPr>
             <w:color w:val="175C91"/>
@@ -2878,305 +3018,305 @@
         <w:rPr/>
         <w:t xml:space="preserve">[5] WebAssembly memory limits encoding The admitted wasm32 explicit-maximum unshared/shared encodings; exact transforms require validation. </w:t>
       </w:r>
+      <w:hyperlink r:id="rId19">
+        <w:r>
+          <w:rPr>
+            <w:color w:val="175C91"/>
+            <w:u w:val="single"/>
+          </w:rPr>
+          <w:t xml:space="preserve">Threads: limits and memory types</w:t>
+        </w:r>
+      </w:hyperlink>
+    </w:p>
+    <w:p>
+      <w:r>
+        <w:rPr/>
+        <w:t xml:space="preserve">[6] WebAssembly threads Atomic access, wait/notify distinctions, shared-memory initialization and the host-facing synchronization basis. </w:t>
+      </w:r>
+      <w:hyperlink r:id="rId20">
+        <w:r>
+          <w:rPr>
+            <w:color w:val="175C91"/>
+            <w:u w:val="single"/>
+          </w:rPr>
+          <w:t xml:space="preserve">Threads overview</w:t>
+        </w:r>
+      </w:hyperlink>
+    </w:p>
+    <w:p>
+      <w:r>
+        <w:rPr/>
+        <w:t xml:space="preserve">[7] WebAssembly tail calls and multiple results Tail transfers use the callee signature and compatible result types; linear-memory Lisp-stack ownership remains an implementation contract. </w:t>
+      </w:r>
+      <w:hyperlink r:id="rId21">
+        <w:r>
+          <w:rPr>
+            <w:color w:val="175C91"/>
+            <w:u w:val="single"/>
+          </w:rPr>
+          <w:t xml:space="preserve">Tail-call overview</w:t>
+        </w:r>
+      </w:hyperlink>
+      <w:r>
+        <w:rPr/>
+        <w:t xml:space="preserve"> · </w:t>
+      </w:r>
       <w:hyperlink r:id="rId18">
         <w:r>
           <w:rPr>
             <w:color w:val="175C91"/>
             <w:u w:val="single"/>
           </w:rPr>
-          <w:t xml:space="preserve">Threads: limits and memory types</w:t>
-        </w:r>
-      </w:hyperlink>
-    </w:p>
-    <w:p>
-      <w:r>
-        <w:rPr/>
-        <w:t xml:space="preserve">[6] WebAssembly threads Atomic access, wait/notify distinctions, shared-memory initialization and the host-facing synchronization basis. </w:t>
-      </w:r>
-      <w:hyperlink r:id="rId19">
-        <w:r>
-          <w:rPr>
-            <w:color w:val="175C91"/>
-            <w:u w:val="single"/>
-          </w:rPr>
-          <w:t xml:space="preserve">Threads overview</w:t>
-        </w:r>
-      </w:hyperlink>
-    </w:p>
-    <w:p>
-      <w:r>
-        <w:rPr/>
-        <w:t xml:space="preserve">[7] WebAssembly tail calls and multiple results Tail transfers use the callee signature and compatible result types; linear-memory Lisp-stack ownership remains an implementation contract. </w:t>
-      </w:r>
-      <w:hyperlink r:id="rId20">
-        <w:r>
-          <w:rPr>
-            <w:color w:val="175C91"/>
-            <w:u w:val="single"/>
-          </w:rPr>
-          <w:t xml:space="preserve">Tail-call overview</w:t>
+          <w:t xml:space="preserve">Core validation</w:t>
+        </w:r>
+      </w:hyperlink>
+    </w:p>
+    <w:p>
+      <w:r>
+        <w:rPr/>
+        <w:t xml:space="preserve">[8] CCL backend and native pass 2 Native argument-register conventions are comparison evidence, not a Wasm parameter limit. </w:t>
+      </w:r>
+      <w:hyperlink r:id="rId22">
+        <w:r>
+          <w:rPr>
+            <w:color w:val="175C91"/>
+            <w:u w:val="single"/>
+          </w:rPr>
+          <w:t xml:space="preserve">backend.lisp</w:t>
         </w:r>
       </w:hyperlink>
       <w:r>
         <w:rPr/>
         <w:t xml:space="preserve"> · </w:t>
       </w:r>
-      <w:hyperlink r:id="rId17">
-        <w:r>
-          <w:rPr>
-            <w:color w:val="175C91"/>
-            <w:u w:val="single"/>
-          </w:rPr>
-          <w:t xml:space="preserve">Core validation</w:t>
-        </w:r>
-      </w:hyperlink>
-    </w:p>
-    <w:p>
-      <w:r>
-        <w:rPr/>
-        <w:t xml:space="preserve">[8] CCL backend and native pass 2 Native argument-register conventions are comparison evidence, not a Wasm parameter limit. </w:t>
-      </w:r>
-      <w:hyperlink r:id="rId21">
-        <w:r>
-          <w:rPr>
-            <w:color w:val="175C91"/>
-            <w:u w:val="single"/>
-          </w:rPr>
-          <w:t xml:space="preserve">backend.lisp</w:t>
+      <w:hyperlink r:id="rId23">
+        <w:r>
+          <w:rPr>
+            <w:color w:val="175C91"/>
+            <w:u w:val="single"/>
+          </w:rPr>
+          <w:t xml:space="preserve">x862.lisp</w:t>
+        </w:r>
+      </w:hyperlink>
+    </w:p>
+    <w:p>
+      <w:r>
+        <w:rPr/>
+        <w:t xml:space="preserve">[9] LLVM WebAssembly linker Import/export and memory/table options; signature-mismatch warnings and trapping stubs; strict link policy. </w:t>
+      </w:r>
+      <w:hyperlink r:id="rId24">
+        <w:r>
+          <w:rPr>
+            <w:color w:val="175C91"/>
+            <w:u w:val="single"/>
+          </w:rPr>
+          <w:t xml:space="preserve">LLD WebAssembly documentation</w:t>
+        </w:r>
+      </w:hyperlink>
+    </w:p>
+    <w:p>
+      <w:pPr>
+        <w:pStyle w:val="Heading1"/>
+      </w:pPr>
+      <w:r>
+        <w:rPr/>
+        <w:t xml:space="preserve">REFERENCES  /  CONTINUED</w:t>
+      </w:r>
+    </w:p>
+    <w:p>
+      <w:pPr>
+        <w:pStyle w:val="Heading2"/>
+      </w:pPr>
+      <w:r>
+        <w:rPr/>
+        <w:t xml:space="preserve">Kernel, ABI and project-document sources</w:t>
+      </w:r>
+    </w:p>
+    <w:p>
+      <w:r>
+        <w:rPr/>
+        <w:t xml:space="preserve">[10] Kernel adaptation and exact imports Portable and architecture-specific collector work must be audited together; imports.s is the exact census source. </w:t>
+      </w:r>
+      <w:hyperlink r:id="rId25">
+        <w:r>
+          <w:rPr>
+            <w:color w:val="175C91"/>
+            <w:u w:val="single"/>
+          </w:rPr>
+          <w:t xml:space="preserve">gc-common.c</w:t>
         </w:r>
       </w:hyperlink>
       <w:r>
         <w:rPr/>
         <w:t xml:space="preserve"> · </w:t>
       </w:r>
-      <w:hyperlink r:id="rId22">
-        <w:r>
-          <w:rPr>
-            <w:color w:val="175C91"/>
-            <w:u w:val="single"/>
-          </w:rPr>
-          <w:t xml:space="preserve">x862.lisp</w:t>
-        </w:r>
-      </w:hyperlink>
-    </w:p>
-    <w:p>
-      <w:r>
-        <w:rPr/>
-        <w:t xml:space="preserve">[9] LLVM WebAssembly linker Import/export and memory/table options; signature-mismatch warnings and trapping stubs; strict link policy. </w:t>
-      </w:r>
-      <w:hyperlink r:id="rId23">
-        <w:r>
-          <w:rPr>
-            <w:color w:val="175C91"/>
-            <w:u w:val="single"/>
-          </w:rPr>
-          <w:t xml:space="preserve">LLD WebAssembly documentation</w:t>
-        </w:r>
-      </w:hyperlink>
-    </w:p>
-    <w:p>
-      <w:pPr>
-        <w:pStyle w:val="Heading1"/>
-      </w:pPr>
-      <w:r>
-        <w:rPr/>
-        <w:t xml:space="preserve">REFERENCES  /  CONTINUED</w:t>
-      </w:r>
-    </w:p>
-    <w:p>
-      <w:pPr>
-        <w:pStyle w:val="Heading2"/>
-      </w:pPr>
-      <w:r>
-        <w:rPr/>
-        <w:t xml:space="preserve">Kernel, ABI and project-document sources</w:t>
-      </w:r>
-    </w:p>
-    <w:p>
-      <w:r>
-        <w:rPr/>
-        <w:t xml:space="preserve">[10] Kernel adaptation and exact imports Portable and architecture-specific collector work must be audited together; imports.s is the exact census source. </w:t>
-      </w:r>
-      <w:hyperlink r:id="rId24">
-        <w:r>
-          <w:rPr>
-            <w:color w:val="175C91"/>
-            <w:u w:val="single"/>
-          </w:rPr>
-          <w:t xml:space="preserve">gc-common.c</w:t>
+      <w:hyperlink r:id="rId26">
+        <w:r>
+          <w:rPr>
+            <w:color w:val="175C91"/>
+            <w:u w:val="single"/>
+          </w:rPr>
+          <w:t xml:space="preserve">x86-gc.c</w:t>
         </w:r>
       </w:hyperlink>
       <w:r>
         <w:rPr/>
         <w:t xml:space="preserve"> · </w:t>
       </w:r>
-      <w:hyperlink r:id="rId25">
-        <w:r>
-          <w:rPr>
-            <w:color w:val="175C91"/>
-            <w:u w:val="single"/>
-          </w:rPr>
-          <w:t xml:space="preserve">x86-gc.c</w:t>
+      <w:hyperlink r:id="rId27">
+        <w:r>
+          <w:rPr>
+            <w:color w:val="175C91"/>
+            <w:u w:val="single"/>
+          </w:rPr>
+          <w:t xml:space="preserve">image.c</w:t>
         </w:r>
       </w:hyperlink>
       <w:r>
         <w:rPr/>
         <w:t xml:space="preserve"> · </w:t>
       </w:r>
-      <w:hyperlink r:id="rId26">
-        <w:r>
-          <w:rPr>
-            <w:color w:val="175C91"/>
-            <w:u w:val="single"/>
-          </w:rPr>
-          <w:t xml:space="preserve">image.c</w:t>
+      <w:hyperlink r:id="rId28">
+        <w:r>
+          <w:rPr>
+            <w:color w:val="175C91"/>
+            <w:u w:val="single"/>
+          </w:rPr>
+          <w:t xml:space="preserve">memory.c</w:t>
         </w:r>
       </w:hyperlink>
       <w:r>
         <w:rPr/>
         <w:t xml:space="preserve"> · </w:t>
       </w:r>
-      <w:hyperlink r:id="rId27">
-        <w:r>
-          <w:rPr>
-            <w:color w:val="175C91"/>
-            <w:u w:val="single"/>
-          </w:rPr>
-          <w:t xml:space="preserve">memory.c</w:t>
+      <w:hyperlink r:id="rId29">
+        <w:r>
+          <w:rPr>
+            <w:color w:val="175C91"/>
+            <w:u w:val="single"/>
+          </w:rPr>
+          <w:t xml:space="preserve">thread_manager.c</w:t>
         </w:r>
       </w:hyperlink>
       <w:r>
         <w:rPr/>
         <w:t xml:space="preserve"> · </w:t>
       </w:r>
-      <w:hyperlink r:id="rId28">
-        <w:r>
-          <w:rPr>
-            <w:color w:val="175C91"/>
-            <w:u w:val="single"/>
-          </w:rPr>
-          <w:t xml:space="preserve">thread_manager.c</w:t>
+      <w:hyperlink r:id="rId30">
+        <w:r>
+          <w:rPr>
+            <w:color w:val="175C91"/>
+            <w:u w:val="single"/>
+          </w:rPr>
+          <w:t xml:space="preserve">imports.s</w:t>
+        </w:r>
+      </w:hyperlink>
+    </w:p>
+    <w:p>
+      <w:r>
+        <w:rPr/>
+        <w:t xml:space="preserve">[11] Native trap/check lowering inventory Previously recorded x86-64 UUO/check occurrences remain a worklist to reconcile with evaluated census records. </w:t>
+      </w:r>
+      <w:hyperlink r:id="rId31">
+        <w:r>
+          <w:rPr>
+            <w:color w:val="175C91"/>
+            <w:u w:val="single"/>
+          </w:rPr>
+          <w:t xml:space="preserve">x8664-vinsns.lisp</w:t>
+        </w:r>
+      </w:hyperlink>
+    </w:p>
+    <w:p>
+      <w:r>
+        <w:rPr/>
+        <w:t xml:space="preserve">[12] WebAssembly heterogeneous function tables and call-site types Core control instructions and call_indirect / return_call_indirect validation. A static expected type belongs to the call site; incompatible table entries trap before entry. </w:t>
+      </w:r>
+      <w:hyperlink r:id="rId32">
+        <w:r>
+          <w:rPr>
+            <w:color w:val="175C91"/>
+            <w:u w:val="single"/>
+          </w:rPr>
+          <w:t xml:space="preserve">Core: control instructions</w:t>
         </w:r>
       </w:hyperlink>
       <w:r>
         <w:rPr/>
         <w:t xml:space="preserve"> · </w:t>
       </w:r>
-      <w:hyperlink r:id="rId29">
-        <w:r>
-          <w:rPr>
-            <w:color w:val="175C91"/>
-            <w:u w:val="single"/>
-          </w:rPr>
-          <w:t xml:space="preserve">imports.s</w:t>
-        </w:r>
-      </w:hyperlink>
-    </w:p>
-    <w:p>
-      <w:r>
-        <w:rPr/>
-        <w:t xml:space="preserve">[11] Native trap/check lowering inventory Previously recorded x86-64 UUO/check occurrences remain a worklist to reconcile with evaluated census records. </w:t>
-      </w:r>
-      <w:hyperlink r:id="rId30">
-        <w:r>
-          <w:rPr>
-            <w:color w:val="175C91"/>
-            <w:u w:val="single"/>
-          </w:rPr>
-          <w:t xml:space="preserve">x8664-vinsns.lisp</w:t>
-        </w:r>
-      </w:hyperlink>
-    </w:p>
-    <w:p>
-      <w:r>
-        <w:rPr/>
-        <w:t xml:space="preserve">[12] WebAssembly heterogeneous function tables and call-site types Core control instructions and call_indirect / return_call_indirect validation. A static expected type belongs to the call site; incompatible table entries trap before entry. </w:t>
-      </w:r>
-      <w:hyperlink r:id="rId31">
-        <w:r>
-          <w:rPr>
-            <w:color w:val="175C91"/>
-            <w:u w:val="single"/>
-          </w:rPr>
-          <w:t xml:space="preserve">Core: control instructions</w:t>
+      <w:hyperlink r:id="rId18">
+        <w:r>
+          <w:rPr>
+            <w:color w:val="175C91"/>
+            <w:u w:val="single"/>
+          </w:rPr>
+          <w:t xml:space="preserve">Core: validation and execution</w:t>
+        </w:r>
+      </w:hyperlink>
+    </w:p>
+    <w:p>
+      <w:r>
+        <w:rPr/>
+        <w:t xml:space="preserve">[13] WebAssembly Basic C ABI Scalar versus aggregate parameter/result passing; address-taken locals and the linear C stack. </w:t>
+      </w:r>
+      <w:hyperlink r:id="rId33">
+        <w:r>
+          <w:rPr>
+            <w:color w:val="175C91"/>
+            <w:u w:val="single"/>
+          </w:rPr>
+          <w:t xml:space="preserve">BasicCABI.md</w:t>
+        </w:r>
+      </w:hyperlink>
+    </w:p>
+    <w:p>
+      <w:r>
+        <w:rPr/>
+        <w:t xml:space="preserve">[14] WebAssembly linking conventions Process-once initialization with passive segments and per-thread storage conventions; verify the actual linked output. </w:t>
+      </w:r>
+      <w:hyperlink r:id="rId34">
+        <w:r>
+          <w:rPr>
+            <w:color w:val="175C91"/>
+            <w:u w:val="single"/>
+          </w:rPr>
+          <w:t xml:space="preserve">Linking.md</w:t>
+        </w:r>
+      </w:hyperlink>
+    </w:p>
+    <w:p>
+      <w:r>
+        <w:rPr/>
+        <w:t xml:space="preserve">[15] Common Lisp ordinary lambda lists and calls Required, optional, rest and keyword arguments; FUNCALL/APPLY semantics. A supplied count does not determine callee convention. </w:t>
+      </w:r>
+      <w:hyperlink r:id="rId35">
+        <w:r>
+          <w:rPr>
+            <w:color w:val="175C91"/>
+            <w:u w:val="single"/>
+          </w:rPr>
+          <w:t xml:space="preserve">Lambda lists</w:t>
         </w:r>
       </w:hyperlink>
       <w:r>
         <w:rPr/>
         <w:t xml:space="preserve"> · </w:t>
       </w:r>
-      <w:hyperlink r:id="rId17">
-        <w:r>
-          <w:rPr>
-            <w:color w:val="175C91"/>
-            <w:u w:val="single"/>
-          </w:rPr>
-          <w:t xml:space="preserve">Core: validation and execution</w:t>
-        </w:r>
-      </w:hyperlink>
-    </w:p>
-    <w:p>
-      <w:r>
-        <w:rPr/>
-        <w:t xml:space="preserve">[13] WebAssembly Basic C ABI Scalar versus aggregate parameter/result passing; address-taken locals and the linear C stack. </w:t>
-      </w:r>
-      <w:hyperlink r:id="rId32">
-        <w:r>
-          <w:rPr>
-            <w:color w:val="175C91"/>
-            <w:u w:val="single"/>
-          </w:rPr>
-          <w:t xml:space="preserve">BasicCABI.md</w:t>
-        </w:r>
-      </w:hyperlink>
-    </w:p>
-    <w:p>
-      <w:r>
-        <w:rPr/>
-        <w:t xml:space="preserve">[14] WebAssembly linking conventions Process-once initialization with passive segments and per-thread storage conventions; verify the actual linked output. </w:t>
-      </w:r>
-      <w:hyperlink r:id="rId33">
-        <w:r>
-          <w:rPr>
-            <w:color w:val="175C91"/>
-            <w:u w:val="single"/>
-          </w:rPr>
-          <w:t xml:space="preserve">Linking.md</w:t>
-        </w:r>
-      </w:hyperlink>
-    </w:p>
-    <w:p>
-      <w:r>
-        <w:rPr/>
-        <w:t xml:space="preserve">[15] Common Lisp ordinary lambda lists and calls Required, optional, rest and keyword arguments; FUNCALL/APPLY semantics. A supplied count does not determine callee convention. </w:t>
-      </w:r>
-      <w:hyperlink r:id="rId34">
-        <w:r>
-          <w:rPr>
-            <w:color w:val="175C91"/>
-            <w:u w:val="single"/>
-          </w:rPr>
-          <w:t xml:space="preserve">Lambda lists</w:t>
+      <w:hyperlink r:id="rId36">
+        <w:r>
+          <w:rPr>
+            <w:color w:val="175C91"/>
+            <w:u w:val="single"/>
+          </w:rPr>
+          <w:t xml:space="preserve">FUNCALL</w:t>
         </w:r>
       </w:hyperlink>
       <w:r>
         <w:rPr/>
         <w:t xml:space="preserve"> · </w:t>
       </w:r>
-      <w:hyperlink r:id="rId35">
-        <w:r>
-          <w:rPr>
-            <w:color w:val="175C91"/>
-            <w:u w:val="single"/>
-          </w:rPr>
-          <w:t xml:space="preserve">FUNCALL</w:t>
-        </w:r>
-      </w:hyperlink>
-      <w:r>
-        <w:rPr/>
-        <w:t xml:space="preserve"> · </w:t>
-      </w:r>
-      <w:hyperlink r:id="rId36">
+      <w:hyperlink r:id="rId37">
         <w:r>
           <w:rPr>
             <w:color w:val="175C91"/>
@@ -3191,7 +3331,7 @@
         <w:rPr/>
         <w:t xml:space="preserve">[16] WebAssembly numeric semantics Floating-point operation and operand cases; result classification alone is not a CCL condition policy. </w:t>
       </w:r>
-      <w:hyperlink r:id="rId37">
+      <w:hyperlink r:id="rId38">
         <w:r>
           <w:rPr>
             <w:color w:val="175C91"/>

</xml_diff>

<commit_message>
Adopt the Stage 1 inventory, authorize Codex as author, defer JSPI
User decision of 16 September: the draft inventory of 31 tests becomes
stage1/inventory.json and the criterion of a new Stage 1 ledger (BLOCKED,
31 missing); CLAUDE.md authorizes Codex for the functional shared-compiler
changes under the D6 edit-site plan with R6 per change and Claude's
review; the single-thread JSPI profile is deferred to the profiles stage.

Co-Authored-By: Claude Fable 5.1 <noreply@anthropic.com>
</commit_message>
<xml_diff>
--- a/doc/WASM/CCL_WebAssembly_Stage0_Desk_Decisions_v1_8.docx
+++ b/doc/WASM/CCL_WebAssembly_Stage0_Desk_Decisions_v1_8.docx
@@ -257,6 +257,203 @@
       <w:r>
         <w:rPr/>
         <w:t xml:space="preserve">Stage 1 owes under D6, and does not accept any execution.</w:t>
+      </w:r>
+    </w:p>
+    <w:p>
+      <w:pPr>
+        <w:pStyle w:val="Heading1"/>
+      </w:pPr>
+      <w:r>
+        <w:rPr/>
+        <w:t xml:space="preserve">16 September 2026 — Stage 1 entry: inventory adopted, author authorized, JSPI deferred</w:t>
+      </w:r>
+    </w:p>
+    <w:p>
+      <w:r>
+        <w:rPr/>
+        <w:t xml:space="preserve">With the Stage 0 ledger at PASS, the user made the three entry decisions</w:t>
+      </w:r>
+    </w:p>
+    <w:p>
+      <w:r>
+        <w:rPr/>
+        <w:t xml:space="preserve">Stage 1 was waiting on, in these words: "Adopt the Stage 1 inventory.</w:t>
+      </w:r>
+    </w:p>
+    <w:p>
+      <w:r>
+        <w:rPr/>
+        <w:t xml:space="preserve">CODEX will remain the author. We should defer JSPI."</w:t>
+      </w:r>
+    </w:p>
+    <w:p>
+      <w:r>
+        <w:rPr/>
+        <w:t xml:space="preserve">1. </w:t>
+      </w:r>
+      <w:r>
+        <w:rPr>
+          <w:b/>
+        </w:rPr>
+        <w:t xml:space="preserve">Inventory.</w:t>
+      </w:r>
+      <w:r>
+        <w:rPr/>
+        <w:t xml:space="preserve"> The draft of 15 September is adopted unchanged as</w:t>
+      </w:r>
+    </w:p>
+    <w:p>
+      <w:r>
+        <w:rPr/>
+        <w:t xml:space="preserve">   </w:t>
+      </w:r>
+      <w:hyperlink r:id="rId4">
+        <w:r>
+          <w:rPr>
+            <w:color w:val="175C91"/>
+            <w:u w:val="single"/>
+          </w:rPr>
+          <w:t xml:space="preserve">stage1/inventory.json</w:t>
+        </w:r>
+      </w:hyperlink>
+      <w:r>
+        <w:rPr/>
+        <w:t xml:space="preserve">: 31 tests, one variant</w:t>
+      </w:r>
+    </w:p>
+    <w:p>
+      <w:r>
+        <w:rPr/>
+        <w:t xml:space="preserve">   each, in six subgates, including the two entries proposed from Stage 0</w:t>
+      </w:r>
+    </w:p>
+    <w:p>
+      <w:r>
+        <w:rPr/>
+        <w:t xml:space="preserve">   findings (S1-LL11-b for the stale-dcode defect, S1-LL18-b for EQ hash</w:t>
+      </w:r>
+    </w:p>
+    <w:p>
+      <w:r>
+        <w:rPr/>
+        <w:t xml:space="preserve">   tables under movement). It is now the criterion of the Stage 1 ledger,</w:t>
+      </w:r>
+    </w:p>
+    <w:p>
+      <w:r>
+        <w:rPr/>
+        <w:t xml:space="preserve">   </w:t>
+      </w:r>
+      <w:hyperlink r:id="rId5">
+        <w:r>
+          <w:rPr>
+            <w:color w:val="175C91"/>
+            <w:u w:val="single"/>
+          </w:rPr>
+          <w:t xml:space="preserve">current-stage1-gate-result.json</w:t>
+        </w:r>
+      </w:hyperlink>
+      <w:r>
+        <w:rPr/>
+        <w:t xml:space="preserve">,</w:t>
+      </w:r>
+    </w:p>
+    <w:p>
+      <w:r>
+        <w:rPr/>
+        <w:t xml:space="preserve">   which the unchanged gate tool reports BLOCKED with 31 missing. Amending</w:t>
+      </w:r>
+    </w:p>
+    <w:p>
+      <w:r>
+        <w:rPr/>
+        <w:t xml:space="preserve">   it is recorded the way a Stage 0 criterion change is.</w:t>
+      </w:r>
+    </w:p>
+    <w:p>
+      <w:r>
+        <w:rPr/>
+        <w:t xml:space="preserve">2. </w:t>
+      </w:r>
+      <w:r>
+        <w:rPr>
+          <w:b/>
+        </w:rPr>
+        <w:t xml:space="preserve">Author.</w:t>
+      </w:r>
+      <w:r>
+        <w:rPr/>
+        <w:t xml:space="preserve"> Codex remains the author of Stage 1, now including the</w:t>
+      </w:r>
+    </w:p>
+    <w:p>
+      <w:r>
+        <w:rPr/>
+        <w:t xml:space="preserve">   functional shared-compiler changes that subgate 1A requires, under the</w:t>
+      </w:r>
+    </w:p>
+    <w:p>
+      <w:r>
+        <w:rPr/>
+        <w:t xml:space="preserve">   D6 edit-site plan and R6 comparison of every existing target after each</w:t>
+      </w:r>
+    </w:p>
+    <w:p>
+      <w:r>
+        <w:rPr/>
+        <w:t xml:space="preserve">   change. Claude is the adversarial reviewer. The standing rule in</w:t>
+      </w:r>
+    </w:p>
+    <w:p>
+      <w:r>
+        <w:rPr/>
+        <w:t xml:space="preserve">   CLAUDE.md is amended accordingly; the implementation starts from</w:t>
+      </w:r>
+    </w:p>
+    <w:p>
+      <w:r>
+        <w:rPr/>
+        <w:t xml:space="preserve">   pristine U1 with nothing carried forward from observation.</w:t>
+      </w:r>
+    </w:p>
+    <w:p>
+      <w:r>
+        <w:rPr/>
+        <w:t xml:space="preserve">3. </w:t>
+      </w:r>
+      <w:r>
+        <w:rPr>
+          <w:b/>
+        </w:rPr>
+        <w:t xml:space="preserve">Profile.</w:t>
+      </w:r>
+      <w:r>
+        <w:rPr/>
+        <w:t xml:space="preserve"> The single-thread JSPI profile is deferred to the profiles</w:t>
+      </w:r>
+    </w:p>
+    <w:p>
+      <w:r>
+        <w:rPr/>
+        <w:t xml:space="preserve">   stage. Stage 1 executes on the full profile with one Worker; no S1</w:t>
+      </w:r>
+    </w:p>
+    <w:p>
+      <w:r>
+        <w:rPr/>
+        <w:t xml:space="preserve">   variant targets JSPI, and the engine matrix's JSPI rows remain facts</w:t>
+      </w:r>
+    </w:p>
+    <w:p>
+      <w:r>
+        <w:rPr/>
+        <w:t xml:space="preserve">   about the engines, not a Stage 1 requirement. Admitting the profile</w:t>
+      </w:r>
+    </w:p>
+    <w:p>
+      <w:r>
+        <w:rPr/>
+        <w:t xml:space="preserve">   later is a criterion change with its own record.</w:t>
       </w:r>
     </w:p>
     <w:tbl>
@@ -829,7 +1026,7 @@
         <w:rPr/>
         <w:t xml:space="preserve">The </w:t>
       </w:r>
-      <w:hyperlink r:id="rId4">
+      <w:hyperlink r:id="rId6">
         <w:r>
           <w:rPr>
             <w:color w:val="175C91"/>
@@ -1171,7 +1368,7 @@
         <w:rPr/>
         <w:t xml:space="preserve">Use B under the </w:t>
       </w:r>
-      <w:hyperlink r:id="rId4">
+      <w:hyperlink r:id="rId6">
         <w:r>
           <w:rPr>
             <w:color w:val="175C91"/>
@@ -1190,7 +1387,7 @@
         <w:rPr/>
         <w:t xml:space="preserve">The </w:t>
       </w:r>
-      <w:hyperlink r:id="rId5">
+      <w:hyperlink r:id="rId7">
         <w:r>
           <w:rPr>
             <w:color w:val="175C91"/>
@@ -1203,7 +1400,7 @@
         <w:rPr/>
         <w:t xml:space="preserve"> and </w:t>
       </w:r>
-      <w:hyperlink r:id="rId6">
+      <w:hyperlink r:id="rId8">
         <w:r>
           <w:rPr>
             <w:color w:val="175C91"/>
@@ -1216,7 +1413,7 @@
         <w:rPr/>
         <w:t xml:space="preserve"> supply the bounded correctness basis. The </w:t>
       </w:r>
-      <w:hyperlink r:id="rId7">
+      <w:hyperlink r:id="rId9">
         <w:r>
           <w:rPr>
             <w:color w:val="175C91"/>
@@ -1439,7 +1636,7 @@
         <w:rPr/>
         <w:t xml:space="preserve">14 September 2026 clarification following the native-internals review: retain D1, B, D4 and D5. The hand-built copying collector establishes its recorded mechanisms; it does not select the production collector algorithm or qualify all native object semantics. The initial non-generational collector still owes moved-key/hash-cache correctness and separate dispositions for weak objects and GCTWA. The non-generational choice justifies omitting classified generational bookkeeping, not other store semantics. B does not eliminate roots outside the argument stack, and cooperative suspension requires complete publication at every collecting transition. The </w:t>
       </w:r>
-      <w:hyperlink r:id="rId8">
+      <w:hyperlink r:id="rId10">
         <w:r>
           <w:rPr>
             <w:color w:val="175C91"/>
@@ -1707,7 +1904,7 @@
         <w:rPr/>
         <w:t xml:space="preserve">The integrated fixture exposed two lifetime defects (original failures r3 and r6). Claude’s external audit then exposed an exceptional return that left an idle Worker RUNNING (original failure r9). These findings amend protocol v1; the </w:t>
       </w:r>
-      <w:hyperlink r:id="rId9">
+      <w:hyperlink r:id="rId11">
         <w:r>
           <w:rPr>
             <w:color w:val="175C91"/>
@@ -1720,7 +1917,7 @@
         <w:rPr/>
         <w:t xml:space="preserve"> retains the originals and the </w:t>
       </w:r>
-      <w:hyperlink r:id="rId10">
+      <w:hyperlink r:id="rId12">
         <w:r>
           <w:rPr>
             <w:color w:val="175C91"/>
@@ -2291,7 +2488,7 @@
         <w:rPr/>
         <w:t xml:space="preserve">This record supplies an edit-site plan, not a prepared executable patch. The actual patch must identify its path, revision and digest, attach the baseline comparison recipe, and produce native FASL/behavior and evaluated acode-ID/flag comparisons after application. Preserve Gate 0 and ARM64 same-host results at their original evidence scope; the user retired the separate second-host test on 2026-09-13 (see </w:t>
       </w:r>
-      <w:hyperlink r:id="rId11">
+      <w:hyperlink r:id="rId13">
         <w:r>
           <w:rPr>
             <w:color w:val="175C91"/>
@@ -2349,7 +2546,7 @@
         <w:rPr/>
         <w:t xml:space="preserve">Use S&lt;stage&gt;-LL&lt;nn&gt;-&lt;letter&gt; with an evidence kind and pinned test revision. The JSON inventory lists mandatory IDs, profile/candidate variants, assertions and prerequisites for each experiment phase. The </w:t>
       </w:r>
-      <w:hyperlink r:id="rId12">
+      <w:hyperlink r:id="rId14">
         <w:r>
           <w:rPr>
             <w:color w:val="175C91"/>
@@ -2932,7 +3129,7 @@
         <w:rPr/>
         <w:t xml:space="preserve">[1] x8632 architecture data and execution layouts Tag constants, widths, canonical NIL/T, cons ordering and native execution-layout exceptions. </w:t>
       </w:r>
-      <w:hyperlink r:id="rId13">
+      <w:hyperlink r:id="rId15">
         <w:r>
           <w:rPr>
             <w:color w:val="175C91"/>
@@ -2947,7 +3144,7 @@
         <w:rPr/>
         <w:t xml:space="preserve">[2] C cons layout and accessors CDR then CAR in struct cons; untagged field access. Constructor order is a separate Lisp contract. </w:t>
       </w:r>
-      <w:hyperlink r:id="rId14">
+      <w:hyperlink r:id="rId16">
         <w:r>
           <w:rPr>
             <w:color w:val="175C91"/>
@@ -2960,7 +3157,7 @@
         <w:rPr/>
         <w:t xml:space="preserve"> · </w:t>
       </w:r>
-      <w:hyperlink r:id="rId15">
+      <w:hyperlink r:id="rId17">
         <w:r>
           <w:rPr>
             <w:color w:val="175C91"/>
@@ -2975,7 +3172,7 @@
         <w:rPr/>
         <w:t xml:space="preserve">[3] 32-bit cross-loader and ARM comparison Cross-loading precedent and alternative fulltags; no adoption of native architecture conditionals by implication. </w:t>
       </w:r>
-      <w:hyperlink r:id="rId16">
+      <w:hyperlink r:id="rId18">
         <w:r>
           <w:rPr>
             <w:color w:val="175C91"/>
@@ -2988,7 +3185,7 @@
         <w:rPr/>
         <w:t xml:space="preserve"> · </w:t>
       </w:r>
-      <w:hyperlink r:id="rId17">
+      <w:hyperlink r:id="rId19">
         <w:r>
           <w:rPr>
             <w:color w:val="175C91"/>
@@ -3003,7 +3200,7 @@
         <w:rPr/>
         <w:t xml:space="preserve">[4] WebAssembly core: memory instructions Address arithmetic and nonnegative memarg offsets. Engine optimization costs are not specified. </w:t>
       </w:r>
-      <w:hyperlink r:id="rId18">
+      <w:hyperlink r:id="rId20">
         <w:r>
           <w:rPr>
             <w:color w:val="175C91"/>
@@ -3018,7 +3215,7 @@
         <w:rPr/>
         <w:t xml:space="preserve">[5] WebAssembly memory limits encoding The admitted wasm32 explicit-maximum unshared/shared encodings; exact transforms require validation. </w:t>
       </w:r>
-      <w:hyperlink r:id="rId19">
+      <w:hyperlink r:id="rId21">
         <w:r>
           <w:rPr>
             <w:color w:val="175C91"/>
@@ -3033,290 +3230,290 @@
         <w:rPr/>
         <w:t xml:space="preserve">[6] WebAssembly threads Atomic access, wait/notify distinctions, shared-memory initialization and the host-facing synchronization basis. </w:t>
       </w:r>
+      <w:hyperlink r:id="rId22">
+        <w:r>
+          <w:rPr>
+            <w:color w:val="175C91"/>
+            <w:u w:val="single"/>
+          </w:rPr>
+          <w:t xml:space="preserve">Threads overview</w:t>
+        </w:r>
+      </w:hyperlink>
+    </w:p>
+    <w:p>
+      <w:r>
+        <w:rPr/>
+        <w:t xml:space="preserve">[7] WebAssembly tail calls and multiple results Tail transfers use the callee signature and compatible result types; linear-memory Lisp-stack ownership remains an implementation contract. </w:t>
+      </w:r>
+      <w:hyperlink r:id="rId23">
+        <w:r>
+          <w:rPr>
+            <w:color w:val="175C91"/>
+            <w:u w:val="single"/>
+          </w:rPr>
+          <w:t xml:space="preserve">Tail-call overview</w:t>
+        </w:r>
+      </w:hyperlink>
+      <w:r>
+        <w:rPr/>
+        <w:t xml:space="preserve"> · </w:t>
+      </w:r>
       <w:hyperlink r:id="rId20">
         <w:r>
           <w:rPr>
             <w:color w:val="175C91"/>
             <w:u w:val="single"/>
           </w:rPr>
-          <w:t xml:space="preserve">Threads overview</w:t>
-        </w:r>
-      </w:hyperlink>
-    </w:p>
-    <w:p>
-      <w:r>
-        <w:rPr/>
-        <w:t xml:space="preserve">[7] WebAssembly tail calls and multiple results Tail transfers use the callee signature and compatible result types; linear-memory Lisp-stack ownership remains an implementation contract. </w:t>
-      </w:r>
-      <w:hyperlink r:id="rId21">
-        <w:r>
-          <w:rPr>
-            <w:color w:val="175C91"/>
-            <w:u w:val="single"/>
-          </w:rPr>
-          <w:t xml:space="preserve">Tail-call overview</w:t>
+          <w:t xml:space="preserve">Core validation</w:t>
+        </w:r>
+      </w:hyperlink>
+    </w:p>
+    <w:p>
+      <w:r>
+        <w:rPr/>
+        <w:t xml:space="preserve">[8] CCL backend and native pass 2 Native argument-register conventions are comparison evidence, not a Wasm parameter limit. </w:t>
+      </w:r>
+      <w:hyperlink r:id="rId24">
+        <w:r>
+          <w:rPr>
+            <w:color w:val="175C91"/>
+            <w:u w:val="single"/>
+          </w:rPr>
+          <w:t xml:space="preserve">backend.lisp</w:t>
         </w:r>
       </w:hyperlink>
       <w:r>
         <w:rPr/>
         <w:t xml:space="preserve"> · </w:t>
       </w:r>
-      <w:hyperlink r:id="rId18">
-        <w:r>
-          <w:rPr>
-            <w:color w:val="175C91"/>
-            <w:u w:val="single"/>
-          </w:rPr>
-          <w:t xml:space="preserve">Core validation</w:t>
-        </w:r>
-      </w:hyperlink>
-    </w:p>
-    <w:p>
-      <w:r>
-        <w:rPr/>
-        <w:t xml:space="preserve">[8] CCL backend and native pass 2 Native argument-register conventions are comparison evidence, not a Wasm parameter limit. </w:t>
-      </w:r>
-      <w:hyperlink r:id="rId22">
-        <w:r>
-          <w:rPr>
-            <w:color w:val="175C91"/>
-            <w:u w:val="single"/>
-          </w:rPr>
-          <w:t xml:space="preserve">backend.lisp</w:t>
+      <w:hyperlink r:id="rId25">
+        <w:r>
+          <w:rPr>
+            <w:color w:val="175C91"/>
+            <w:u w:val="single"/>
+          </w:rPr>
+          <w:t xml:space="preserve">x862.lisp</w:t>
+        </w:r>
+      </w:hyperlink>
+    </w:p>
+    <w:p>
+      <w:r>
+        <w:rPr/>
+        <w:t xml:space="preserve">[9] LLVM WebAssembly linker Import/export and memory/table options; signature-mismatch warnings and trapping stubs; strict link policy. </w:t>
+      </w:r>
+      <w:hyperlink r:id="rId26">
+        <w:r>
+          <w:rPr>
+            <w:color w:val="175C91"/>
+            <w:u w:val="single"/>
+          </w:rPr>
+          <w:t xml:space="preserve">LLD WebAssembly documentation</w:t>
+        </w:r>
+      </w:hyperlink>
+    </w:p>
+    <w:p>
+      <w:pPr>
+        <w:pStyle w:val="Heading1"/>
+      </w:pPr>
+      <w:r>
+        <w:rPr/>
+        <w:t xml:space="preserve">REFERENCES  /  CONTINUED</w:t>
+      </w:r>
+    </w:p>
+    <w:p>
+      <w:pPr>
+        <w:pStyle w:val="Heading2"/>
+      </w:pPr>
+      <w:r>
+        <w:rPr/>
+        <w:t xml:space="preserve">Kernel, ABI and project-document sources</w:t>
+      </w:r>
+    </w:p>
+    <w:p>
+      <w:r>
+        <w:rPr/>
+        <w:t xml:space="preserve">[10] Kernel adaptation and exact imports Portable and architecture-specific collector work must be audited together; imports.s is the exact census source. </w:t>
+      </w:r>
+      <w:hyperlink r:id="rId27">
+        <w:r>
+          <w:rPr>
+            <w:color w:val="175C91"/>
+            <w:u w:val="single"/>
+          </w:rPr>
+          <w:t xml:space="preserve">gc-common.c</w:t>
         </w:r>
       </w:hyperlink>
       <w:r>
         <w:rPr/>
         <w:t xml:space="preserve"> · </w:t>
       </w:r>
-      <w:hyperlink r:id="rId23">
-        <w:r>
-          <w:rPr>
-            <w:color w:val="175C91"/>
-            <w:u w:val="single"/>
-          </w:rPr>
-          <w:t xml:space="preserve">x862.lisp</w:t>
-        </w:r>
-      </w:hyperlink>
-    </w:p>
-    <w:p>
-      <w:r>
-        <w:rPr/>
-        <w:t xml:space="preserve">[9] LLVM WebAssembly linker Import/export and memory/table options; signature-mismatch warnings and trapping stubs; strict link policy. </w:t>
-      </w:r>
-      <w:hyperlink r:id="rId24">
-        <w:r>
-          <w:rPr>
-            <w:color w:val="175C91"/>
-            <w:u w:val="single"/>
-          </w:rPr>
-          <w:t xml:space="preserve">LLD WebAssembly documentation</w:t>
-        </w:r>
-      </w:hyperlink>
-    </w:p>
-    <w:p>
-      <w:pPr>
-        <w:pStyle w:val="Heading1"/>
-      </w:pPr>
-      <w:r>
-        <w:rPr/>
-        <w:t xml:space="preserve">REFERENCES  /  CONTINUED</w:t>
-      </w:r>
-    </w:p>
-    <w:p>
-      <w:pPr>
-        <w:pStyle w:val="Heading2"/>
-      </w:pPr>
-      <w:r>
-        <w:rPr/>
-        <w:t xml:space="preserve">Kernel, ABI and project-document sources</w:t>
-      </w:r>
-    </w:p>
-    <w:p>
-      <w:r>
-        <w:rPr/>
-        <w:t xml:space="preserve">[10] Kernel adaptation and exact imports Portable and architecture-specific collector work must be audited together; imports.s is the exact census source. </w:t>
-      </w:r>
-      <w:hyperlink r:id="rId25">
-        <w:r>
-          <w:rPr>
-            <w:color w:val="175C91"/>
-            <w:u w:val="single"/>
-          </w:rPr>
-          <w:t xml:space="preserve">gc-common.c</w:t>
+      <w:hyperlink r:id="rId28">
+        <w:r>
+          <w:rPr>
+            <w:color w:val="175C91"/>
+            <w:u w:val="single"/>
+          </w:rPr>
+          <w:t xml:space="preserve">x86-gc.c</w:t>
         </w:r>
       </w:hyperlink>
       <w:r>
         <w:rPr/>
         <w:t xml:space="preserve"> · </w:t>
       </w:r>
-      <w:hyperlink r:id="rId26">
-        <w:r>
-          <w:rPr>
-            <w:color w:val="175C91"/>
-            <w:u w:val="single"/>
-          </w:rPr>
-          <w:t xml:space="preserve">x86-gc.c</w:t>
+      <w:hyperlink r:id="rId29">
+        <w:r>
+          <w:rPr>
+            <w:color w:val="175C91"/>
+            <w:u w:val="single"/>
+          </w:rPr>
+          <w:t xml:space="preserve">image.c</w:t>
         </w:r>
       </w:hyperlink>
       <w:r>
         <w:rPr/>
         <w:t xml:space="preserve"> · </w:t>
       </w:r>
-      <w:hyperlink r:id="rId27">
-        <w:r>
-          <w:rPr>
-            <w:color w:val="175C91"/>
-            <w:u w:val="single"/>
-          </w:rPr>
-          <w:t xml:space="preserve">image.c</w:t>
+      <w:hyperlink r:id="rId30">
+        <w:r>
+          <w:rPr>
+            <w:color w:val="175C91"/>
+            <w:u w:val="single"/>
+          </w:rPr>
+          <w:t xml:space="preserve">memory.c</w:t>
         </w:r>
       </w:hyperlink>
       <w:r>
         <w:rPr/>
         <w:t xml:space="preserve"> · </w:t>
       </w:r>
-      <w:hyperlink r:id="rId28">
-        <w:r>
-          <w:rPr>
-            <w:color w:val="175C91"/>
-            <w:u w:val="single"/>
-          </w:rPr>
-          <w:t xml:space="preserve">memory.c</w:t>
+      <w:hyperlink r:id="rId31">
+        <w:r>
+          <w:rPr>
+            <w:color w:val="175C91"/>
+            <w:u w:val="single"/>
+          </w:rPr>
+          <w:t xml:space="preserve">thread_manager.c</w:t>
         </w:r>
       </w:hyperlink>
       <w:r>
         <w:rPr/>
         <w:t xml:space="preserve"> · </w:t>
       </w:r>
-      <w:hyperlink r:id="rId29">
-        <w:r>
-          <w:rPr>
-            <w:color w:val="175C91"/>
-            <w:u w:val="single"/>
-          </w:rPr>
-          <w:t xml:space="preserve">thread_manager.c</w:t>
+      <w:hyperlink r:id="rId32">
+        <w:r>
+          <w:rPr>
+            <w:color w:val="175C91"/>
+            <w:u w:val="single"/>
+          </w:rPr>
+          <w:t xml:space="preserve">imports.s</w:t>
+        </w:r>
+      </w:hyperlink>
+    </w:p>
+    <w:p>
+      <w:r>
+        <w:rPr/>
+        <w:t xml:space="preserve">[11] Native trap/check lowering inventory Previously recorded x86-64 UUO/check occurrences remain a worklist to reconcile with evaluated census records. </w:t>
+      </w:r>
+      <w:hyperlink r:id="rId33">
+        <w:r>
+          <w:rPr>
+            <w:color w:val="175C91"/>
+            <w:u w:val="single"/>
+          </w:rPr>
+          <w:t xml:space="preserve">x8664-vinsns.lisp</w:t>
+        </w:r>
+      </w:hyperlink>
+    </w:p>
+    <w:p>
+      <w:r>
+        <w:rPr/>
+        <w:t xml:space="preserve">[12] WebAssembly heterogeneous function tables and call-site types Core control instructions and call_indirect / return_call_indirect validation. A static expected type belongs to the call site; incompatible table entries trap before entry. </w:t>
+      </w:r>
+      <w:hyperlink r:id="rId34">
+        <w:r>
+          <w:rPr>
+            <w:color w:val="175C91"/>
+            <w:u w:val="single"/>
+          </w:rPr>
+          <w:t xml:space="preserve">Core: control instructions</w:t>
         </w:r>
       </w:hyperlink>
       <w:r>
         <w:rPr/>
         <w:t xml:space="preserve"> · </w:t>
       </w:r>
-      <w:hyperlink r:id="rId30">
-        <w:r>
-          <w:rPr>
-            <w:color w:val="175C91"/>
-            <w:u w:val="single"/>
-          </w:rPr>
-          <w:t xml:space="preserve">imports.s</w:t>
-        </w:r>
-      </w:hyperlink>
-    </w:p>
-    <w:p>
-      <w:r>
-        <w:rPr/>
-        <w:t xml:space="preserve">[11] Native trap/check lowering inventory Previously recorded x86-64 UUO/check occurrences remain a worklist to reconcile with evaluated census records. </w:t>
-      </w:r>
-      <w:hyperlink r:id="rId31">
-        <w:r>
-          <w:rPr>
-            <w:color w:val="175C91"/>
-            <w:u w:val="single"/>
-          </w:rPr>
-          <w:t xml:space="preserve">x8664-vinsns.lisp</w:t>
-        </w:r>
-      </w:hyperlink>
-    </w:p>
-    <w:p>
-      <w:r>
-        <w:rPr/>
-        <w:t xml:space="preserve">[12] WebAssembly heterogeneous function tables and call-site types Core control instructions and call_indirect / return_call_indirect validation. A static expected type belongs to the call site; incompatible table entries trap before entry. </w:t>
-      </w:r>
-      <w:hyperlink r:id="rId32">
-        <w:r>
-          <w:rPr>
-            <w:color w:val="175C91"/>
-            <w:u w:val="single"/>
-          </w:rPr>
-          <w:t xml:space="preserve">Core: control instructions</w:t>
+      <w:hyperlink r:id="rId20">
+        <w:r>
+          <w:rPr>
+            <w:color w:val="175C91"/>
+            <w:u w:val="single"/>
+          </w:rPr>
+          <w:t xml:space="preserve">Core: validation and execution</w:t>
+        </w:r>
+      </w:hyperlink>
+    </w:p>
+    <w:p>
+      <w:r>
+        <w:rPr/>
+        <w:t xml:space="preserve">[13] WebAssembly Basic C ABI Scalar versus aggregate parameter/result passing; address-taken locals and the linear C stack. </w:t>
+      </w:r>
+      <w:hyperlink r:id="rId35">
+        <w:r>
+          <w:rPr>
+            <w:color w:val="175C91"/>
+            <w:u w:val="single"/>
+          </w:rPr>
+          <w:t xml:space="preserve">BasicCABI.md</w:t>
+        </w:r>
+      </w:hyperlink>
+    </w:p>
+    <w:p>
+      <w:r>
+        <w:rPr/>
+        <w:t xml:space="preserve">[14] WebAssembly linking conventions Process-once initialization with passive segments and per-thread storage conventions; verify the actual linked output. </w:t>
+      </w:r>
+      <w:hyperlink r:id="rId36">
+        <w:r>
+          <w:rPr>
+            <w:color w:val="175C91"/>
+            <w:u w:val="single"/>
+          </w:rPr>
+          <w:t xml:space="preserve">Linking.md</w:t>
+        </w:r>
+      </w:hyperlink>
+    </w:p>
+    <w:p>
+      <w:r>
+        <w:rPr/>
+        <w:t xml:space="preserve">[15] Common Lisp ordinary lambda lists and calls Required, optional, rest and keyword arguments; FUNCALL/APPLY semantics. A supplied count does not determine callee convention. </w:t>
+      </w:r>
+      <w:hyperlink r:id="rId37">
+        <w:r>
+          <w:rPr>
+            <w:color w:val="175C91"/>
+            <w:u w:val="single"/>
+          </w:rPr>
+          <w:t xml:space="preserve">Lambda lists</w:t>
         </w:r>
       </w:hyperlink>
       <w:r>
         <w:rPr/>
         <w:t xml:space="preserve"> · </w:t>
       </w:r>
-      <w:hyperlink r:id="rId18">
-        <w:r>
-          <w:rPr>
-            <w:color w:val="175C91"/>
-            <w:u w:val="single"/>
-          </w:rPr>
-          <w:t xml:space="preserve">Core: validation and execution</w:t>
-        </w:r>
-      </w:hyperlink>
-    </w:p>
-    <w:p>
-      <w:r>
-        <w:rPr/>
-        <w:t xml:space="preserve">[13] WebAssembly Basic C ABI Scalar versus aggregate parameter/result passing; address-taken locals and the linear C stack. </w:t>
-      </w:r>
-      <w:hyperlink r:id="rId33">
-        <w:r>
-          <w:rPr>
-            <w:color w:val="175C91"/>
-            <w:u w:val="single"/>
-          </w:rPr>
-          <w:t xml:space="preserve">BasicCABI.md</w:t>
-        </w:r>
-      </w:hyperlink>
-    </w:p>
-    <w:p>
-      <w:r>
-        <w:rPr/>
-        <w:t xml:space="preserve">[14] WebAssembly linking conventions Process-once initialization with passive segments and per-thread storage conventions; verify the actual linked output. </w:t>
-      </w:r>
-      <w:hyperlink r:id="rId34">
-        <w:r>
-          <w:rPr>
-            <w:color w:val="175C91"/>
-            <w:u w:val="single"/>
-          </w:rPr>
-          <w:t xml:space="preserve">Linking.md</w:t>
-        </w:r>
-      </w:hyperlink>
-    </w:p>
-    <w:p>
-      <w:r>
-        <w:rPr/>
-        <w:t xml:space="preserve">[15] Common Lisp ordinary lambda lists and calls Required, optional, rest and keyword arguments; FUNCALL/APPLY semantics. A supplied count does not determine callee convention. </w:t>
-      </w:r>
-      <w:hyperlink r:id="rId35">
-        <w:r>
-          <w:rPr>
-            <w:color w:val="175C91"/>
-            <w:u w:val="single"/>
-          </w:rPr>
-          <w:t xml:space="preserve">Lambda lists</w:t>
+      <w:hyperlink r:id="rId38">
+        <w:r>
+          <w:rPr>
+            <w:color w:val="175C91"/>
+            <w:u w:val="single"/>
+          </w:rPr>
+          <w:t xml:space="preserve">FUNCALL</w:t>
         </w:r>
       </w:hyperlink>
       <w:r>
         <w:rPr/>
         <w:t xml:space="preserve"> · </w:t>
       </w:r>
-      <w:hyperlink r:id="rId36">
-        <w:r>
-          <w:rPr>
-            <w:color w:val="175C91"/>
-            <w:u w:val="single"/>
-          </w:rPr>
-          <w:t xml:space="preserve">FUNCALL</w:t>
-        </w:r>
-      </w:hyperlink>
-      <w:r>
-        <w:rPr/>
-        <w:t xml:space="preserve"> · </w:t>
-      </w:r>
-      <w:hyperlink r:id="rId37">
+      <w:hyperlink r:id="rId39">
         <w:r>
           <w:rPr>
             <w:color w:val="175C91"/>
@@ -3331,7 +3528,7 @@
         <w:rPr/>
         <w:t xml:space="preserve">[16] WebAssembly numeric semantics Floating-point operation and operand cases; result classification alone is not a CCL condition policy. </w:t>
       </w:r>
-      <w:hyperlink r:id="rId38">
+      <w:hyperlink r:id="rId40">
         <w:r>
           <w:rPr>
             <w:color w:val="175C91"/>

</xml_diff>

<commit_message>
Accept and integrate reviewed stream constructors; start namespace sequence
</commit_message>
<xml_diff>
--- a/doc/WASM/CCL_WebAssembly_Stage0_Desk_Decisions_v1_8.docx
+++ b/doc/WASM/CCL_WebAssembly_Stage0_Desk_Decisions_v1_8.docx
@@ -3569,6 +3569,246 @@
       <w:r>
         <w:rPr/>
         <w:t xml:space="preserve">The complete original v0.12/v1.2/v1.3 input files and their SHA-256 digests are retained in history/2026-09-11-inputs and history/inputs.json. That preserved v1.3 decision record contains the earlier v0.11/v1.1/v1.2 input hashes. New DOCX reading copies are generated from the current Markdown; tools/manage.py checks both source and generated identities.</w:t>
+      </w:r>
+    </w:p>
+    <w:p>
+      <w:pPr>
+        <w:pStyle w:val="Heading1"/>
+      </w:pPr>
+      <w:r>
+        <w:rPr/>
+        <w:t xml:space="preserve">24 September 2026 — READY image decision amended: a cross-loaded boot replaces projection</w:t>
+      </w:r>
+    </w:p>
+    <w:p>
+      <w:r>
+        <w:rPr/>
+        <w:t xml:space="preserve">After audit 174's stopping-rule verdict on the projected READY image, the</w:t>
+      </w:r>
+    </w:p>
+    <w:p>
+      <w:r>
+        <w:rPr/>
+        <w:t xml:space="preserve">user directed the move to the namespace and loader ("CODEX is going to work</w:t>
+      </w:r>
+    </w:p>
+    <w:p>
+      <w:r>
+        <w:rPr/>
+        <w:t xml:space="preserve">on the stream constructor, and then we will adopt your proposal and move to</w:t>
+      </w:r>
+    </w:p>
+    <w:p>
+      <w:r>
+        <w:rPr/>
+        <w:t xml:space="preserve">namespaces"), asked for a plan (</w:t>
+      </w:r>
+      <w:hyperlink r:id="rId41">
+        <w:r>
+          <w:rPr>
+            <w:color w:val="175C91"/>
+            <w:u w:val="single"/>
+          </w:rPr>
+          <w:t xml:space="preserve">NSL-P1</w:t>
+        </w:r>
+      </w:hyperlink>
+      <w:r>
+        <w:rPr/>
+        <w:t xml:space="preserve">),</w:t>
+      </w:r>
+    </w:p>
+    <w:p>
+      <w:r>
+        <w:rPr/>
+        <w:t xml:space="preserve">had Codex review it (</w:t>
+      </w:r>
+      <w:hyperlink r:id="rId42">
+        <w:r>
+          <w:rPr>
+            <w:color w:val="175C91"/>
+            <w:u w:val="single"/>
+          </w:rPr>
+          <w:t xml:space="preserve">response</w:t>
+        </w:r>
+      </w:hyperlink>
+      <w:r>
+        <w:rPr/>
+        <w:t xml:space="preserve">), and</w:t>
+      </w:r>
+    </w:p>
+    <w:p>
+      <w:r>
+        <w:rPr/>
+        <w:t xml:space="preserve">then answered the plan's Q-A: "Yes to QA. Make the change and write NSL-P2 on</w:t>
+      </w:r>
+    </w:p>
+    <w:p>
+      <w:r>
+        <w:rPr/>
+        <w:t xml:space="preserve">the plan branch folding in Codex's amendments."</w:t>
+      </w:r>
+    </w:p>
+    <w:p>
+      <w:r>
+        <w:rPr/>
+        <w:t xml:space="preserve">1. </w:t>
+      </w:r>
+      <w:r>
+        <w:rPr>
+          <w:b/>
+        </w:rPr>
+        <w:t xml:space="preserve">Image.</w:t>
+      </w:r>
+      <w:r>
+        <w:rPr/>
+        <w:t xml:space="preserve"> </w:t>
+      </w:r>
+      <w:r>
+        <w:rPr>
+          <w:rFonts w:ascii="Consolas" w:hAnsi="Consolas"/>
+        </w:rPr>
+        <w:t xml:space="preserve">decisions.image</w:t>
+      </w:r>
+      <w:r>
+        <w:rPr/>
+        <w:t xml:space="preserve"> of</w:t>
+      </w:r>
+    </w:p>
+    <w:p>
+      <w:r>
+        <w:rPr/>
+        <w:t xml:space="preserve">   </w:t>
+      </w:r>
+      <w:hyperlink r:id="rId43">
+        <w:r>
+          <w:rPr>
+            <w:color w:val="175C91"/>
+            <w:u w:val="single"/>
+          </w:rPr>
+          <w:t xml:space="preserve">stage1/ready-decision.json</w:t>
+        </w:r>
+      </w:hyperlink>
+      <w:r>
+        <w:rPr/>
+        <w:t xml:space="preserve"> now reads that</w:t>
+      </w:r>
+    </w:p>
+    <w:p>
+      <w:r>
+        <w:rPr/>
+        <w:t xml:space="preserve">   READY is reached by cross-loading level-0 into the bootstrap heap and</w:t>
+      </w:r>
+    </w:p>
+    <w:p>
+      <w:r>
+        <w:rPr/>
+        <w:t xml:space="preserve">   code set and loading level-1 as precompiled bundles through the read-only</w:t>
+      </w:r>
+    </w:p>
+    <w:p>
+      <w:r>
+        <w:rPr/>
+        <w:t xml:space="preserve">   namespace, with CLOS built on the target by loading its files. The</w:t>
+      </w:r>
+    </w:p>
+    <w:p>
+      <w:r>
+        <w:rPr/>
+        <w:t xml:space="preserve">   original sentence (projection of the pinned native image; CLOS from</w:t>
+      </w:r>
+    </w:p>
+    <w:p>
+      <w:r>
+        <w:rPr/>
+        <w:t xml:space="preserve">   source as Stage 2 work) is preserved in </w:t>
+      </w:r>
+      <w:r>
+        <w:rPr>
+          <w:rFonts w:ascii="Consolas" w:hAnsi="Consolas"/>
+        </w:rPr>
+        <w:t xml:space="preserve">amendments[0].superseded</w:t>
+      </w:r>
+      <w:r>
+        <w:rPr/>
+        <w:t xml:space="preserve">.</w:t>
+      </w:r>
+    </w:p>
+    <w:p>
+      <w:r>
+        <w:rPr/>
+        <w:t xml:space="preserve">2. </w:t>
+      </w:r>
+      <w:r>
+        <w:rPr>
+          <w:b/>
+        </w:rPr>
+        <w:t xml:space="preserve">Sequencing.</w:t>
+      </w:r>
+      <w:r>
+        <w:rPr/>
+        <w:t xml:space="preserve"> </w:t>
+      </w:r>
+      <w:r>
+        <w:rPr>
+          <w:rFonts w:ascii="Consolas" w:hAnsi="Consolas"/>
+        </w:rPr>
+        <w:t xml:space="preserve">decisions.sequencing</w:t>
+      </w:r>
+      <w:r>
+        <w:rPr/>
+        <w:t xml:space="preserve"> now points at S1-NAMESPACE-a and</w:t>
+      </w:r>
+    </w:p>
+    <w:p>
+      <w:r>
+        <w:rPr/>
+        <w:t xml:space="preserve">   the NSL packets; no further projection growth for its own sake.</w:t>
+      </w:r>
+    </w:p>
+    <w:p>
+      <w:r>
+        <w:rPr/>
+        <w:t xml:space="preserve">3. </w:t>
+      </w:r>
+      <w:r>
+        <w:rPr>
+          <w:b/>
+        </w:rPr>
+        <w:t xml:space="preserve">Unchanged.</w:t>
+      </w:r>
+      <w:r>
+        <w:rPr/>
+        <w:t xml:space="preserve"> Coverage counting and the 25-replacement cap, class-mode</w:t>
+      </w:r>
+    </w:p>
+    <w:p>
+      <w:r>
+        <w:rPr/>
+        <w:t xml:space="preserve">   conditions, one Worker with the scheduler disabled, uncached dispatch,</w:t>
+      </w:r>
+    </w:p>
+    <w:p>
+      <w:r>
+        <w:rPr/>
+        <w:t xml:space="preserve">   the executed-original regression floor (now 568 / 531 accepted), the</w:t>
+      </w:r>
+    </w:p>
+    <w:p>
+      <w:r>
+        <w:rPr/>
+        <w:t xml:space="preserve">   inventory and every accepted record.</w:t>
+      </w:r>
+    </w:p>
+    <w:p>
+      <w:r>
+        <w:rPr/>
+        <w:t xml:space="preserve">The amendment is entered by Claude on the user's instruction, on the plan</w:t>
+      </w:r>
+    </w:p>
+    <w:p>
+      <w:r>
+        <w:rPr/>
+        <w:t xml:space="preserve">branch, for Codex to import with NSL-P2; nothing else in this file changes.</w:t>
       </w:r>
     </w:p>
     <w:sectPr>

</xml_diff>

<commit_message>
Adopt HOSTFM P2 with post-boot1 foreign interface milestone
</commit_message>
<xml_diff>
--- a/doc/WASM/CCL_WebAssembly_Stage0_Desk_Decisions_v1_8.docx
+++ b/doc/WASM/CCL_WebAssembly_Stage0_Desk_Decisions_v1_8.docx
@@ -41,6 +41,190 @@
       </w:pPr>
       <w:r>
         <w:rPr/>
+        <w:t xml:space="preserve">25 September 2026 — HOSTFM P2 adopted with amendments</w:t>
+      </w:r>
+    </w:p>
+    <w:p>
+      <w:r>
+        <w:rPr/>
+        <w:t xml:space="preserve">The user decided: "I accept the plan with your amendments. Proceed with loader</w:t>
+      </w:r>
+    </w:p>
+    <w:p>
+      <w:r>
+        <w:rPr/>
+        <w:t xml:space="preserve">work." </w:t>
+      </w:r>
+      <w:hyperlink r:id="rId2">
+        <w:r>
+          <w:rPr>
+            <w:color w:val="175C91"/>
+            <w:u w:val="single"/>
+          </w:rPr>
+          <w:t xml:space="preserve">HOSTFM-P2</w:t>
+        </w:r>
+      </w:hyperlink>
+    </w:p>
+    <w:p>
+      <w:r>
+        <w:rPr/>
+        <w:t xml:space="preserve">is adopted as architecture: one Lisp-visible host contract with browser and</w:t>
+      </w:r>
+    </w:p>
+    <w:p>
+      <w:r>
+        <w:rPr/>
+        <w:t xml:space="preserve">Node providers; explicit capability absence; owner-validated configuration;</w:t>
+      </w:r>
+    </w:p>
+    <w:p>
+      <w:r>
+        <w:rPr/>
+        <w:t xml:space="preserve">virtual namespace paths; interruptible mailbox services; consumer-bound startup</w:t>
+      </w:r>
+    </w:p>
+    <w:p>
+      <w:r>
+        <w:rPr/>
+        <w:t xml:space="preserve">dispositions; and separate-memory foreign Wasm modules under FM-1–FM-15.</w:t>
+      </w:r>
+    </w:p>
+    <w:p>
+      <w:r>
+        <w:rPr/>
+        <w:t xml:space="preserve">CAP-ffi-wasm's lower layer is scheduled in Stage 2, after successful NSL-4</w:t>
+      </w:r>
+    </w:p>
+    <w:p>
+      <w:r>
+        <w:rPr/>
+        <w:t xml:space="preserve">boot1 (the selected ordered level-1 load and required initializers complete),</w:t>
+      </w:r>
+    </w:p>
+    <w:p>
+      <w:r>
+        <w:rPr/>
+        <w:t xml:space="preserve">and its acceptance is required before Stage 3. Typed exports, explicit copying</w:t>
+      </w:r>
+    </w:p>
+    <w:p>
+      <w:r>
+        <w:rPr/>
+        <w:t xml:space="preserve">and allocation ownership, FOREIGN transitions around every foreign entry,</w:t>
+      </w:r>
+    </w:p>
+    <w:p>
+      <w:r>
+        <w:rPr/>
+        <w:t xml:space="preserve">callbacks, moving-GC preservation, trap containment and retirement are required</w:t>
+      </w:r>
+    </w:p>
+    <w:p>
+      <w:r>
+        <w:rPr/>
+        <w:t xml:space="preserve">under browser and Node providers. FMT-1–FMT-9 are the milestone's proof</w:t>
+      </w:r>
+    </w:p>
+    <w:p>
+      <w:r>
+        <w:rPr/>
+        <w:t xml:space="preserve">obligations. Higher-level CCL foreign syntax, generated layouts and database</w:t>
+      </w:r>
+    </w:p>
+    <w:p>
+      <w:r>
+        <w:rPr/>
+        <w:t xml:space="preserve">support follow demonstrated consumer requirements.</w:t>
+      </w:r>
+    </w:p>
+    <w:p>
+      <w:r>
+        <w:rPr/>
+        <w:t xml:space="preserve">Do not create a timeval representation without a live consumer. Node namespace</w:t>
+      </w:r>
+    </w:p>
+    <w:p>
+      <w:r>
+        <w:rPr/>
+        <w:t xml:space="preserve">and arguments may accompany loader work; complete stdio requires stream and</w:t>
+      </w:r>
+    </w:p>
+    <w:p>
+      <w:r>
+        <w:rPr/>
+        <w:t xml:space="preserve">LL20 suspension qualification in Stage 2 before interactive Stage 3. Current</w:t>
+      </w:r>
+    </w:p>
+    <w:p>
+      <w:r>
+        <w:rPr/>
+        <w:t xml:space="preserve">READY's absent </w:t>
+      </w:r>
+      <w:r>
+        <w:rPr>
+          <w:rFonts w:ascii="Consolas" w:hAnsi="Consolas"/>
+        </w:rPr>
+        <w:t xml:space="preserve">home:</w:t>
+      </w:r>
+      <w:r>
+        <w:rPr/>
+        <w:t xml:space="preserve"> capability remains explicit. Provider differences stay</w:t>
+      </w:r>
+    </w:p>
+    <w:p>
+      <w:r>
+        <w:rPr/>
+        <w:t xml:space="preserve">behind the semantic kernel-import contract and mailbox. The database and native</w:t>
+      </w:r>
+    </w:p>
+    <w:p>
+      <w:r>
+        <w:rPr/>
+        <w:t xml:space="preserve">counter-buffer proposals already withdrawn on 20 September remain withdrawn,</w:t>
+      </w:r>
+    </w:p>
+    <w:p>
+      <w:r>
+        <w:rPr/>
+        <w:t xml:space="preserve">with their evidence retained and consumer/no-live-handle obligations open.</w:t>
+      </w:r>
+    </w:p>
+    <w:p>
+      <w:r>
+        <w:rPr/>
+        <w:t xml:space="preserve">The existing callback classification manifest remains bound to the original</w:t>
+      </w:r>
+    </w:p>
+    <w:p>
+      <w:r>
+        <w:rPr/>
+        <w:t xml:space="preserve">selection; deferral does not close a bootstrap dependency.</w:t>
+      </w:r>
+    </w:p>
+    <w:p>
+      <w:r>
+        <w:rPr/>
+        <w:t xml:space="preserve">LOADER remains the immediate implementation work. This decision grants no new</w:t>
+      </w:r>
+    </w:p>
+    <w:p>
+      <w:r>
+        <w:rPr/>
+        <w:t xml:space="preserve">execution acceptance, source integration or gate credit; the disposable-U1,</w:t>
+      </w:r>
+    </w:p>
+    <w:p>
+      <w:r>
+        <w:rPr/>
+        <w:t xml:space="preserve">R6/R6a and independent-review workflow is unchanged.</w:t>
+      </w:r>
+    </w:p>
+    <w:p>
+      <w:pPr>
+        <w:pStyle w:val="Heading1"/>
+      </w:pPr>
+      <w:r>
+        <w:rPr/>
         <w:t xml:space="preserve">15 September 2026 — LL15 instrument qualification</w:t>
       </w:r>
     </w:p>
@@ -105,7 +289,7 @@
       </w:r>
     </w:p>
     <w:p>
-      <w:hyperlink r:id="rId2">
+      <w:hyperlink r:id="rId3">
         <w:r>
           <w:rPr>
             <w:color w:val="175C91"/>
@@ -203,7 +387,7 @@
         <w:rPr/>
         <w:t xml:space="preserve">computed by the detection rules in </w:t>
       </w:r>
-      <w:hyperlink r:id="rId3">
+      <w:hyperlink r:id="rId4">
         <w:r>
           <w:rPr>
             <w:color w:val="175C91"/>
@@ -307,7 +491,7 @@
         <w:rPr/>
         <w:t xml:space="preserve">   </w:t>
       </w:r>
-      <w:hyperlink r:id="rId4">
+      <w:hyperlink r:id="rId5">
         <w:r>
           <w:rPr>
             <w:color w:val="175C91"/>
@@ -344,7 +528,7 @@
         <w:rPr/>
         <w:t xml:space="preserve">   </w:t>
       </w:r>
-      <w:hyperlink r:id="rId5">
+      <w:hyperlink r:id="rId6">
         <w:r>
           <w:rPr>
             <w:color w:val="175C91"/>
@@ -1026,7 +1210,7 @@
         <w:rPr/>
         <w:t xml:space="preserve">The </w:t>
       </w:r>
-      <w:hyperlink r:id="rId6">
+      <w:hyperlink r:id="rId7">
         <w:r>
           <w:rPr>
             <w:color w:val="175C91"/>
@@ -1368,7 +1552,7 @@
         <w:rPr/>
         <w:t xml:space="preserve">Use B under the </w:t>
       </w:r>
-      <w:hyperlink r:id="rId6">
+      <w:hyperlink r:id="rId7">
         <w:r>
           <w:rPr>
             <w:color w:val="175C91"/>
@@ -1387,7 +1571,7 @@
         <w:rPr/>
         <w:t xml:space="preserve">The </w:t>
       </w:r>
-      <w:hyperlink r:id="rId7">
+      <w:hyperlink r:id="rId8">
         <w:r>
           <w:rPr>
             <w:color w:val="175C91"/>
@@ -1400,7 +1584,7 @@
         <w:rPr/>
         <w:t xml:space="preserve"> and </w:t>
       </w:r>
-      <w:hyperlink r:id="rId8">
+      <w:hyperlink r:id="rId9">
         <w:r>
           <w:rPr>
             <w:color w:val="175C91"/>
@@ -1413,7 +1597,7 @@
         <w:rPr/>
         <w:t xml:space="preserve"> supply the bounded correctness basis. The </w:t>
       </w:r>
-      <w:hyperlink r:id="rId9">
+      <w:hyperlink r:id="rId10">
         <w:r>
           <w:rPr>
             <w:color w:val="175C91"/>
@@ -1636,7 +1820,7 @@
         <w:rPr/>
         <w:t xml:space="preserve">14 September 2026 clarification following the native-internals review: retain D1, B, D4 and D5. The hand-built copying collector establishes its recorded mechanisms; it does not select the production collector algorithm or qualify all native object semantics. The initial non-generational collector still owes moved-key/hash-cache correctness and separate dispositions for weak objects and GCTWA. The non-generational choice justifies omitting classified generational bookkeeping, not other store semantics. B does not eliminate roots outside the argument stack, and cooperative suspension requires complete publication at every collecting transition. The </w:t>
       </w:r>
-      <w:hyperlink r:id="rId10">
+      <w:hyperlink r:id="rId11">
         <w:r>
           <w:rPr>
             <w:color w:val="175C91"/>
@@ -1904,7 +2088,7 @@
         <w:rPr/>
         <w:t xml:space="preserve">The integrated fixture exposed two lifetime defects (original failures r3 and r6). Claude’s external audit then exposed an exceptional return that left an idle Worker RUNNING (original failure r9). These findings amend protocol v1; the </w:t>
       </w:r>
-      <w:hyperlink r:id="rId11">
+      <w:hyperlink r:id="rId12">
         <w:r>
           <w:rPr>
             <w:color w:val="175C91"/>
@@ -1917,7 +2101,7 @@
         <w:rPr/>
         <w:t xml:space="preserve"> retains the originals and the </w:t>
       </w:r>
-      <w:hyperlink r:id="rId12">
+      <w:hyperlink r:id="rId13">
         <w:r>
           <w:rPr>
             <w:color w:val="175C91"/>
@@ -2488,7 +2672,7 @@
         <w:rPr/>
         <w:t xml:space="preserve">This record supplies an edit-site plan, not a prepared executable patch. The actual patch must identify its path, revision and digest, attach the baseline comparison recipe, and produce native FASL/behavior and evaluated acode-ID/flag comparisons after application. Preserve Gate 0 and ARM64 same-host results at their original evidence scope; the user retired the separate second-host test on 2026-09-13 (see </w:t>
       </w:r>
-      <w:hyperlink r:id="rId13">
+      <w:hyperlink r:id="rId14">
         <w:r>
           <w:rPr>
             <w:color w:val="175C91"/>
@@ -2546,7 +2730,7 @@
         <w:rPr/>
         <w:t xml:space="preserve">Use S&lt;stage&gt;-LL&lt;nn&gt;-&lt;letter&gt; with an evidence kind and pinned test revision. The JSON inventory lists mandatory IDs, profile/candidate variants, assertions and prerequisites for each experiment phase. The </w:t>
       </w:r>
-      <w:hyperlink r:id="rId14">
+      <w:hyperlink r:id="rId15">
         <w:r>
           <w:rPr>
             <w:color w:val="175C91"/>
@@ -3129,7 +3313,7 @@
         <w:rPr/>
         <w:t xml:space="preserve">[1] x8632 architecture data and execution layouts Tag constants, widths, canonical NIL/T, cons ordering and native execution-layout exceptions. </w:t>
       </w:r>
-      <w:hyperlink r:id="rId15">
+      <w:hyperlink r:id="rId16">
         <w:r>
           <w:rPr>
             <w:color w:val="175C91"/>
@@ -3144,7 +3328,7 @@
         <w:rPr/>
         <w:t xml:space="preserve">[2] C cons layout and accessors CDR then CAR in struct cons; untagged field access. Constructor order is a separate Lisp contract. </w:t>
       </w:r>
-      <w:hyperlink r:id="rId16">
+      <w:hyperlink r:id="rId17">
         <w:r>
           <w:rPr>
             <w:color w:val="175C91"/>
@@ -3157,7 +3341,7 @@
         <w:rPr/>
         <w:t xml:space="preserve"> · </w:t>
       </w:r>
-      <w:hyperlink r:id="rId17">
+      <w:hyperlink r:id="rId18">
         <w:r>
           <w:rPr>
             <w:color w:val="175C91"/>
@@ -3172,7 +3356,7 @@
         <w:rPr/>
         <w:t xml:space="preserve">[3] 32-bit cross-loader and ARM comparison Cross-loading precedent and alternative fulltags; no adoption of native architecture conditionals by implication. </w:t>
       </w:r>
-      <w:hyperlink r:id="rId18">
+      <w:hyperlink r:id="rId19">
         <w:r>
           <w:rPr>
             <w:color w:val="175C91"/>
@@ -3185,7 +3369,7 @@
         <w:rPr/>
         <w:t xml:space="preserve"> · </w:t>
       </w:r>
-      <w:hyperlink r:id="rId19">
+      <w:hyperlink r:id="rId20">
         <w:r>
           <w:rPr>
             <w:color w:val="175C91"/>
@@ -3200,7 +3384,7 @@
         <w:rPr/>
         <w:t xml:space="preserve">[4] WebAssembly core: memory instructions Address arithmetic and nonnegative memarg offsets. Engine optimization costs are not specified. </w:t>
       </w:r>
-      <w:hyperlink r:id="rId20">
+      <w:hyperlink r:id="rId21">
         <w:r>
           <w:rPr>
             <w:color w:val="175C91"/>
@@ -3215,101 +3399,361 @@
         <w:rPr/>
         <w:t xml:space="preserve">[5] WebAssembly memory limits encoding The admitted wasm32 explicit-maximum unshared/shared encodings; exact transforms require validation. </w:t>
       </w:r>
+      <w:hyperlink r:id="rId22">
+        <w:r>
+          <w:rPr>
+            <w:color w:val="175C91"/>
+            <w:u w:val="single"/>
+          </w:rPr>
+          <w:t xml:space="preserve">Threads: limits and memory types</w:t>
+        </w:r>
+      </w:hyperlink>
+    </w:p>
+    <w:p>
+      <w:r>
+        <w:rPr/>
+        <w:t xml:space="preserve">[6] WebAssembly threads Atomic access, wait/notify distinctions, shared-memory initialization and the host-facing synchronization basis. </w:t>
+      </w:r>
+      <w:hyperlink r:id="rId23">
+        <w:r>
+          <w:rPr>
+            <w:color w:val="175C91"/>
+            <w:u w:val="single"/>
+          </w:rPr>
+          <w:t xml:space="preserve">Threads overview</w:t>
+        </w:r>
+      </w:hyperlink>
+    </w:p>
+    <w:p>
+      <w:r>
+        <w:rPr/>
+        <w:t xml:space="preserve">[7] WebAssembly tail calls and multiple results Tail transfers use the callee signature and compatible result types; linear-memory Lisp-stack ownership remains an implementation contract. </w:t>
+      </w:r>
+      <w:hyperlink r:id="rId24">
+        <w:r>
+          <w:rPr>
+            <w:color w:val="175C91"/>
+            <w:u w:val="single"/>
+          </w:rPr>
+          <w:t xml:space="preserve">Tail-call overview</w:t>
+        </w:r>
+      </w:hyperlink>
+      <w:r>
+        <w:rPr/>
+        <w:t xml:space="preserve"> · </w:t>
+      </w:r>
       <w:hyperlink r:id="rId21">
         <w:r>
           <w:rPr>
             <w:color w:val="175C91"/>
             <w:u w:val="single"/>
           </w:rPr>
-          <w:t xml:space="preserve">Threads: limits and memory types</w:t>
-        </w:r>
-      </w:hyperlink>
-    </w:p>
-    <w:p>
-      <w:r>
-        <w:rPr/>
-        <w:t xml:space="preserve">[6] WebAssembly threads Atomic access, wait/notify distinctions, shared-memory initialization and the host-facing synchronization basis. </w:t>
-      </w:r>
-      <w:hyperlink r:id="rId22">
-        <w:r>
-          <w:rPr>
-            <w:color w:val="175C91"/>
-            <w:u w:val="single"/>
-          </w:rPr>
-          <w:t xml:space="preserve">Threads overview</w:t>
-        </w:r>
-      </w:hyperlink>
-    </w:p>
-    <w:p>
-      <w:r>
-        <w:rPr/>
-        <w:t xml:space="preserve">[7] WebAssembly tail calls and multiple results Tail transfers use the callee signature and compatible result types; linear-memory Lisp-stack ownership remains an implementation contract. </w:t>
-      </w:r>
-      <w:hyperlink r:id="rId23">
-        <w:r>
-          <w:rPr>
-            <w:color w:val="175C91"/>
-            <w:u w:val="single"/>
-          </w:rPr>
-          <w:t xml:space="preserve">Tail-call overview</w:t>
+          <w:t xml:space="preserve">Core validation</w:t>
+        </w:r>
+      </w:hyperlink>
+    </w:p>
+    <w:p>
+      <w:r>
+        <w:rPr/>
+        <w:t xml:space="preserve">[8] CCL backend and native pass 2 Native argument-register conventions are comparison evidence, not a Wasm parameter limit. </w:t>
+      </w:r>
+      <w:hyperlink r:id="rId25">
+        <w:r>
+          <w:rPr>
+            <w:color w:val="175C91"/>
+            <w:u w:val="single"/>
+          </w:rPr>
+          <w:t xml:space="preserve">backend.lisp</w:t>
         </w:r>
       </w:hyperlink>
       <w:r>
         <w:rPr/>
         <w:t xml:space="preserve"> · </w:t>
       </w:r>
-      <w:hyperlink r:id="rId20">
-        <w:r>
-          <w:rPr>
-            <w:color w:val="175C91"/>
-            <w:u w:val="single"/>
-          </w:rPr>
-          <w:t xml:space="preserve">Core validation</w:t>
-        </w:r>
-      </w:hyperlink>
-    </w:p>
-    <w:p>
-      <w:r>
-        <w:rPr/>
-        <w:t xml:space="preserve">[8] CCL backend and native pass 2 Native argument-register conventions are comparison evidence, not a Wasm parameter limit. </w:t>
-      </w:r>
-      <w:hyperlink r:id="rId24">
-        <w:r>
-          <w:rPr>
-            <w:color w:val="175C91"/>
-            <w:u w:val="single"/>
-          </w:rPr>
-          <w:t xml:space="preserve">backend.lisp</w:t>
+      <w:hyperlink r:id="rId26">
+        <w:r>
+          <w:rPr>
+            <w:color w:val="175C91"/>
+            <w:u w:val="single"/>
+          </w:rPr>
+          <w:t xml:space="preserve">x862.lisp</w:t>
+        </w:r>
+      </w:hyperlink>
+    </w:p>
+    <w:p>
+      <w:r>
+        <w:rPr/>
+        <w:t xml:space="preserve">[9] LLVM WebAssembly linker Import/export and memory/table options; signature-mismatch warnings and trapping stubs; strict link policy. </w:t>
+      </w:r>
+      <w:hyperlink r:id="rId27">
+        <w:r>
+          <w:rPr>
+            <w:color w:val="175C91"/>
+            <w:u w:val="single"/>
+          </w:rPr>
+          <w:t xml:space="preserve">LLD WebAssembly documentation</w:t>
+        </w:r>
+      </w:hyperlink>
+    </w:p>
+    <w:p>
+      <w:pPr>
+        <w:pStyle w:val="Heading1"/>
+      </w:pPr>
+      <w:r>
+        <w:rPr/>
+        <w:t xml:space="preserve">REFERENCES  /  CONTINUED</w:t>
+      </w:r>
+    </w:p>
+    <w:p>
+      <w:pPr>
+        <w:pStyle w:val="Heading2"/>
+      </w:pPr>
+      <w:r>
+        <w:rPr/>
+        <w:t xml:space="preserve">Kernel, ABI and project-document sources</w:t>
+      </w:r>
+    </w:p>
+    <w:p>
+      <w:r>
+        <w:rPr/>
+        <w:t xml:space="preserve">[10] Kernel adaptation and exact imports Portable and architecture-specific collector work must be audited together; imports.s is the exact census source. </w:t>
+      </w:r>
+      <w:hyperlink r:id="rId28">
+        <w:r>
+          <w:rPr>
+            <w:color w:val="175C91"/>
+            <w:u w:val="single"/>
+          </w:rPr>
+          <w:t xml:space="preserve">gc-common.c</w:t>
         </w:r>
       </w:hyperlink>
       <w:r>
         <w:rPr/>
         <w:t xml:space="preserve"> · </w:t>
       </w:r>
-      <w:hyperlink r:id="rId25">
-        <w:r>
-          <w:rPr>
-            <w:color w:val="175C91"/>
-            <w:u w:val="single"/>
-          </w:rPr>
-          <w:t xml:space="preserve">x862.lisp</w:t>
-        </w:r>
-      </w:hyperlink>
-    </w:p>
-    <w:p>
-      <w:r>
-        <w:rPr/>
-        <w:t xml:space="preserve">[9] LLVM WebAssembly linker Import/export and memory/table options; signature-mismatch warnings and trapping stubs; strict link policy. </w:t>
-      </w:r>
-      <w:hyperlink r:id="rId26">
-        <w:r>
-          <w:rPr>
-            <w:color w:val="175C91"/>
-            <w:u w:val="single"/>
-          </w:rPr>
-          <w:t xml:space="preserve">LLD WebAssembly documentation</w:t>
-        </w:r>
-      </w:hyperlink>
+      <w:hyperlink r:id="rId29">
+        <w:r>
+          <w:rPr>
+            <w:color w:val="175C91"/>
+            <w:u w:val="single"/>
+          </w:rPr>
+          <w:t xml:space="preserve">x86-gc.c</w:t>
+        </w:r>
+      </w:hyperlink>
+      <w:r>
+        <w:rPr/>
+        <w:t xml:space="preserve"> · </w:t>
+      </w:r>
+      <w:hyperlink r:id="rId30">
+        <w:r>
+          <w:rPr>
+            <w:color w:val="175C91"/>
+            <w:u w:val="single"/>
+          </w:rPr>
+          <w:t xml:space="preserve">image.c</w:t>
+        </w:r>
+      </w:hyperlink>
+      <w:r>
+        <w:rPr/>
+        <w:t xml:space="preserve"> · </w:t>
+      </w:r>
+      <w:hyperlink r:id="rId31">
+        <w:r>
+          <w:rPr>
+            <w:color w:val="175C91"/>
+            <w:u w:val="single"/>
+          </w:rPr>
+          <w:t xml:space="preserve">memory.c</w:t>
+        </w:r>
+      </w:hyperlink>
+      <w:r>
+        <w:rPr/>
+        <w:t xml:space="preserve"> · </w:t>
+      </w:r>
+      <w:hyperlink r:id="rId32">
+        <w:r>
+          <w:rPr>
+            <w:color w:val="175C91"/>
+            <w:u w:val="single"/>
+          </w:rPr>
+          <w:t xml:space="preserve">thread_manager.c</w:t>
+        </w:r>
+      </w:hyperlink>
+      <w:r>
+        <w:rPr/>
+        <w:t xml:space="preserve"> · </w:t>
+      </w:r>
+      <w:hyperlink r:id="rId33">
+        <w:r>
+          <w:rPr>
+            <w:color w:val="175C91"/>
+            <w:u w:val="single"/>
+          </w:rPr>
+          <w:t xml:space="preserve">imports.s</w:t>
+        </w:r>
+      </w:hyperlink>
+    </w:p>
+    <w:p>
+      <w:r>
+        <w:rPr/>
+        <w:t xml:space="preserve">[11] Native trap/check lowering inventory Previously recorded x86-64 UUO/check occurrences remain a worklist to reconcile with evaluated census records. </w:t>
+      </w:r>
+      <w:hyperlink r:id="rId34">
+        <w:r>
+          <w:rPr>
+            <w:color w:val="175C91"/>
+            <w:u w:val="single"/>
+          </w:rPr>
+          <w:t xml:space="preserve">x8664-vinsns.lisp</w:t>
+        </w:r>
+      </w:hyperlink>
+    </w:p>
+    <w:p>
+      <w:r>
+        <w:rPr/>
+        <w:t xml:space="preserve">[12] WebAssembly heterogeneous function tables and call-site types Core control instructions and call_indirect / return_call_indirect validation. A static expected type belongs to the call site; incompatible table entries trap before entry. </w:t>
+      </w:r>
+      <w:hyperlink r:id="rId35">
+        <w:r>
+          <w:rPr>
+            <w:color w:val="175C91"/>
+            <w:u w:val="single"/>
+          </w:rPr>
+          <w:t xml:space="preserve">Core: control instructions</w:t>
+        </w:r>
+      </w:hyperlink>
+      <w:r>
+        <w:rPr/>
+        <w:t xml:space="preserve"> · </w:t>
+      </w:r>
+      <w:hyperlink r:id="rId21">
+        <w:r>
+          <w:rPr>
+            <w:color w:val="175C91"/>
+            <w:u w:val="single"/>
+          </w:rPr>
+          <w:t xml:space="preserve">Core: validation and execution</w:t>
+        </w:r>
+      </w:hyperlink>
+    </w:p>
+    <w:p>
+      <w:r>
+        <w:rPr/>
+        <w:t xml:space="preserve">[13] WebAssembly Basic C ABI Scalar versus aggregate parameter/result passing; address-taken locals and the linear C stack. </w:t>
+      </w:r>
+      <w:hyperlink r:id="rId36">
+        <w:r>
+          <w:rPr>
+            <w:color w:val="175C91"/>
+            <w:u w:val="single"/>
+          </w:rPr>
+          <w:t xml:space="preserve">BasicCABI.md</w:t>
+        </w:r>
+      </w:hyperlink>
+    </w:p>
+    <w:p>
+      <w:r>
+        <w:rPr/>
+        <w:t xml:space="preserve">[14] WebAssembly linking conventions Process-once initialization with passive segments and per-thread storage conventions; verify the actual linked output. </w:t>
+      </w:r>
+      <w:hyperlink r:id="rId37">
+        <w:r>
+          <w:rPr>
+            <w:color w:val="175C91"/>
+            <w:u w:val="single"/>
+          </w:rPr>
+          <w:t xml:space="preserve">Linking.md</w:t>
+        </w:r>
+      </w:hyperlink>
+    </w:p>
+    <w:p>
+      <w:r>
+        <w:rPr/>
+        <w:t xml:space="preserve">[15] Common Lisp ordinary lambda lists and calls Required, optional, rest and keyword arguments; FUNCALL/APPLY semantics. A supplied count does not determine callee convention. </w:t>
+      </w:r>
+      <w:hyperlink r:id="rId38">
+        <w:r>
+          <w:rPr>
+            <w:color w:val="175C91"/>
+            <w:u w:val="single"/>
+          </w:rPr>
+          <w:t xml:space="preserve">Lambda lists</w:t>
+        </w:r>
+      </w:hyperlink>
+      <w:r>
+        <w:rPr/>
+        <w:t xml:space="preserve"> · </w:t>
+      </w:r>
+      <w:hyperlink r:id="rId39">
+        <w:r>
+          <w:rPr>
+            <w:color w:val="175C91"/>
+            <w:u w:val="single"/>
+          </w:rPr>
+          <w:t xml:space="preserve">FUNCALL</w:t>
+        </w:r>
+      </w:hyperlink>
+      <w:r>
+        <w:rPr/>
+        <w:t xml:space="preserve"> · </w:t>
+      </w:r>
+      <w:hyperlink r:id="rId40">
+        <w:r>
+          <w:rPr>
+            <w:color w:val="175C91"/>
+            <w:u w:val="single"/>
+          </w:rPr>
+          <w:t xml:space="preserve">APPLY</w:t>
+        </w:r>
+      </w:hyperlink>
+    </w:p>
+    <w:p>
+      <w:r>
+        <w:rPr/>
+        <w:t xml:space="preserve">[16] WebAssembly numeric semantics Floating-point operation and operand cases; result classification alone is not a CCL condition policy. </w:t>
+      </w:r>
+      <w:hyperlink r:id="rId41">
+        <w:r>
+          <w:rPr>
+            <w:color w:val="175C91"/>
+            <w:u w:val="single"/>
+          </w:rPr>
+          <w:t xml:space="preserve">Core numerics</w:t>
+        </w:r>
+      </w:hyperlink>
+    </w:p>
+    <w:p>
+      <w:r>
+        <w:rPr/>
+        <w:t xml:space="preserve">[17] Coordinated project-document authority Port Outline v0.17; Acceptance Policy and Regression Register v1.7; Stage 0 Desk Decisions v1.8. The outline owns architecture scope, the register owns acceptance and obligation metadata, and this record owns D1–D7 choices and protocols. Source inputs are identified below.</w:t>
+      </w:r>
+    </w:p>
+    <w:p>
+      <w:r>
+        <w:rPr/>
+        <w:t xml:space="preserve">[18] Agreed decision amendments, reaffirmed 11 September 2026 Project exchange confirming the v1.2 agreement: decided statuses and reversal criteria; owner-only CAS acquisition and atomic-store release; parity admission/root reload; final membership rescan; host-acknowledged cancellation; and the then-current baseline-first incremental H(G) accounting, superseded by the user’s later instruction to make H(G) optional future work. The date identifies the confirmation exchange, not this file’s revision or an inferred earlier message timestamp.</w:t>
+      </w:r>
+    </w:p>
+    <w:p>
+      <w:r>
+        <w:rPr/>
+        <w:t xml:space="preserve">[19] Interrupt-wake and companion consistency corrections, 11 September 2026 Project exchange requiring wake-up of a FOREIGN I/O waiter through INTERRUPTED status and notification, admission before interrupt service, retention of its outstanding descriptor, a S0-LL20-b schedule, conditional G/E_k stub wording, separate logical IDs and slots, and corrected revision/exchange dates.</w:t>
+      </w:r>
+    </w:p>
+    <w:p>
+      <w:pPr>
+        <w:pStyle w:val="Heading3"/>
+      </w:pPr>
+      <w:r>
+        <w:rPr/>
+        <w:t xml:space="preserve">Input identity</w:t>
+      </w:r>
+    </w:p>
+    <w:p>
+      <w:r>
+        <w:rPr/>
+        <w:t xml:space="preserve">The complete original v0.12/v1.2/v1.3 input files and their SHA-256 digests are retained in history/2026-09-11-inputs and history/inputs.json. That preserved v1.3 decision record contains the earlier v0.11/v1.1/v1.2 input hashes. New DOCX reading copies are generated from the current Markdown; tools/manage.py checks both source and generated identities.</w:t>
+      </w:r>
     </w:p>
     <w:p>
       <w:pPr>
@@ -3317,266 +3761,6 @@
       </w:pPr>
       <w:r>
         <w:rPr/>
-        <w:t xml:space="preserve">REFERENCES  /  CONTINUED</w:t>
-      </w:r>
-    </w:p>
-    <w:p>
-      <w:pPr>
-        <w:pStyle w:val="Heading2"/>
-      </w:pPr>
-      <w:r>
-        <w:rPr/>
-        <w:t xml:space="preserve">Kernel, ABI and project-document sources</w:t>
-      </w:r>
-    </w:p>
-    <w:p>
-      <w:r>
-        <w:rPr/>
-        <w:t xml:space="preserve">[10] Kernel adaptation and exact imports Portable and architecture-specific collector work must be audited together; imports.s is the exact census source. </w:t>
-      </w:r>
-      <w:hyperlink r:id="rId27">
-        <w:r>
-          <w:rPr>
-            <w:color w:val="175C91"/>
-            <w:u w:val="single"/>
-          </w:rPr>
-          <w:t xml:space="preserve">gc-common.c</w:t>
-        </w:r>
-      </w:hyperlink>
-      <w:r>
-        <w:rPr/>
-        <w:t xml:space="preserve"> · </w:t>
-      </w:r>
-      <w:hyperlink r:id="rId28">
-        <w:r>
-          <w:rPr>
-            <w:color w:val="175C91"/>
-            <w:u w:val="single"/>
-          </w:rPr>
-          <w:t xml:space="preserve">x86-gc.c</w:t>
-        </w:r>
-      </w:hyperlink>
-      <w:r>
-        <w:rPr/>
-        <w:t xml:space="preserve"> · </w:t>
-      </w:r>
-      <w:hyperlink r:id="rId29">
-        <w:r>
-          <w:rPr>
-            <w:color w:val="175C91"/>
-            <w:u w:val="single"/>
-          </w:rPr>
-          <w:t xml:space="preserve">image.c</w:t>
-        </w:r>
-      </w:hyperlink>
-      <w:r>
-        <w:rPr/>
-        <w:t xml:space="preserve"> · </w:t>
-      </w:r>
-      <w:hyperlink r:id="rId30">
-        <w:r>
-          <w:rPr>
-            <w:color w:val="175C91"/>
-            <w:u w:val="single"/>
-          </w:rPr>
-          <w:t xml:space="preserve">memory.c</w:t>
-        </w:r>
-      </w:hyperlink>
-      <w:r>
-        <w:rPr/>
-        <w:t xml:space="preserve"> · </w:t>
-      </w:r>
-      <w:hyperlink r:id="rId31">
-        <w:r>
-          <w:rPr>
-            <w:color w:val="175C91"/>
-            <w:u w:val="single"/>
-          </w:rPr>
-          <w:t xml:space="preserve">thread_manager.c</w:t>
-        </w:r>
-      </w:hyperlink>
-      <w:r>
-        <w:rPr/>
-        <w:t xml:space="preserve"> · </w:t>
-      </w:r>
-      <w:hyperlink r:id="rId32">
-        <w:r>
-          <w:rPr>
-            <w:color w:val="175C91"/>
-            <w:u w:val="single"/>
-          </w:rPr>
-          <w:t xml:space="preserve">imports.s</w:t>
-        </w:r>
-      </w:hyperlink>
-    </w:p>
-    <w:p>
-      <w:r>
-        <w:rPr/>
-        <w:t xml:space="preserve">[11] Native trap/check lowering inventory Previously recorded x86-64 UUO/check occurrences remain a worklist to reconcile with evaluated census records. </w:t>
-      </w:r>
-      <w:hyperlink r:id="rId33">
-        <w:r>
-          <w:rPr>
-            <w:color w:val="175C91"/>
-            <w:u w:val="single"/>
-          </w:rPr>
-          <w:t xml:space="preserve">x8664-vinsns.lisp</w:t>
-        </w:r>
-      </w:hyperlink>
-    </w:p>
-    <w:p>
-      <w:r>
-        <w:rPr/>
-        <w:t xml:space="preserve">[12] WebAssembly heterogeneous function tables and call-site types Core control instructions and call_indirect / return_call_indirect validation. A static expected type belongs to the call site; incompatible table entries trap before entry. </w:t>
-      </w:r>
-      <w:hyperlink r:id="rId34">
-        <w:r>
-          <w:rPr>
-            <w:color w:val="175C91"/>
-            <w:u w:val="single"/>
-          </w:rPr>
-          <w:t xml:space="preserve">Core: control instructions</w:t>
-        </w:r>
-      </w:hyperlink>
-      <w:r>
-        <w:rPr/>
-        <w:t xml:space="preserve"> · </w:t>
-      </w:r>
-      <w:hyperlink r:id="rId20">
-        <w:r>
-          <w:rPr>
-            <w:color w:val="175C91"/>
-            <w:u w:val="single"/>
-          </w:rPr>
-          <w:t xml:space="preserve">Core: validation and execution</w:t>
-        </w:r>
-      </w:hyperlink>
-    </w:p>
-    <w:p>
-      <w:r>
-        <w:rPr/>
-        <w:t xml:space="preserve">[13] WebAssembly Basic C ABI Scalar versus aggregate parameter/result passing; address-taken locals and the linear C stack. </w:t>
-      </w:r>
-      <w:hyperlink r:id="rId35">
-        <w:r>
-          <w:rPr>
-            <w:color w:val="175C91"/>
-            <w:u w:val="single"/>
-          </w:rPr>
-          <w:t xml:space="preserve">BasicCABI.md</w:t>
-        </w:r>
-      </w:hyperlink>
-    </w:p>
-    <w:p>
-      <w:r>
-        <w:rPr/>
-        <w:t xml:space="preserve">[14] WebAssembly linking conventions Process-once initialization with passive segments and per-thread storage conventions; verify the actual linked output. </w:t>
-      </w:r>
-      <w:hyperlink r:id="rId36">
-        <w:r>
-          <w:rPr>
-            <w:color w:val="175C91"/>
-            <w:u w:val="single"/>
-          </w:rPr>
-          <w:t xml:space="preserve">Linking.md</w:t>
-        </w:r>
-      </w:hyperlink>
-    </w:p>
-    <w:p>
-      <w:r>
-        <w:rPr/>
-        <w:t xml:space="preserve">[15] Common Lisp ordinary lambda lists and calls Required, optional, rest and keyword arguments; FUNCALL/APPLY semantics. A supplied count does not determine callee convention. </w:t>
-      </w:r>
-      <w:hyperlink r:id="rId37">
-        <w:r>
-          <w:rPr>
-            <w:color w:val="175C91"/>
-            <w:u w:val="single"/>
-          </w:rPr>
-          <w:t xml:space="preserve">Lambda lists</w:t>
-        </w:r>
-      </w:hyperlink>
-      <w:r>
-        <w:rPr/>
-        <w:t xml:space="preserve"> · </w:t>
-      </w:r>
-      <w:hyperlink r:id="rId38">
-        <w:r>
-          <w:rPr>
-            <w:color w:val="175C91"/>
-            <w:u w:val="single"/>
-          </w:rPr>
-          <w:t xml:space="preserve">FUNCALL</w:t>
-        </w:r>
-      </w:hyperlink>
-      <w:r>
-        <w:rPr/>
-        <w:t xml:space="preserve"> · </w:t>
-      </w:r>
-      <w:hyperlink r:id="rId39">
-        <w:r>
-          <w:rPr>
-            <w:color w:val="175C91"/>
-            <w:u w:val="single"/>
-          </w:rPr>
-          <w:t xml:space="preserve">APPLY</w:t>
-        </w:r>
-      </w:hyperlink>
-    </w:p>
-    <w:p>
-      <w:r>
-        <w:rPr/>
-        <w:t xml:space="preserve">[16] WebAssembly numeric semantics Floating-point operation and operand cases; result classification alone is not a CCL condition policy. </w:t>
-      </w:r>
-      <w:hyperlink r:id="rId40">
-        <w:r>
-          <w:rPr>
-            <w:color w:val="175C91"/>
-            <w:u w:val="single"/>
-          </w:rPr>
-          <w:t xml:space="preserve">Core numerics</w:t>
-        </w:r>
-      </w:hyperlink>
-    </w:p>
-    <w:p>
-      <w:r>
-        <w:rPr/>
-        <w:t xml:space="preserve">[17] Coordinated project-document authority Port Outline v0.17; Acceptance Policy and Regression Register v1.7; Stage 0 Desk Decisions v1.8. The outline owns architecture scope, the register owns acceptance and obligation metadata, and this record owns D1–D7 choices and protocols. Source inputs are identified below.</w:t>
-      </w:r>
-    </w:p>
-    <w:p>
-      <w:r>
-        <w:rPr/>
-        <w:t xml:space="preserve">[18] Agreed decision amendments, reaffirmed 11 September 2026 Project exchange confirming the v1.2 agreement: decided statuses and reversal criteria; owner-only CAS acquisition and atomic-store release; parity admission/root reload; final membership rescan; host-acknowledged cancellation; and the then-current baseline-first incremental H(G) accounting, superseded by the user’s later instruction to make H(G) optional future work. The date identifies the confirmation exchange, not this file’s revision or an inferred earlier message timestamp.</w:t>
-      </w:r>
-    </w:p>
-    <w:p>
-      <w:r>
-        <w:rPr/>
-        <w:t xml:space="preserve">[19] Interrupt-wake and companion consistency corrections, 11 September 2026 Project exchange requiring wake-up of a FOREIGN I/O waiter through INTERRUPTED status and notification, admission before interrupt service, retention of its outstanding descriptor, a S0-LL20-b schedule, conditional G/E_k stub wording, separate logical IDs and slots, and corrected revision/exchange dates.</w:t>
-      </w:r>
-    </w:p>
-    <w:p>
-      <w:pPr>
-        <w:pStyle w:val="Heading3"/>
-      </w:pPr>
-      <w:r>
-        <w:rPr/>
-        <w:t xml:space="preserve">Input identity</w:t>
-      </w:r>
-    </w:p>
-    <w:p>
-      <w:r>
-        <w:rPr/>
-        <w:t xml:space="preserve">The complete original v0.12/v1.2/v1.3 input files and their SHA-256 digests are retained in history/2026-09-11-inputs and history/inputs.json. That preserved v1.3 decision record contains the earlier v0.11/v1.1/v1.2 input hashes. New DOCX reading copies are generated from the current Markdown; tools/manage.py checks both source and generated identities.</w:t>
-      </w:r>
-    </w:p>
-    <w:p>
-      <w:pPr>
-        <w:pStyle w:val="Heading1"/>
-      </w:pPr>
-      <w:r>
-        <w:rPr/>
         <w:t xml:space="preserve">24 September 2026 — READY image decision amended: a cross-loaded boot replaces projection</w:t>
       </w:r>
     </w:p>
@@ -3603,7 +3787,7 @@
         <w:rPr/>
         <w:t xml:space="preserve">namespaces"), asked for a plan (</w:t>
       </w:r>
-      <w:hyperlink r:id="rId41">
+      <w:hyperlink r:id="rId42">
         <w:r>
           <w:rPr>
             <w:color w:val="175C91"/>
@@ -3622,7 +3806,7 @@
         <w:rPr/>
         <w:t xml:space="preserve">had Codex review it (</w:t>
       </w:r>
-      <w:hyperlink r:id="rId42">
+      <w:hyperlink r:id="rId43">
         <w:r>
           <w:rPr>
             <w:color w:val="175C91"/>
@@ -3679,7 +3863,7 @@
         <w:rPr/>
         <w:t xml:space="preserve">   </w:t>
       </w:r>
-      <w:hyperlink r:id="rId43">
+      <w:hyperlink r:id="rId44">
         <w:r>
           <w:rPr>
             <w:color w:val="175C91"/>

</xml_diff>

<commit_message>
Close Stage 1 from retained evidence and open Stage 2
Bind the twelve remaining slots, preserve the original twenty-one accepted records, pin current contracts, and record unsupported assertion portions as explicit deferrals. Reconcile the inventory, ledger, status, exit checklist and Stage 1 map.

User waived another review and directed closure without rerunning product tests. Retention commit 45682a83 precedes closure. Stage 2 opens on the foreign-function lower layer and weak hash tables.

Validation: 44 retained references, compacted identities, exact slot accounting and document consistency pass. No product tests, compilation or review runs.
</commit_message>
<xml_diff>
--- a/doc/WASM/CCL_WebAssembly_Stage0_Desk_Decisions_v1_8.docx
+++ b/doc/WASM/CCL_WebAssembly_Stage0_Desk_Decisions_v1_8.docx
@@ -41,6 +41,302 @@
       </w:pPr>
       <w:r>
         <w:rPr/>
+        <w:t xml:space="preserve">28 September 2026 — Stage 1 closure</w:t>
+      </w:r>
+    </w:p>
+    <w:p>
+      <w:r>
+        <w:rPr/>
+        <w:t xml:space="preserve">Decision </w:t>
+      </w:r>
+      <w:r>
+        <w:rPr>
+          <w:b/>
+        </w:rPr>
+        <w:t xml:space="preserve">S1-CLOSE-2026-09-28</w:t>
+      </w:r>
+      <w:r>
+        <w:rPr/>
+        <w:t xml:space="preserve">. The user ordered a single records-only closure:</w:t>
+      </w:r>
+    </w:p>
+    <w:p>
+      <w:r>
+        <w:rPr/>
+        <w:t xml:space="preserve">bind the twelve open slots to retained evidence, reconcile the inventory,</w:t>
+      </w:r>
+    </w:p>
+    <w:p>
+      <w:r>
+        <w:rPr/>
+        <w:t xml:space="preserve">headline, exit checklist and Stage 1 map, and defer any unretained obligation</w:t>
+      </w:r>
+    </w:p>
+    <w:p>
+      <w:r>
+        <w:rPr/>
+        <w:t xml:space="preserve">with its decision rather than rerun it. The user then removed the proposed</w:t>
+      </w:r>
+    </w:p>
+    <w:p>
+      <w:r>
+        <w:rPr/>
+        <w:t xml:space="preserve">review: </w:t>
+      </w:r>
+      <w:r>
+        <w:rPr>
+          <w:b/>
+        </w:rPr>
+        <w:t xml:space="preserve">“just close it. we dont need a review.”</w:t>
+      </w:r>
+      <w:r>
+        <w:rPr/>
+        <w:t xml:space="preserve"> This waives a new review</w:t>
+      </w:r>
+    </w:p>
+    <w:p>
+      <w:r>
+        <w:rPr/>
+        <w:t xml:space="preserve">for this closure; the standing review policy for future implementation remains.</w:t>
+      </w:r>
+    </w:p>
+    <w:p>
+      <w:r>
+        <w:rPr/>
+        <w:t xml:space="preserve">Stage 1 is </w:t>
+      </w:r>
+      <w:r>
+        <w:rPr>
+          <w:b/>
+        </w:rPr>
+        <w:t xml:space="preserve">CLOSED at retained evidence scopes, with explicit deferrals</w:t>
+      </w:r>
+      <w:r>
+        <w:rPr/>
+        <w:t xml:space="preserve">.</w:t>
+      </w:r>
+    </w:p>
+    <w:p>
+      <w:r>
+        <w:rPr/>
+        <w:t xml:space="preserve">The </w:t>
+      </w:r>
+      <w:hyperlink r:id="rId2">
+        <w:r>
+          <w:rPr>
+            <w:color w:val="175C91"/>
+            <w:u w:val="single"/>
+          </w:rPr>
+          <w:t xml:space="preserve">ledger</w:t>
+        </w:r>
+      </w:hyperlink>
+      <w:r>
+        <w:rPr/>
+        <w:t xml:space="preserve"> now accounts for all</w:t>
+      </w:r>
+    </w:p>
+    <w:p>
+      <w:r>
+        <w:rPr/>
+        <w:t xml:space="preserve">33 slots: the original 21 accepted records remain unchanged, and the other</w:t>
+      </w:r>
+    </w:p>
+    <w:p>
+      <w:r>
+        <w:rPr/>
+        <w:t xml:space="preserve">12 are bound in </w:t>
+      </w:r>
+      <w:hyperlink r:id="rId3">
+        <w:r>
+          <w:rPr>
+            <w:color w:val="175C91"/>
+            <w:u w:val="single"/>
+          </w:rPr>
+          <w:t xml:space="preserve">closure.json</w:t>
+        </w:r>
+      </w:hyperlink>
+      <w:r>
+        <w:rPr/>
+        <w:t xml:space="preserve">. No product tests are rerun.</w:t>
+      </w:r>
+    </w:p>
+    <w:p>
+      <w:r>
+        <w:rPr/>
+        <w:t xml:space="preserve">Audits 188, 190 and 193 supply the existing READY, error-recovery and retained</w:t>
+      </w:r>
+    </w:p>
+    <w:p>
+      <w:r>
+        <w:rPr/>
+        <w:t xml:space="preserve">calling-convention evidence. The </w:t>
+      </w:r>
+      <w:hyperlink r:id="rId4">
+        <w:r>
+          <w:rPr>
+            <w:color w:val="175C91"/>
+            <w:u w:val="single"/>
+          </w:rPr>
+          <w:t xml:space="preserve">exit checklist and map</w:t>
+        </w:r>
+      </w:hyperlink>
+    </w:p>
+    <w:p>
+      <w:r>
+        <w:rPr/>
+        <w:t xml:space="preserve">state each slot's scope and the portions deferred by this decision.</w:t>
+      </w:r>
+    </w:p>
+    <w:p>
+      <w:r>
+        <w:rPr/>
+        <w:t xml:space="preserve">The retained loader records establish 82/82 selected runtime files compiled,</w:t>
+      </w:r>
+    </w:p>
+    <w:p>
+      <w:r>
+        <w:rPr/>
+        <w:t xml:space="preserve">81 returning runtime loads, and 5,028 executed logical functions, all joined</w:t>
+      </w:r>
+    </w:p>
+    <w:p>
+      <w:r>
+        <w:rPr/>
+        <w:t xml:space="preserve">to installed identities. These counts do not become a complete READY operator</w:t>
+      </w:r>
+    </w:p>
+    <w:p>
+      <w:r>
+        <w:rPr/>
+        <w:t xml:space="preserve">or native-matched original-body census. Unretained operator/operand joins,</w:t>
+      </w:r>
+    </w:p>
+    <w:p>
+      <w:r>
+        <w:rPr/>
+        <w:t xml:space="preserve">broader original attribution, the additional 1F gate-control matrix and the</w:t>
+      </w:r>
+    </w:p>
+    <w:p>
+      <w:r>
+        <w:rPr/>
+        <w:t xml:space="preserve">exhaustive new contract-row join are </w:t>
+      </w:r>
+      <w:r>
+        <w:rPr>
+          <w:b/>
+        </w:rPr>
+        <w:t xml:space="preserve">deferred</w:t>
+      </w:r>
+      <w:r>
+        <w:rPr/>
+        <w:t xml:space="preserve">, not passed. Current contract</w:t>
+      </w:r>
+    </w:p>
+    <w:p>
+      <w:r>
+        <w:rPr/>
+        <w:t xml:space="preserve">versions are pinned; the 575/535 accepted original-body floor is preserved.</w:t>
+      </w:r>
+    </w:p>
+    <w:p>
+      <w:r>
+        <w:rPr/>
+        <w:t xml:space="preserve">The historical v2 result aggregate keeps its original contract bindings; the</w:t>
+      </w:r>
+    </w:p>
+    <w:p>
+      <w:r>
+        <w:rPr/>
+        <w:t xml:space="preserve">new closure ledger reports this authorized scoped disposition explicitly.</w:t>
+      </w:r>
+    </w:p>
+    <w:p>
+      <w:r>
+        <w:rPr/>
+        <w:t xml:space="preserve">Artifact retention lands </w:t>
+      </w:r>
+      <w:r>
+        <w:rPr>
+          <w:b/>
+        </w:rPr>
+        <w:t xml:space="preserve">before closure</w:t>
+      </w:r>
+      <w:r>
+        <w:rPr/>
+        <w:t xml:space="preserve">: the checkout was already clean</w:t>
+      </w:r>
+    </w:p>
+    <w:p>
+      <w:r>
+        <w:rPr/>
+        <w:t xml:space="preserve">at </w:t>
+      </w:r>
+      <w:r>
+        <w:rPr>
+          <w:rFonts w:ascii="Consolas" w:hAnsi="Consolas"/>
+        </w:rPr>
+        <w:t xml:space="preserve">45682a833d680eef4912053e92176ae8b6c9845e</w:t>
+      </w:r>
+      <w:r>
+        <w:rPr/>
+        <w:t xml:space="preserve">, which committed that change.</w:t>
+      </w:r>
+    </w:p>
+    <w:p>
+      <w:r>
+        <w:rPr/>
+        <w:t xml:space="preserve">Closure references the retained records and compaction provenance without</w:t>
+      </w:r>
+    </w:p>
+    <w:p>
+      <w:r>
+        <w:rPr/>
+        <w:t xml:space="preserve">rebuilding removed artifacts or introducing another retention commit.</w:t>
+      </w:r>
+    </w:p>
+    <w:p>
+      <w:r>
+        <w:rPr>
+          <w:b/>
+        </w:rPr>
+        <w:t xml:space="preserve">Stage 2 is OPEN on the foreign-function lower layer and weak hash tables</w:t>
+      </w:r>
+      <w:r>
+        <w:rPr/>
+        <w:t xml:space="preserve">,</w:t>
+      </w:r>
+    </w:p>
+    <w:p>
+      <w:r>
+        <w:rPr/>
+        <w:t xml:space="preserve">as ordered on 26 September and reiterated by the user here. HOSTFM P2's</w:t>
+      </w:r>
+    </w:p>
+    <w:p>
+      <w:r>
+        <w:rPr/>
+        <w:t xml:space="preserve">FMT-1–FMT-9 govern the foreign boundary; weak-table work continues the reviewed</w:t>
+      </w:r>
+    </w:p>
+    <w:p>
+      <w:r>
+        <w:rPr/>
+        <w:t xml:space="preserve">weak-key/value implementation and moving-GC obligations. Existing exclusions,</w:t>
+      </w:r>
+    </w:p>
+    <w:p>
+      <w:r>
+        <w:rPr/>
+        <w:t xml:space="preserve">the named closure deferrals and O-136/O-139/O-149 retain their scopes.</w:t>
+      </w:r>
+    </w:p>
+    <w:p>
+      <w:pPr>
+        <w:pStyle w:val="Heading1"/>
+      </w:pPr>
+      <w:r>
+        <w:rPr/>
         <w:t xml:space="preserve">25 September 2026 — HOSTFM P2 adopted with amendments</w:t>
       </w:r>
     </w:p>
@@ -55,7 +351,7 @@
         <w:rPr/>
         <w:t xml:space="preserve">work." </w:t>
       </w:r>
-      <w:hyperlink r:id="rId2">
+      <w:hyperlink r:id="rId5">
         <w:r>
           <w:rPr>
             <w:color w:val="175C91"/>
@@ -289,7 +585,7 @@
       </w:r>
     </w:p>
     <w:p>
-      <w:hyperlink r:id="rId3">
+      <w:hyperlink r:id="rId6">
         <w:r>
           <w:rPr>
             <w:color w:val="175C91"/>
@@ -387,7 +683,7 @@
         <w:rPr/>
         <w:t xml:space="preserve">computed by the detection rules in </w:t>
       </w:r>
-      <w:hyperlink r:id="rId4">
+      <w:hyperlink r:id="rId7">
         <w:r>
           <w:rPr>
             <w:color w:val="175C91"/>
@@ -491,7 +787,7 @@
         <w:rPr/>
         <w:t xml:space="preserve">   </w:t>
       </w:r>
-      <w:hyperlink r:id="rId5">
+      <w:hyperlink r:id="rId8">
         <w:r>
           <w:rPr>
             <w:color w:val="175C91"/>
@@ -528,7 +824,7 @@
         <w:rPr/>
         <w:t xml:space="preserve">   </w:t>
       </w:r>
-      <w:hyperlink r:id="rId6">
+      <w:hyperlink r:id="rId2">
         <w:r>
           <w:rPr>
             <w:color w:val="175C91"/>
@@ -1210,7 +1506,7 @@
         <w:rPr/>
         <w:t xml:space="preserve">The </w:t>
       </w:r>
-      <w:hyperlink r:id="rId7">
+      <w:hyperlink r:id="rId9">
         <w:r>
           <w:rPr>
             <w:color w:val="175C91"/>
@@ -1552,7 +1848,7 @@
         <w:rPr/>
         <w:t xml:space="preserve">Use B under the </w:t>
       </w:r>
-      <w:hyperlink r:id="rId7">
+      <w:hyperlink r:id="rId9">
         <w:r>
           <w:rPr>
             <w:color w:val="175C91"/>
@@ -1571,7 +1867,7 @@
         <w:rPr/>
         <w:t xml:space="preserve">The </w:t>
       </w:r>
-      <w:hyperlink r:id="rId8">
+      <w:hyperlink r:id="rId10">
         <w:r>
           <w:rPr>
             <w:color w:val="175C91"/>
@@ -1584,7 +1880,7 @@
         <w:rPr/>
         <w:t xml:space="preserve"> and </w:t>
       </w:r>
-      <w:hyperlink r:id="rId9">
+      <w:hyperlink r:id="rId11">
         <w:r>
           <w:rPr>
             <w:color w:val="175C91"/>
@@ -1597,7 +1893,7 @@
         <w:rPr/>
         <w:t xml:space="preserve"> supply the bounded correctness basis. The </w:t>
       </w:r>
-      <w:hyperlink r:id="rId10">
+      <w:hyperlink r:id="rId12">
         <w:r>
           <w:rPr>
             <w:color w:val="175C91"/>
@@ -1820,7 +2116,7 @@
         <w:rPr/>
         <w:t xml:space="preserve">14 September 2026 clarification following the native-internals review: retain D1, B, D4 and D5. The hand-built copying collector establishes its recorded mechanisms; it does not select the production collector algorithm or qualify all native object semantics. The initial non-generational collector still owes moved-key/hash-cache correctness and separate dispositions for weak objects and GCTWA. The non-generational choice justifies omitting classified generational bookkeeping, not other store semantics. B does not eliminate roots outside the argument stack, and cooperative suspension requires complete publication at every collecting transition. The </w:t>
       </w:r>
-      <w:hyperlink r:id="rId11">
+      <w:hyperlink r:id="rId13">
         <w:r>
           <w:rPr>
             <w:color w:val="175C91"/>
@@ -2088,7 +2384,7 @@
         <w:rPr/>
         <w:t xml:space="preserve">The integrated fixture exposed two lifetime defects (original failures r3 and r6). Claude’s external audit then exposed an exceptional return that left an idle Worker RUNNING (original failure r9). These findings amend protocol v1; the </w:t>
       </w:r>
-      <w:hyperlink r:id="rId12">
+      <w:hyperlink r:id="rId14">
         <w:r>
           <w:rPr>
             <w:color w:val="175C91"/>
@@ -2101,7 +2397,7 @@
         <w:rPr/>
         <w:t xml:space="preserve"> retains the originals and the </w:t>
       </w:r>
-      <w:hyperlink r:id="rId13">
+      <w:hyperlink r:id="rId15">
         <w:r>
           <w:rPr>
             <w:color w:val="175C91"/>
@@ -2672,7 +2968,7 @@
         <w:rPr/>
         <w:t xml:space="preserve">This record supplies an edit-site plan, not a prepared executable patch. The actual patch must identify its path, revision and digest, attach the baseline comparison recipe, and produce native FASL/behavior and evaluated acode-ID/flag comparisons after application. Preserve Gate 0 and ARM64 same-host results at their original evidence scope; the user retired the separate second-host test on 2026-09-13 (see </w:t>
       </w:r>
-      <w:hyperlink r:id="rId14">
+      <w:hyperlink r:id="rId16">
         <w:r>
           <w:rPr>
             <w:color w:val="175C91"/>
@@ -2730,7 +3026,7 @@
         <w:rPr/>
         <w:t xml:space="preserve">Use S&lt;stage&gt;-LL&lt;nn&gt;-&lt;letter&gt; with an evidence kind and pinned test revision. The JSON inventory lists mandatory IDs, profile/candidate variants, assertions and prerequisites for each experiment phase. The </w:t>
       </w:r>
-      <w:hyperlink r:id="rId15">
+      <w:hyperlink r:id="rId17">
         <w:r>
           <w:rPr>
             <w:color w:val="175C91"/>
@@ -3313,7 +3609,7 @@
         <w:rPr/>
         <w:t xml:space="preserve">[1] x8632 architecture data and execution layouts Tag constants, widths, canonical NIL/T, cons ordering and native execution-layout exceptions. </w:t>
       </w:r>
-      <w:hyperlink r:id="rId16">
+      <w:hyperlink r:id="rId18">
         <w:r>
           <w:rPr>
             <w:color w:val="175C91"/>
@@ -3328,7 +3624,7 @@
         <w:rPr/>
         <w:t xml:space="preserve">[2] C cons layout and accessors CDR then CAR in struct cons; untagged field access. Constructor order is a separate Lisp contract. </w:t>
       </w:r>
-      <w:hyperlink r:id="rId17">
+      <w:hyperlink r:id="rId19">
         <w:r>
           <w:rPr>
             <w:color w:val="175C91"/>
@@ -3341,7 +3637,7 @@
         <w:rPr/>
         <w:t xml:space="preserve"> · </w:t>
       </w:r>
-      <w:hyperlink r:id="rId18">
+      <w:hyperlink r:id="rId20">
         <w:r>
           <w:rPr>
             <w:color w:val="175C91"/>
@@ -3356,7 +3652,7 @@
         <w:rPr/>
         <w:t xml:space="preserve">[3] 32-bit cross-loader and ARM comparison Cross-loading precedent and alternative fulltags; no adoption of native architecture conditionals by implication. </w:t>
       </w:r>
-      <w:hyperlink r:id="rId19">
+      <w:hyperlink r:id="rId21">
         <w:r>
           <w:rPr>
             <w:color w:val="175C91"/>
@@ -3369,7 +3665,7 @@
         <w:rPr/>
         <w:t xml:space="preserve"> · </w:t>
       </w:r>
-      <w:hyperlink r:id="rId20">
+      <w:hyperlink r:id="rId22">
         <w:r>
           <w:rPr>
             <w:color w:val="175C91"/>
@@ -3384,7 +3680,7 @@
         <w:rPr/>
         <w:t xml:space="preserve">[4] WebAssembly core: memory instructions Address arithmetic and nonnegative memarg offsets. Engine optimization costs are not specified. </w:t>
       </w:r>
-      <w:hyperlink r:id="rId21">
+      <w:hyperlink r:id="rId23">
         <w:r>
           <w:rPr>
             <w:color w:val="175C91"/>
@@ -3399,7 +3695,7 @@
         <w:rPr/>
         <w:t xml:space="preserve">[5] WebAssembly memory limits encoding The admitted wasm32 explicit-maximum unshared/shared encodings; exact transforms require validation. </w:t>
       </w:r>
-      <w:hyperlink r:id="rId22">
+      <w:hyperlink r:id="rId24">
         <w:r>
           <w:rPr>
             <w:color w:val="175C91"/>
@@ -3414,86 +3710,346 @@
         <w:rPr/>
         <w:t xml:space="preserve">[6] WebAssembly threads Atomic access, wait/notify distinctions, shared-memory initialization and the host-facing synchronization basis. </w:t>
       </w:r>
+      <w:hyperlink r:id="rId25">
+        <w:r>
+          <w:rPr>
+            <w:color w:val="175C91"/>
+            <w:u w:val="single"/>
+          </w:rPr>
+          <w:t xml:space="preserve">Threads overview</w:t>
+        </w:r>
+      </w:hyperlink>
+    </w:p>
+    <w:p>
+      <w:r>
+        <w:rPr/>
+        <w:t xml:space="preserve">[7] WebAssembly tail calls and multiple results Tail transfers use the callee signature and compatible result types; linear-memory Lisp-stack ownership remains an implementation contract. </w:t>
+      </w:r>
+      <w:hyperlink r:id="rId26">
+        <w:r>
+          <w:rPr>
+            <w:color w:val="175C91"/>
+            <w:u w:val="single"/>
+          </w:rPr>
+          <w:t xml:space="preserve">Tail-call overview</w:t>
+        </w:r>
+      </w:hyperlink>
+      <w:r>
+        <w:rPr/>
+        <w:t xml:space="preserve"> · </w:t>
+      </w:r>
       <w:hyperlink r:id="rId23">
         <w:r>
           <w:rPr>
             <w:color w:val="175C91"/>
             <w:u w:val="single"/>
           </w:rPr>
-          <w:t xml:space="preserve">Threads overview</w:t>
-        </w:r>
-      </w:hyperlink>
-    </w:p>
-    <w:p>
-      <w:r>
-        <w:rPr/>
-        <w:t xml:space="preserve">[7] WebAssembly tail calls and multiple results Tail transfers use the callee signature and compatible result types; linear-memory Lisp-stack ownership remains an implementation contract. </w:t>
-      </w:r>
-      <w:hyperlink r:id="rId24">
-        <w:r>
-          <w:rPr>
-            <w:color w:val="175C91"/>
-            <w:u w:val="single"/>
-          </w:rPr>
-          <w:t xml:space="preserve">Tail-call overview</w:t>
+          <w:t xml:space="preserve">Core validation</w:t>
+        </w:r>
+      </w:hyperlink>
+    </w:p>
+    <w:p>
+      <w:r>
+        <w:rPr/>
+        <w:t xml:space="preserve">[8] CCL backend and native pass 2 Native argument-register conventions are comparison evidence, not a Wasm parameter limit. </w:t>
+      </w:r>
+      <w:hyperlink r:id="rId27">
+        <w:r>
+          <w:rPr>
+            <w:color w:val="175C91"/>
+            <w:u w:val="single"/>
+          </w:rPr>
+          <w:t xml:space="preserve">backend.lisp</w:t>
         </w:r>
       </w:hyperlink>
       <w:r>
         <w:rPr/>
         <w:t xml:space="preserve"> · </w:t>
       </w:r>
-      <w:hyperlink r:id="rId21">
-        <w:r>
-          <w:rPr>
-            <w:color w:val="175C91"/>
-            <w:u w:val="single"/>
-          </w:rPr>
-          <w:t xml:space="preserve">Core validation</w:t>
-        </w:r>
-      </w:hyperlink>
-    </w:p>
-    <w:p>
-      <w:r>
-        <w:rPr/>
-        <w:t xml:space="preserve">[8] CCL backend and native pass 2 Native argument-register conventions are comparison evidence, not a Wasm parameter limit. </w:t>
-      </w:r>
-      <w:hyperlink r:id="rId25">
-        <w:r>
-          <w:rPr>
-            <w:color w:val="175C91"/>
-            <w:u w:val="single"/>
-          </w:rPr>
-          <w:t xml:space="preserve">backend.lisp</w:t>
+      <w:hyperlink r:id="rId28">
+        <w:r>
+          <w:rPr>
+            <w:color w:val="175C91"/>
+            <w:u w:val="single"/>
+          </w:rPr>
+          <w:t xml:space="preserve">x862.lisp</w:t>
+        </w:r>
+      </w:hyperlink>
+    </w:p>
+    <w:p>
+      <w:r>
+        <w:rPr/>
+        <w:t xml:space="preserve">[9] LLVM WebAssembly linker Import/export and memory/table options; signature-mismatch warnings and trapping stubs; strict link policy. </w:t>
+      </w:r>
+      <w:hyperlink r:id="rId29">
+        <w:r>
+          <w:rPr>
+            <w:color w:val="175C91"/>
+            <w:u w:val="single"/>
+          </w:rPr>
+          <w:t xml:space="preserve">LLD WebAssembly documentation</w:t>
+        </w:r>
+      </w:hyperlink>
+    </w:p>
+    <w:p>
+      <w:pPr>
+        <w:pStyle w:val="Heading1"/>
+      </w:pPr>
+      <w:r>
+        <w:rPr/>
+        <w:t xml:space="preserve">REFERENCES  /  CONTINUED</w:t>
+      </w:r>
+    </w:p>
+    <w:p>
+      <w:pPr>
+        <w:pStyle w:val="Heading2"/>
+      </w:pPr>
+      <w:r>
+        <w:rPr/>
+        <w:t xml:space="preserve">Kernel, ABI and project-document sources</w:t>
+      </w:r>
+    </w:p>
+    <w:p>
+      <w:r>
+        <w:rPr/>
+        <w:t xml:space="preserve">[10] Kernel adaptation and exact imports Portable and architecture-specific collector work must be audited together; imports.s is the exact census source. </w:t>
+      </w:r>
+      <w:hyperlink r:id="rId30">
+        <w:r>
+          <w:rPr>
+            <w:color w:val="175C91"/>
+            <w:u w:val="single"/>
+          </w:rPr>
+          <w:t xml:space="preserve">gc-common.c</w:t>
         </w:r>
       </w:hyperlink>
       <w:r>
         <w:rPr/>
         <w:t xml:space="preserve"> · </w:t>
       </w:r>
-      <w:hyperlink r:id="rId26">
-        <w:r>
-          <w:rPr>
-            <w:color w:val="175C91"/>
-            <w:u w:val="single"/>
-          </w:rPr>
-          <w:t xml:space="preserve">x862.lisp</w:t>
-        </w:r>
-      </w:hyperlink>
-    </w:p>
-    <w:p>
-      <w:r>
-        <w:rPr/>
-        <w:t xml:space="preserve">[9] LLVM WebAssembly linker Import/export and memory/table options; signature-mismatch warnings and trapping stubs; strict link policy. </w:t>
-      </w:r>
-      <w:hyperlink r:id="rId27">
-        <w:r>
-          <w:rPr>
-            <w:color w:val="175C91"/>
-            <w:u w:val="single"/>
-          </w:rPr>
-          <w:t xml:space="preserve">LLD WebAssembly documentation</w:t>
-        </w:r>
-      </w:hyperlink>
+      <w:hyperlink r:id="rId31">
+        <w:r>
+          <w:rPr>
+            <w:color w:val="175C91"/>
+            <w:u w:val="single"/>
+          </w:rPr>
+          <w:t xml:space="preserve">x86-gc.c</w:t>
+        </w:r>
+      </w:hyperlink>
+      <w:r>
+        <w:rPr/>
+        <w:t xml:space="preserve"> · </w:t>
+      </w:r>
+      <w:hyperlink r:id="rId32">
+        <w:r>
+          <w:rPr>
+            <w:color w:val="175C91"/>
+            <w:u w:val="single"/>
+          </w:rPr>
+          <w:t xml:space="preserve">image.c</w:t>
+        </w:r>
+      </w:hyperlink>
+      <w:r>
+        <w:rPr/>
+        <w:t xml:space="preserve"> · </w:t>
+      </w:r>
+      <w:hyperlink r:id="rId33">
+        <w:r>
+          <w:rPr>
+            <w:color w:val="175C91"/>
+            <w:u w:val="single"/>
+          </w:rPr>
+          <w:t xml:space="preserve">memory.c</w:t>
+        </w:r>
+      </w:hyperlink>
+      <w:r>
+        <w:rPr/>
+        <w:t xml:space="preserve"> · </w:t>
+      </w:r>
+      <w:hyperlink r:id="rId34">
+        <w:r>
+          <w:rPr>
+            <w:color w:val="175C91"/>
+            <w:u w:val="single"/>
+          </w:rPr>
+          <w:t xml:space="preserve">thread_manager.c</w:t>
+        </w:r>
+      </w:hyperlink>
+      <w:r>
+        <w:rPr/>
+        <w:t xml:space="preserve"> · </w:t>
+      </w:r>
+      <w:hyperlink r:id="rId35">
+        <w:r>
+          <w:rPr>
+            <w:color w:val="175C91"/>
+            <w:u w:val="single"/>
+          </w:rPr>
+          <w:t xml:space="preserve">imports.s</w:t>
+        </w:r>
+      </w:hyperlink>
+    </w:p>
+    <w:p>
+      <w:r>
+        <w:rPr/>
+        <w:t xml:space="preserve">[11] Native trap/check lowering inventory Previously recorded x86-64 UUO/check occurrences remain a worklist to reconcile with evaluated census records. </w:t>
+      </w:r>
+      <w:hyperlink r:id="rId36">
+        <w:r>
+          <w:rPr>
+            <w:color w:val="175C91"/>
+            <w:u w:val="single"/>
+          </w:rPr>
+          <w:t xml:space="preserve">x8664-vinsns.lisp</w:t>
+        </w:r>
+      </w:hyperlink>
+    </w:p>
+    <w:p>
+      <w:r>
+        <w:rPr/>
+        <w:t xml:space="preserve">[12] WebAssembly heterogeneous function tables and call-site types Core control instructions and call_indirect / return_call_indirect validation. A static expected type belongs to the call site; incompatible table entries trap before entry. </w:t>
+      </w:r>
+      <w:hyperlink r:id="rId37">
+        <w:r>
+          <w:rPr>
+            <w:color w:val="175C91"/>
+            <w:u w:val="single"/>
+          </w:rPr>
+          <w:t xml:space="preserve">Core: control instructions</w:t>
+        </w:r>
+      </w:hyperlink>
+      <w:r>
+        <w:rPr/>
+        <w:t xml:space="preserve"> · </w:t>
+      </w:r>
+      <w:hyperlink r:id="rId23">
+        <w:r>
+          <w:rPr>
+            <w:color w:val="175C91"/>
+            <w:u w:val="single"/>
+          </w:rPr>
+          <w:t xml:space="preserve">Core: validation and execution</w:t>
+        </w:r>
+      </w:hyperlink>
+    </w:p>
+    <w:p>
+      <w:r>
+        <w:rPr/>
+        <w:t xml:space="preserve">[13] WebAssembly Basic C ABI Scalar versus aggregate parameter/result passing; address-taken locals and the linear C stack. </w:t>
+      </w:r>
+      <w:hyperlink r:id="rId38">
+        <w:r>
+          <w:rPr>
+            <w:color w:val="175C91"/>
+            <w:u w:val="single"/>
+          </w:rPr>
+          <w:t xml:space="preserve">BasicCABI.md</w:t>
+        </w:r>
+      </w:hyperlink>
+    </w:p>
+    <w:p>
+      <w:r>
+        <w:rPr/>
+        <w:t xml:space="preserve">[14] WebAssembly linking conventions Process-once initialization with passive segments and per-thread storage conventions; verify the actual linked output. </w:t>
+      </w:r>
+      <w:hyperlink r:id="rId39">
+        <w:r>
+          <w:rPr>
+            <w:color w:val="175C91"/>
+            <w:u w:val="single"/>
+          </w:rPr>
+          <w:t xml:space="preserve">Linking.md</w:t>
+        </w:r>
+      </w:hyperlink>
+    </w:p>
+    <w:p>
+      <w:r>
+        <w:rPr/>
+        <w:t xml:space="preserve">[15] Common Lisp ordinary lambda lists and calls Required, optional, rest and keyword arguments; FUNCALL/APPLY semantics. A supplied count does not determine callee convention. </w:t>
+      </w:r>
+      <w:hyperlink r:id="rId40">
+        <w:r>
+          <w:rPr>
+            <w:color w:val="175C91"/>
+            <w:u w:val="single"/>
+          </w:rPr>
+          <w:t xml:space="preserve">Lambda lists</w:t>
+        </w:r>
+      </w:hyperlink>
+      <w:r>
+        <w:rPr/>
+        <w:t xml:space="preserve"> · </w:t>
+      </w:r>
+      <w:hyperlink r:id="rId41">
+        <w:r>
+          <w:rPr>
+            <w:color w:val="175C91"/>
+            <w:u w:val="single"/>
+          </w:rPr>
+          <w:t xml:space="preserve">FUNCALL</w:t>
+        </w:r>
+      </w:hyperlink>
+      <w:r>
+        <w:rPr/>
+        <w:t xml:space="preserve"> · </w:t>
+      </w:r>
+      <w:hyperlink r:id="rId42">
+        <w:r>
+          <w:rPr>
+            <w:color w:val="175C91"/>
+            <w:u w:val="single"/>
+          </w:rPr>
+          <w:t xml:space="preserve">APPLY</w:t>
+        </w:r>
+      </w:hyperlink>
+    </w:p>
+    <w:p>
+      <w:r>
+        <w:rPr/>
+        <w:t xml:space="preserve">[16] WebAssembly numeric semantics Floating-point operation and operand cases; result classification alone is not a CCL condition policy. </w:t>
+      </w:r>
+      <w:hyperlink r:id="rId43">
+        <w:r>
+          <w:rPr>
+            <w:color w:val="175C91"/>
+            <w:u w:val="single"/>
+          </w:rPr>
+          <w:t xml:space="preserve">Core numerics</w:t>
+        </w:r>
+      </w:hyperlink>
+    </w:p>
+    <w:p>
+      <w:r>
+        <w:rPr/>
+        <w:t xml:space="preserve">[17] Coordinated project-document authority Port Outline v0.17; Acceptance Policy and Regression Register v1.7; Stage 0 Desk Decisions v1.8. The outline owns architecture scope, the register owns acceptance and obligation metadata, and this record owns D1–D7 choices and protocols. Source inputs are identified below.</w:t>
+      </w:r>
+    </w:p>
+    <w:p>
+      <w:r>
+        <w:rPr/>
+        <w:t xml:space="preserve">[18] Agreed decision amendments, reaffirmed 11 September 2026 Project exchange confirming the v1.2 agreement: decided statuses and reversal criteria; owner-only CAS acquisition and atomic-store release; parity admission/root reload; final membership rescan; host-acknowledged cancellation; and the then-current baseline-first incremental H(G) accounting, superseded by the user’s later instruction to make H(G) optional future work. The date identifies the confirmation exchange, not this file’s revision or an inferred earlier message timestamp.</w:t>
+      </w:r>
+    </w:p>
+    <w:p>
+      <w:r>
+        <w:rPr/>
+        <w:t xml:space="preserve">[19] Interrupt-wake and companion consistency corrections, 11 September 2026 Project exchange requiring wake-up of a FOREIGN I/O waiter through INTERRUPTED status and notification, admission before interrupt service, retention of its outstanding descriptor, a S0-LL20-b schedule, conditional G/E_k stub wording, separate logical IDs and slots, and corrected revision/exchange dates.</w:t>
+      </w:r>
+    </w:p>
+    <w:p>
+      <w:pPr>
+        <w:pStyle w:val="Heading3"/>
+      </w:pPr>
+      <w:r>
+        <w:rPr/>
+        <w:t xml:space="preserve">Input identity</w:t>
+      </w:r>
+    </w:p>
+    <w:p>
+      <w:r>
+        <w:rPr/>
+        <w:t xml:space="preserve">The complete original v0.12/v1.2/v1.3 input files and their SHA-256 digests are retained in history/2026-09-11-inputs and history/inputs.json. That preserved v1.3 decision record contains the earlier v0.11/v1.1/v1.2 input hashes. New DOCX reading copies are generated from the current Markdown; tools/manage.py checks both source and generated identities.</w:t>
+      </w:r>
     </w:p>
     <w:p>
       <w:pPr>
@@ -3501,266 +4057,6 @@
       </w:pPr>
       <w:r>
         <w:rPr/>
-        <w:t xml:space="preserve">REFERENCES  /  CONTINUED</w:t>
-      </w:r>
-    </w:p>
-    <w:p>
-      <w:pPr>
-        <w:pStyle w:val="Heading2"/>
-      </w:pPr>
-      <w:r>
-        <w:rPr/>
-        <w:t xml:space="preserve">Kernel, ABI and project-document sources</w:t>
-      </w:r>
-    </w:p>
-    <w:p>
-      <w:r>
-        <w:rPr/>
-        <w:t xml:space="preserve">[10] Kernel adaptation and exact imports Portable and architecture-specific collector work must be audited together; imports.s is the exact census source. </w:t>
-      </w:r>
-      <w:hyperlink r:id="rId28">
-        <w:r>
-          <w:rPr>
-            <w:color w:val="175C91"/>
-            <w:u w:val="single"/>
-          </w:rPr>
-          <w:t xml:space="preserve">gc-common.c</w:t>
-        </w:r>
-      </w:hyperlink>
-      <w:r>
-        <w:rPr/>
-        <w:t xml:space="preserve"> · </w:t>
-      </w:r>
-      <w:hyperlink r:id="rId29">
-        <w:r>
-          <w:rPr>
-            <w:color w:val="175C91"/>
-            <w:u w:val="single"/>
-          </w:rPr>
-          <w:t xml:space="preserve">x86-gc.c</w:t>
-        </w:r>
-      </w:hyperlink>
-      <w:r>
-        <w:rPr/>
-        <w:t xml:space="preserve"> · </w:t>
-      </w:r>
-      <w:hyperlink r:id="rId30">
-        <w:r>
-          <w:rPr>
-            <w:color w:val="175C91"/>
-            <w:u w:val="single"/>
-          </w:rPr>
-          <w:t xml:space="preserve">image.c</w:t>
-        </w:r>
-      </w:hyperlink>
-      <w:r>
-        <w:rPr/>
-        <w:t xml:space="preserve"> · </w:t>
-      </w:r>
-      <w:hyperlink r:id="rId31">
-        <w:r>
-          <w:rPr>
-            <w:color w:val="175C91"/>
-            <w:u w:val="single"/>
-          </w:rPr>
-          <w:t xml:space="preserve">memory.c</w:t>
-        </w:r>
-      </w:hyperlink>
-      <w:r>
-        <w:rPr/>
-        <w:t xml:space="preserve"> · </w:t>
-      </w:r>
-      <w:hyperlink r:id="rId32">
-        <w:r>
-          <w:rPr>
-            <w:color w:val="175C91"/>
-            <w:u w:val="single"/>
-          </w:rPr>
-          <w:t xml:space="preserve">thread_manager.c</w:t>
-        </w:r>
-      </w:hyperlink>
-      <w:r>
-        <w:rPr/>
-        <w:t xml:space="preserve"> · </w:t>
-      </w:r>
-      <w:hyperlink r:id="rId33">
-        <w:r>
-          <w:rPr>
-            <w:color w:val="175C91"/>
-            <w:u w:val="single"/>
-          </w:rPr>
-          <w:t xml:space="preserve">imports.s</w:t>
-        </w:r>
-      </w:hyperlink>
-    </w:p>
-    <w:p>
-      <w:r>
-        <w:rPr/>
-        <w:t xml:space="preserve">[11] Native trap/check lowering inventory Previously recorded x86-64 UUO/check occurrences remain a worklist to reconcile with evaluated census records. </w:t>
-      </w:r>
-      <w:hyperlink r:id="rId34">
-        <w:r>
-          <w:rPr>
-            <w:color w:val="175C91"/>
-            <w:u w:val="single"/>
-          </w:rPr>
-          <w:t xml:space="preserve">x8664-vinsns.lisp</w:t>
-        </w:r>
-      </w:hyperlink>
-    </w:p>
-    <w:p>
-      <w:r>
-        <w:rPr/>
-        <w:t xml:space="preserve">[12] WebAssembly heterogeneous function tables and call-site types Core control instructions and call_indirect / return_call_indirect validation. A static expected type belongs to the call site; incompatible table entries trap before entry. </w:t>
-      </w:r>
-      <w:hyperlink r:id="rId35">
-        <w:r>
-          <w:rPr>
-            <w:color w:val="175C91"/>
-            <w:u w:val="single"/>
-          </w:rPr>
-          <w:t xml:space="preserve">Core: control instructions</w:t>
-        </w:r>
-      </w:hyperlink>
-      <w:r>
-        <w:rPr/>
-        <w:t xml:space="preserve"> · </w:t>
-      </w:r>
-      <w:hyperlink r:id="rId21">
-        <w:r>
-          <w:rPr>
-            <w:color w:val="175C91"/>
-            <w:u w:val="single"/>
-          </w:rPr>
-          <w:t xml:space="preserve">Core: validation and execution</w:t>
-        </w:r>
-      </w:hyperlink>
-    </w:p>
-    <w:p>
-      <w:r>
-        <w:rPr/>
-        <w:t xml:space="preserve">[13] WebAssembly Basic C ABI Scalar versus aggregate parameter/result passing; address-taken locals and the linear C stack. </w:t>
-      </w:r>
-      <w:hyperlink r:id="rId36">
-        <w:r>
-          <w:rPr>
-            <w:color w:val="175C91"/>
-            <w:u w:val="single"/>
-          </w:rPr>
-          <w:t xml:space="preserve">BasicCABI.md</w:t>
-        </w:r>
-      </w:hyperlink>
-    </w:p>
-    <w:p>
-      <w:r>
-        <w:rPr/>
-        <w:t xml:space="preserve">[14] WebAssembly linking conventions Process-once initialization with passive segments and per-thread storage conventions; verify the actual linked output. </w:t>
-      </w:r>
-      <w:hyperlink r:id="rId37">
-        <w:r>
-          <w:rPr>
-            <w:color w:val="175C91"/>
-            <w:u w:val="single"/>
-          </w:rPr>
-          <w:t xml:space="preserve">Linking.md</w:t>
-        </w:r>
-      </w:hyperlink>
-    </w:p>
-    <w:p>
-      <w:r>
-        <w:rPr/>
-        <w:t xml:space="preserve">[15] Common Lisp ordinary lambda lists and calls Required, optional, rest and keyword arguments; FUNCALL/APPLY semantics. A supplied count does not determine callee convention. </w:t>
-      </w:r>
-      <w:hyperlink r:id="rId38">
-        <w:r>
-          <w:rPr>
-            <w:color w:val="175C91"/>
-            <w:u w:val="single"/>
-          </w:rPr>
-          <w:t xml:space="preserve">Lambda lists</w:t>
-        </w:r>
-      </w:hyperlink>
-      <w:r>
-        <w:rPr/>
-        <w:t xml:space="preserve"> · </w:t>
-      </w:r>
-      <w:hyperlink r:id="rId39">
-        <w:r>
-          <w:rPr>
-            <w:color w:val="175C91"/>
-            <w:u w:val="single"/>
-          </w:rPr>
-          <w:t xml:space="preserve">FUNCALL</w:t>
-        </w:r>
-      </w:hyperlink>
-      <w:r>
-        <w:rPr/>
-        <w:t xml:space="preserve"> · </w:t>
-      </w:r>
-      <w:hyperlink r:id="rId40">
-        <w:r>
-          <w:rPr>
-            <w:color w:val="175C91"/>
-            <w:u w:val="single"/>
-          </w:rPr>
-          <w:t xml:space="preserve">APPLY</w:t>
-        </w:r>
-      </w:hyperlink>
-    </w:p>
-    <w:p>
-      <w:r>
-        <w:rPr/>
-        <w:t xml:space="preserve">[16] WebAssembly numeric semantics Floating-point operation and operand cases; result classification alone is not a CCL condition policy. </w:t>
-      </w:r>
-      <w:hyperlink r:id="rId41">
-        <w:r>
-          <w:rPr>
-            <w:color w:val="175C91"/>
-            <w:u w:val="single"/>
-          </w:rPr>
-          <w:t xml:space="preserve">Core numerics</w:t>
-        </w:r>
-      </w:hyperlink>
-    </w:p>
-    <w:p>
-      <w:r>
-        <w:rPr/>
-        <w:t xml:space="preserve">[17] Coordinated project-document authority Port Outline v0.17; Acceptance Policy and Regression Register v1.7; Stage 0 Desk Decisions v1.8. The outline owns architecture scope, the register owns acceptance and obligation metadata, and this record owns D1–D7 choices and protocols. Source inputs are identified below.</w:t>
-      </w:r>
-    </w:p>
-    <w:p>
-      <w:r>
-        <w:rPr/>
-        <w:t xml:space="preserve">[18] Agreed decision amendments, reaffirmed 11 September 2026 Project exchange confirming the v1.2 agreement: decided statuses and reversal criteria; owner-only CAS acquisition and atomic-store release; parity admission/root reload; final membership rescan; host-acknowledged cancellation; and the then-current baseline-first incremental H(G) accounting, superseded by the user’s later instruction to make H(G) optional future work. The date identifies the confirmation exchange, not this file’s revision or an inferred earlier message timestamp.</w:t>
-      </w:r>
-    </w:p>
-    <w:p>
-      <w:r>
-        <w:rPr/>
-        <w:t xml:space="preserve">[19] Interrupt-wake and companion consistency corrections, 11 September 2026 Project exchange requiring wake-up of a FOREIGN I/O waiter through INTERRUPTED status and notification, admission before interrupt service, retention of its outstanding descriptor, a S0-LL20-b schedule, conditional G/E_k stub wording, separate logical IDs and slots, and corrected revision/exchange dates.</w:t>
-      </w:r>
-    </w:p>
-    <w:p>
-      <w:pPr>
-        <w:pStyle w:val="Heading3"/>
-      </w:pPr>
-      <w:r>
-        <w:rPr/>
-        <w:t xml:space="preserve">Input identity</w:t>
-      </w:r>
-    </w:p>
-    <w:p>
-      <w:r>
-        <w:rPr/>
-        <w:t xml:space="preserve">The complete original v0.12/v1.2/v1.3 input files and their SHA-256 digests are retained in history/2026-09-11-inputs and history/inputs.json. That preserved v1.3 decision record contains the earlier v0.11/v1.1/v1.2 input hashes. New DOCX reading copies are generated from the current Markdown; tools/manage.py checks both source and generated identities.</w:t>
-      </w:r>
-    </w:p>
-    <w:p>
-      <w:pPr>
-        <w:pStyle w:val="Heading1"/>
-      </w:pPr>
-      <w:r>
-        <w:rPr/>
         <w:t xml:space="preserve">24 September 2026 — READY image decision amended: a cross-loaded boot replaces projection</w:t>
       </w:r>
     </w:p>
@@ -3787,7 +4083,7 @@
         <w:rPr/>
         <w:t xml:space="preserve">namespaces"), asked for a plan (</w:t>
       </w:r>
-      <w:hyperlink r:id="rId42">
+      <w:hyperlink r:id="rId44">
         <w:r>
           <w:rPr>
             <w:color w:val="175C91"/>
@@ -3806,7 +4102,7 @@
         <w:rPr/>
         <w:t xml:space="preserve">had Codex review it (</w:t>
       </w:r>
-      <w:hyperlink r:id="rId43">
+      <w:hyperlink r:id="rId45">
         <w:r>
           <w:rPr>
             <w:color w:val="175C91"/>
@@ -3863,7 +4159,7 @@
         <w:rPr/>
         <w:t xml:space="preserve">   </w:t>
       </w:r>
-      <w:hyperlink r:id="rId44">
+      <w:hyperlink r:id="rId46">
         <w:r>
           <w:rPr>
             <w:color w:val="175C91"/>
@@ -3993,6 +4289,573 @@
       <w:r>
         <w:rPr/>
         <w:t xml:space="preserve">branch, for Codex to import with NSL-P2; nothing else in this file changes.</w:t>
+      </w:r>
+    </w:p>
+    <w:p>
+      <w:pPr>
+        <w:pStyle w:val="Heading1"/>
+      </w:pPr>
+      <w:r>
+        <w:rPr/>
+        <w:t xml:space="preserve">Module consolidation — 27 September 2026</w:t>
+      </w:r>
+    </w:p>
+    <w:p>
+      <w:r>
+        <w:rPr/>
+        <w:t xml:space="preserve">After READY at </w:t>
+      </w:r>
+      <w:r>
+        <w:rPr>
+          <w:rFonts w:ascii="Consolas" w:hAnsi="Consolas"/>
+        </w:rPr>
+        <w:t xml:space="preserve">ea82d8e7</w:t>
+      </w:r>
+      <w:r>
+        <w:rPr/>
+        <w:t xml:space="preserve">, the user identified the module count as the cause</w:t>
+      </w:r>
+    </w:p>
+    <w:p>
+      <w:r>
+        <w:rPr/>
+        <w:t xml:space="preserve">of the slow launch and asked for a plan to reduce it "to a small number".</w:t>
+      </w:r>
+    </w:p>
+    <w:p>
+      <w:r>
+        <w:rPr/>
+        <w:t xml:space="preserve">Claude measured the READY inputs and wrote</w:t>
+      </w:r>
+    </w:p>
+    <w:p>
+      <w:hyperlink r:id="rId47">
+        <w:r>
+          <w:rPr>
+            <w:color w:val="175C91"/>
+            <w:u w:val="single"/>
+          </w:rPr>
+          <w:t xml:space="preserve">MCP-P1</w:t>
+        </w:r>
+      </w:hyperlink>
+      <w:r>
+        <w:rPr/>
+        <w:t xml:space="preserve">; Codex reviewed three rounds</w:t>
+      </w:r>
+    </w:p>
+    <w:p>
+      <w:r>
+        <w:rPr/>
+        <w:t xml:space="preserve">(P2: seven findings, P3: four corrections, P4: three corrections) and judged</w:t>
+      </w:r>
+    </w:p>
+    <w:p>
+      <w:r>
+        <w:rPr/>
+        <w:t xml:space="preserve">P4 valid for implementation. The user then answered "Yes to all three":</w:t>
+      </w:r>
+    </w:p>
+    <w:p>
+      <w:r>
+        <w:rPr/>
+        <w:t xml:space="preserve">1. </w:t>
+      </w:r>
+      <w:r>
+        <w:rPr>
+          <w:b/>
+        </w:rPr>
+        <w:t xml:space="preserve">Target.</w:t>
+      </w:r>
+      <w:r>
+        <w:rPr/>
+        <w:t xml:space="preserve"> Seven product engine modules at READY: the four services, the</w:t>
+      </w:r>
+    </w:p>
+    <w:p>
+      <w:r>
+        <w:rPr/>
+        <w:t xml:space="preserve">   host-call adapter, one level-0 boot archive and one level-1 runtime</w:t>
+      </w:r>
+    </w:p>
+    <w:p>
+      <w:r>
+        <w:rPr/>
+        <w:t xml:space="preserve">   archive, with helpers shared once per archive (Q-A).</w:t>
+      </w:r>
+    </w:p>
+    <w:p>
+      <w:r>
+        <w:rPr/>
+        <w:t xml:space="preserve">2. </w:t>
+      </w:r>
+      <w:r>
+        <w:rPr>
+          <w:b/>
+        </w:rPr>
+        <w:t xml:space="preserve">Timing of compilation.</w:t>
+      </w:r>
+      <w:r>
+        <w:rPr/>
+        <w:t xml:space="preserve"> An archive is compiled and its first generation</w:t>
+      </w:r>
+    </w:p>
+    <w:p>
+      <w:r>
+        <w:rPr/>
+        <w:t xml:space="preserve">   instantiated at Worker start; every unit is still published at opcode 72</w:t>
+      </w:r>
+    </w:p>
+    <w:p>
+      <w:r>
+        <w:rPr/>
+        <w:t xml:space="preserve">   in native load order, so the NSL-P2 install-on-request rule holds for</w:t>
+      </w:r>
+    </w:p>
+    <w:p>
+      <w:r>
+        <w:rPr/>
+        <w:t xml:space="preserve">   all table, registry and root state (Q-B).</w:t>
+      </w:r>
+    </w:p>
+    <w:p>
+      <w:r>
+        <w:rPr/>
+        <w:t xml:space="preserve">3. </w:t>
+      </w:r>
+      <w:r>
+        <w:rPr>
+          <w:b/>
+        </w:rPr>
+        <w:t xml:space="preserve">Sequence.</w:t>
+      </w:r>
+      <w:r>
+        <w:rPr/>
+        <w:t xml:space="preserve"> One bounded, instrumented baseline run to READY precedes</w:t>
+      </w:r>
+    </w:p>
+    <w:p>
+      <w:r>
+        <w:rPr/>
+        <w:t xml:space="preserve">   implementation, with a timeout and partial results retained (Q-C, P-0).</w:t>
+      </w:r>
+    </w:p>
+    <w:p>
+      <w:r>
+        <w:rPr/>
+        <w:t xml:space="preserve">The plan promises no READY time; the measured facts are its F items. The</w:t>
+      </w:r>
+    </w:p>
+    <w:p>
+      <w:r>
+        <w:rPr/>
+        <w:t xml:space="preserve">user also recorded a future direction, guarded direct calls to CL-package</w:t>
+      </w:r>
+    </w:p>
+    <w:p>
+      <w:r>
+        <w:rPr/>
+        <w:t xml:space="preserve">functions inside the archive (A-13, P-6), outside this plan's packets.</w:t>
+      </w:r>
+    </w:p>
+    <w:p>
+      <w:r>
+        <w:rPr/>
+        <w:t xml:space="preserve">The entry is made by Claude on the user's instruction, on the plan branch,</w:t>
+      </w:r>
+    </w:p>
+    <w:p>
+      <w:r>
+        <w:rPr/>
+        <w:t xml:space="preserve">for Codex to import; nothing else in this file changes.</w:t>
+      </w:r>
+    </w:p>
+    <w:p>
+      <w:pPr>
+        <w:pStyle w:val="Heading1"/>
+      </w:pPr>
+      <w:r>
+        <w:rPr/>
+        <w:t xml:space="preserve">Module consolidation sizing amendment — 27 September 2026</w:t>
+      </w:r>
+    </w:p>
+    <w:p>
+      <w:r>
+        <w:rPr/>
+        <w:t xml:space="preserve">After P-0 (</w:t>
+      </w:r>
+      <w:r>
+        <w:rPr>
+          <w:rFonts w:ascii="Consolas" w:hAnsi="Consolas"/>
+        </w:rPr>
+        <w:t xml:space="preserve">0675ba83</w:t>
+      </w:r>
+      <w:r>
+        <w:rPr/>
+        <w:t xml:space="preserve">) and Codex's comparison with native CCL32 startup</w:t>
+      </w:r>
+    </w:p>
+    <w:p>
+      <w:r>
+        <w:rPr/>
+        <w:t xml:space="preserve">defaults, the user directed: "update the plan". </w:t>
+      </w:r>
+      <w:hyperlink r:id="rId47">
+        <w:r>
+          <w:rPr>
+            <w:color w:val="175C91"/>
+            <w:u w:val="single"/>
+          </w:rPr>
+          <w:t xml:space="preserve">MCP-P6</w:t>
+        </w:r>
+      </w:hyperlink>
+    </w:p>
+    <w:p>
+      <w:r>
+        <w:rPr/>
+        <w:t xml:space="preserve">records the proposed starting configuration in A-14: two 32 MiB heap spaces,</w:t>
+      </w:r>
+    </w:p>
+    <w:p>
+      <w:r>
+        <w:rPr/>
+        <w:t xml:space="preserve">a 16 MiB post-GC free-space target, 1 MiB Lisp value and explicit control</w:t>
+      </w:r>
+    </w:p>
+    <w:p>
+      <w:r>
+        <w:rPr/>
+        <w:t xml:space="preserve">areas, and a 512 KiB temporary-object stack. The approximately 192 MiB</w:t>
+      </w:r>
+    </w:p>
+    <w:p>
+      <w:r>
+        <w:rPr/>
+        <w:t xml:space="preserve">initial linear-memory budget includes collector scratch and runtime areas;</w:t>
+      </w:r>
+    </w:p>
+    <w:p>
+      <w:r>
+        <w:rPr/>
+        <w:t xml:space="preserve">it is subject to layout/capacity checks and is not a process-RSS projection.</w:t>
+      </w:r>
+    </w:p>
+    <w:p>
+      <w:r>
+        <w:rPr/>
+        <w:t xml:space="preserve">P-1 now includes headroom-based heap growth, publication of root ranges under</w:t>
+      </w:r>
+    </w:p>
+    <w:p>
+      <w:r>
+        <w:rPr/>
+        <w:t xml:space="preserve">the existing generation/rollback contract, and bounded comparisons of</w:t>
+      </w:r>
+    </w:p>
+    <w:p>
+      <w:r>
+        <w:rPr/>
+        <w:t xml:space="preserve">16/32/64 MiB initial spaces. These are configurations to measure, not proven</w:t>
+      </w:r>
+    </w:p>
+    <w:p>
+      <w:r>
+        <w:rPr/>
+        <w:t xml:space="preserve">optima. The executed P-0 baseline is retained. Seven product modules, target</w:t>
+      </w:r>
+    </w:p>
+    <w:p>
+      <w:r>
+        <w:rPr/>
+        <w:t xml:space="preserve">FASL publication order and the future scope of direct calls remain as adopted.</w:t>
+      </w:r>
+    </w:p>
+    <w:p>
+      <w:r>
+        <w:rPr/>
+        <w:t xml:space="preserve">This entry updates the plan; it does not record implementation or acceptance</w:t>
+      </w:r>
+    </w:p>
+    <w:p>
+      <w:r>
+        <w:rPr/>
+        <w:t xml:space="preserve">of the archive, collector-range or sizing changes.</w:t>
+      </w:r>
+    </w:p>
+    <w:p>
+      <w:pPr>
+        <w:pStyle w:val="Heading1"/>
+      </w:pPr>
+      <w:r>
+        <w:rPr/>
+        <w:t xml:space="preserve">Module consolidation input-lifetime amendment — 27 September 2026</w:t>
+      </w:r>
+    </w:p>
+    <w:p>
+      <w:r>
+        <w:rPr/>
+        <w:t xml:space="preserve">The user asked whether loading data could be read, used and dereferenced so</w:t>
+      </w:r>
+    </w:p>
+    <w:p>
+      <w:r>
+        <w:rPr/>
+        <w:t xml:space="preserve">JavaScript GC could reclaim it during launch, then directed: "update the</w:t>
+      </w:r>
+    </w:p>
+    <w:p>
+      <w:r>
+        <w:rPr/>
+        <w:t xml:space="preserve">plan". </w:t>
+      </w:r>
+      <w:hyperlink r:id="rId47">
+        <w:r>
+          <w:rPr>
+            <w:color w:val="175C91"/>
+            <w:u w:val="single"/>
+          </w:rPr>
+          <w:t xml:space="preserve">MCP-P7</w:t>
+        </w:r>
+      </w:hyperlink>
+      <w:r>
+        <w:rPr/>
+        <w:t xml:space="preserve">, A-16, makes bounded</w:t>
+      </w:r>
+    </w:p>
+    <w:p>
+      <w:r>
+        <w:rPr/>
+        <w:t xml:space="preserve">staging and explicit buffer ownership/release requirements of P-1. Archive</w:t>
+      </w:r>
+    </w:p>
+    <w:p>
+      <w:r>
+        <w:rPr/>
+        <w:t xml:space="preserve">inputs belong to the admission Worker, reached by direct read or ownership</w:t>
+      </w:r>
+    </w:p>
+    <w:p>
+      <w:r>
+        <w:rPr/>
+        <w:t xml:space="preserve">transfer; temporary binaries, decoded manifests and closed-session data are</w:t>
+      </w:r>
+    </w:p>
+    <w:p>
+      <w:r>
+        <w:rPr/>
+        <w:t xml:space="preserve">released after their last use, on success and failure. Compact authenticated</w:t>
+      </w:r>
+    </w:p>
+    <w:p>
+      <w:r>
+        <w:rPr/>
+        <w:t xml:space="preserve">metadata and live executable generations remain available for repeated LOAD.</w:t>
+      </w:r>
+    </w:p>
+    <w:p>
+      <w:r>
+        <w:rPr/>
+        <w:t xml:space="preserve">The small FASL set may stay resident; evicted bytes require authenticated</w:t>
+      </w:r>
+    </w:p>
+    <w:p>
+      <w:r>
+        <w:rPr/>
+        <w:t xml:space="preserve">rereads from the configured read-only backing store.</w:t>
+      </w:r>
+    </w:p>
+    <w:p>
+      <w:r>
+        <w:rPr/>
+        <w:t xml:space="preserve">P-1 verifies actual retaining paths, failure cleanup and repeated LOAD, and</w:t>
+      </w:r>
+    </w:p>
+    <w:p>
+      <w:r>
+        <w:rPr/>
+        <w:t xml:space="preserve">measures owned input bytes alongside peak/READY memory; P-2 extends the gates</w:t>
+      </w:r>
+    </w:p>
+    <w:p>
+      <w:r>
+        <w:rPr/>
+        <w:t xml:space="preserve">to boot. Making data collectible does not promise immediate GC or RSS return.</w:t>
+      </w:r>
+    </w:p>
+    <w:p>
+      <w:r>
+        <w:rPr/>
+        <w:t xml:space="preserve">The prior Worker-heap figure is not manifest-only, and the residual after</w:t>
+      </w:r>
+    </w:p>
+    <w:p>
+      <w:r>
+        <w:rPr/>
+        <w:t xml:space="preserve">subtracting counters from RSS is not measured engine memory. This is a plan</w:t>
+      </w:r>
+    </w:p>
+    <w:p>
+      <w:r>
+        <w:rPr/>
+        <w:t xml:space="preserve">amendment only; implementation and memory savings remain to be verified.</w:t>
+      </w:r>
+    </w:p>
+    <w:p>
+      <w:pPr>
+        <w:pStyle w:val="Heading1"/>
+      </w:pPr>
+      <w:r>
+        <w:rPr/>
+        <w:t xml:space="preserve">Module consolidation review amendments — 27 September 2026</w:t>
+      </w:r>
+    </w:p>
+    <w:p>
+      <w:r>
+        <w:rPr/>
+        <w:t xml:space="preserve">The user relayed </w:t>
+      </w:r>
+      <w:hyperlink r:id="rId48">
+        <w:r>
+          <w:rPr>
+            <w:color w:val="175C91"/>
+            <w:u w:val="single"/>
+          </w:rPr>
+          <w:t xml:space="preserve">Claude's P6/P7 review</w:t>
+        </w:r>
+      </w:hyperlink>
+      <w:r>
+        <w:rPr/>
+        <w:t xml:space="preserve">,</w:t>
+      </w:r>
+    </w:p>
+    <w:p>
+      <w:r>
+        <w:rPr/>
+        <w:t xml:space="preserve">committed as </w:t>
+      </w:r>
+      <w:r>
+        <w:rPr>
+          <w:rFonts w:ascii="Consolas" w:hAnsi="Consolas"/>
+        </w:rPr>
+        <w:t xml:space="preserve">0a7cd736</w:t>
+      </w:r>
+      <w:r>
+        <w:rPr/>
+        <w:t xml:space="preserve">, for import. Codex imported that commit unchanged and</w:t>
+      </w:r>
+    </w:p>
+    <w:p>
+      <w:r>
+        <w:rPr/>
+        <w:t xml:space="preserve">incorporated its four amendments in </w:t>
+      </w:r>
+      <w:hyperlink r:id="rId47">
+        <w:r>
+          <w:rPr>
+            <w:color w:val="175C91"/>
+            <w:u w:val="single"/>
+          </w:rPr>
+          <w:t xml:space="preserve">MCP-P8</w:t>
+        </w:r>
+      </w:hyperlink>
+      <w:r>
+        <w:rPr/>
+        <w:t xml:space="preserve">.</w:t>
+      </w:r>
+    </w:p>
+    <w:p>
+      <w:r>
+        <w:rPr/>
+        <w:t xml:space="preserve">This records implementation sequencing within the already adopted scope:</w:t>
+      </w:r>
+    </w:p>
+    <w:p>
+      <w:r>
+        <w:rPr/>
+        <w:t xml:space="preserve">1. P-1a consolidates the runtime archive and adds host-side root slices;</w:t>
+      </w:r>
+    </w:p>
+    <w:p>
+      <w:r>
+        <w:rPr/>
+        <w:t xml:space="preserve">   P-2 follows to consolidate boot. Heap/stack sizes, growth policy and the</w:t>
+      </w:r>
+    </w:p>
+    <w:p>
+      <w:r>
+        <w:rPr/>
+        <w:t xml:space="preserve">   C collector's root-list interface stay fixed during those steps.</w:t>
+      </w:r>
+    </w:p>
+    <w:p>
+      <w:r>
+        <w:rPr/>
+        <w:t xml:space="preserve">2. P-1b implements sizing and growth policy with the bounded 16/32/64 MiB</w:t>
+      </w:r>
+    </w:p>
+    <w:p>
+      <w:r>
+        <w:rPr/>
+        <w:t xml:space="preserve">   comparison. GC observation separates host preparation from the C call</w:t>
+      </w:r>
+    </w:p>
+    <w:p>
+      <w:r>
+        <w:rPr/>
+        <w:t xml:space="preserve">   and records root counts and used/live bytes per collection.</w:t>
+      </w:r>
+    </w:p>
+    <w:p>
+      <w:r>
+        <w:rPr/>
+        <w:t xml:space="preserve">3. P-1c implements input ownership/release on the measured configuration.</w:t>
+      </w:r>
+    </w:p>
+    <w:p>
+      <w:r>
+        <w:rPr/>
+        <w:t xml:space="preserve">   The main thread remains the file host and retains the approximately</w:t>
+      </w:r>
+    </w:p>
+    <w:p>
+      <w:r>
+        <w:rPr/>
+        <w:t xml:space="preserve">   5.8 MB FASL set; archive inputs and validation belong to the Worker.</w:t>
+      </w:r>
+    </w:p>
+    <w:p>
+      <w:r>
+        <w:rPr/>
+        <w:t xml:space="preserve">Each step compares with both F-13 and its measured predecessor. Sizing and</w:t>
+      </w:r>
+    </w:p>
+    <w:p>
+      <w:r>
+        <w:rPr/>
+        <w:t xml:space="preserve">release do not gate consolidation. A collector range interface is optional</w:t>
+      </w:r>
+    </w:p>
+    <w:p>
+      <w:r>
+        <w:rPr/>
+        <w:t xml:space="preserve">P-7, decided from residual GC measurements and requiring collector/owner</w:t>
+      </w:r>
+    </w:p>
+    <w:p>
+      <w:r>
+        <w:rPr/>
+        <w:t xml:space="preserve">requalification and independent review before acceptance. The existing P-0</w:t>
+      </w:r>
+    </w:p>
+    <w:p>
+      <w:r>
+        <w:rPr/>
+        <w:t xml:space="preserve">baseline is reused. This amendment records no runtime changes or new runs;</w:t>
+      </w:r>
+    </w:p>
+    <w:p>
+      <w:r>
+        <w:rPr/>
+        <w:t xml:space="preserve">the imported review covers P6/P7, while P8 is Codex's response to it.</w:t>
       </w:r>
     </w:p>
     <w:sectPr>

</xml_diff>